<commit_message>
Date: 05 Jan 2026
</commit_message>
<xml_diff>
--- a/Notes_SA2510014.docx
+++ b/Notes_SA2510014.docx
@@ -5652,7 +5652,26 @@
           <w:lang w:val="en-US"/>
         </w:rPr>
         <w:lastRenderedPageBreak/>
-        <w:t xml:space="preserve">Open selenium.dev </w:t>
+        <w:t xml:space="preserve">Open </w:t>
+      </w:r>
+      <w:hyperlink r:id="rId5" w:history="1">
+        <w:r>
+          <w:rPr>
+            <w:rStyle w:val="Hyperlink"/>
+            <w:sz w:val="24"/>
+            <w:szCs w:val="22"/>
+            <w:lang w:val="en-US"/>
+          </w:rPr>
+          <w:t>https://selenium.dev</w:t>
+        </w:r>
+      </w:hyperlink>
+      <w:r>
+        <w:rPr>
+          <w:sz w:val="24"/>
+          <w:szCs w:val="22"/>
+          <w:lang w:val="en-US"/>
+        </w:rPr>
+        <w:t xml:space="preserve"> </w:t>
       </w:r>
     </w:p>
     <w:p>
@@ -5706,7 +5725,7 @@
         </w:rPr>
         <w:t>Latest stable version </w:t>
       </w:r>
-      <w:hyperlink r:id="rId5" w:history="1">
+      <w:hyperlink r:id="rId6" w:history="1">
         <w:r>
           <w:rPr>
             <w:rStyle w:val="Hyperlink"/>
@@ -5810,7 +5829,7 @@
             <wp:cNvGraphicFramePr/>
             <a:graphic xmlns:a="http://schemas.openxmlformats.org/drawingml/2006/main">
               <a:graphicData uri="http://schemas.openxmlformats.org/drawingml/2006/diagram">
-                <dgm:relIds xmlns:dgm="http://schemas.openxmlformats.org/drawingml/2006/diagram" xmlns:r="http://schemas.openxmlformats.org/officeDocument/2006/relationships" r:dm="rId6" r:lo="rId7" r:qs="rId8" r:cs="rId9"/>
+                <dgm:relIds xmlns:dgm="http://schemas.openxmlformats.org/drawingml/2006/diagram" xmlns:r="http://schemas.openxmlformats.org/officeDocument/2006/relationships" r:dm="rId7" r:lo="rId8" r:qs="rId9" r:cs="rId10"/>
               </a:graphicData>
             </a:graphic>
           </wp:inline>
@@ -6629,76 +6648,959 @@
           <w:lang w:val="en-US"/>
         </w:rPr>
       </w:pPr>
+      <w:r>
+        <w:rPr>
+          <w:sz w:val="24"/>
+          <w:szCs w:val="22"/>
+          <w:lang w:val="en-US"/>
+        </w:rPr>
+        <w:t xml:space="preserve">getCurrentUrl() </w:t>
+      </w:r>
+      <w:r>
+        <w:rPr>
+          <w:sz w:val="24"/>
+          <w:szCs w:val="22"/>
+          <w:lang w:val="en-US"/>
+        </w:rPr>
+        <w:sym w:font="Wingdings" w:char="F0E0"/>
+      </w:r>
+      <w:r>
+        <w:rPr>
+          <w:sz w:val="24"/>
+          <w:szCs w:val="22"/>
+          <w:lang w:val="en-US"/>
+        </w:rPr>
+        <w:t xml:space="preserve"> Will return the URL of the page that is currently opened in browser by WebDriver object. (String)</w:t>
+      </w:r>
+    </w:p>
+    <w:p>
+      <w:pPr>
+        <w:pStyle w:val="ListParagraph"/>
+        <w:numPr>
+          <w:ilvl w:val="0"/>
+          <w:numId w:val="15"/>
+        </w:numPr>
+        <w:rPr>
+          <w:sz w:val="24"/>
+          <w:szCs w:val="22"/>
+          <w:lang w:val="en-US"/>
+        </w:rPr>
+      </w:pPr>
+      <w:r>
+        <w:rPr>
+          <w:sz w:val="24"/>
+          <w:szCs w:val="22"/>
+          <w:lang w:val="en-US"/>
+        </w:rPr>
+        <w:t xml:space="preserve">findElement() </w:t>
+      </w:r>
+      <w:r>
+        <w:rPr>
+          <w:sz w:val="24"/>
+          <w:szCs w:val="22"/>
+          <w:lang w:val="en-US"/>
+        </w:rPr>
+        <w:sym w:font="Wingdings" w:char="F0E0"/>
+      </w:r>
+      <w:r>
+        <w:rPr>
+          <w:sz w:val="24"/>
+          <w:szCs w:val="22"/>
+          <w:lang w:val="en-US"/>
+        </w:rPr>
+        <w:t xml:space="preserve"> </w:t>
+      </w:r>
+      <w:r>
+        <w:rPr>
+          <w:sz w:val="24"/>
+          <w:szCs w:val="22"/>
+          <w:lang w:val="en-US"/>
+        </w:rPr>
+        <w:t>Will find a single control on the page. (WebElement)</w:t>
+      </w:r>
+    </w:p>
+    <w:p>
+      <w:pPr>
+        <w:rPr>
+          <w:sz w:val="24"/>
+          <w:szCs w:val="22"/>
+          <w:lang w:val="en-US"/>
+        </w:rPr>
+      </w:pPr>
+    </w:p>
+    <w:p>
+      <w:pPr>
+        <w:rPr>
+          <w:b/>
+          <w:bCs/>
+          <w:sz w:val="24"/>
+          <w:szCs w:val="22"/>
+          <w:lang w:val="en-US"/>
+        </w:rPr>
+      </w:pPr>
+      <w:r>
+        <w:rPr>
+          <w:b/>
+          <w:bCs/>
+          <w:sz w:val="24"/>
+          <w:szCs w:val="22"/>
+          <w:lang w:val="en-US"/>
+        </w:rPr>
+        <w:t>Common Exceptions in WebDriver</w:t>
+      </w:r>
+    </w:p>
+    <w:p>
+      <w:pPr>
+        <w:pStyle w:val="ListParagraph"/>
+        <w:numPr>
+          <w:ilvl w:val="0"/>
+          <w:numId w:val="16"/>
+        </w:numPr>
+        <w:rPr>
+          <w:sz w:val="24"/>
+          <w:szCs w:val="22"/>
+          <w:lang w:val="en-US"/>
+        </w:rPr>
+      </w:pPr>
+      <w:r>
+        <w:rPr>
+          <w:sz w:val="24"/>
+          <w:szCs w:val="22"/>
+          <w:lang w:val="en-US"/>
+        </w:rPr>
+        <w:t xml:space="preserve">InvalidArgumentException </w:t>
+      </w:r>
+      <w:r>
+        <w:rPr>
+          <w:sz w:val="24"/>
+          <w:szCs w:val="22"/>
+          <w:lang w:val="en-US"/>
+        </w:rPr>
+        <w:sym w:font="Wingdings" w:char="F0E0"/>
+      </w:r>
+      <w:r>
+        <w:rPr>
+          <w:sz w:val="24"/>
+          <w:szCs w:val="22"/>
+          <w:lang w:val="en-US"/>
+        </w:rPr>
+        <w:t xml:space="preserve"> You have given wrong URL. URL is not in the correct format. URL should be absolute. Absolute URL starts with http / https</w:t>
+      </w:r>
+    </w:p>
+    <w:p>
+      <w:pPr>
+        <w:pStyle w:val="ListParagraph"/>
+        <w:numPr>
+          <w:ilvl w:val="0"/>
+          <w:numId w:val="16"/>
+        </w:numPr>
+        <w:rPr>
+          <w:sz w:val="24"/>
+          <w:szCs w:val="22"/>
+          <w:lang w:val="en-US"/>
+        </w:rPr>
+      </w:pPr>
+      <w:r>
+        <w:rPr>
+          <w:sz w:val="24"/>
+          <w:szCs w:val="22"/>
+          <w:lang w:val="en-US"/>
+        </w:rPr>
+        <w:t xml:space="preserve">NoSuchElementException </w:t>
+      </w:r>
+      <w:r>
+        <w:rPr>
+          <w:sz w:val="24"/>
+          <w:szCs w:val="22"/>
+          <w:lang w:val="en-US"/>
+        </w:rPr>
+        <w:sym w:font="Wingdings" w:char="F0E0"/>
+      </w:r>
+      <w:r>
+        <w:rPr>
+          <w:sz w:val="24"/>
+          <w:szCs w:val="22"/>
+          <w:lang w:val="en-US"/>
+        </w:rPr>
+        <w:t xml:space="preserve"> Selenium is not able to find this control / WebElement because</w:t>
+      </w:r>
+    </w:p>
+    <w:p>
+      <w:pPr>
+        <w:pStyle w:val="ListParagraph"/>
+        <w:numPr>
+          <w:ilvl w:val="1"/>
+          <w:numId w:val="16"/>
+        </w:numPr>
+        <w:rPr>
+          <w:sz w:val="24"/>
+          <w:szCs w:val="22"/>
+          <w:lang w:val="en-US"/>
+        </w:rPr>
+      </w:pPr>
+      <w:r>
+        <w:rPr>
+          <w:sz w:val="24"/>
+          <w:szCs w:val="22"/>
+          <w:lang w:val="en-US"/>
+        </w:rPr>
+        <w:t>The locator value may be wrong.</w:t>
+      </w:r>
+    </w:p>
+    <w:p>
+      <w:pPr>
+        <w:pStyle w:val="ListParagraph"/>
+        <w:numPr>
+          <w:ilvl w:val="1"/>
+          <w:numId w:val="16"/>
+        </w:numPr>
+        <w:rPr>
+          <w:sz w:val="24"/>
+          <w:szCs w:val="22"/>
+          <w:lang w:val="en-US"/>
+        </w:rPr>
+      </w:pPr>
+      <w:r>
+        <w:rPr>
+          <w:sz w:val="24"/>
+          <w:szCs w:val="22"/>
+          <w:lang w:val="en-US"/>
+        </w:rPr>
+        <w:t>The locator value may be dynamic</w:t>
+      </w:r>
+    </w:p>
+    <w:p>
+      <w:pPr>
+        <w:rPr>
+          <w:sz w:val="24"/>
+          <w:szCs w:val="22"/>
+          <w:lang w:val="en-US"/>
+        </w:rPr>
+      </w:pPr>
+    </w:p>
+    <w:p>
+      <w:pPr>
+        <w:rPr>
+          <w:b/>
+          <w:bCs/>
+          <w:sz w:val="24"/>
+          <w:szCs w:val="22"/>
+          <w:lang w:val="en-US"/>
+        </w:rPr>
+      </w:pPr>
+      <w:r>
+        <w:rPr>
+          <w:b/>
+          <w:bCs/>
+          <w:sz w:val="24"/>
+          <w:szCs w:val="22"/>
+          <w:lang w:val="en-US"/>
+        </w:rPr>
+        <w:t>WebElement</w:t>
+      </w:r>
+    </w:p>
+    <w:p>
+      <w:pPr>
+        <w:pStyle w:val="ListParagraph"/>
+        <w:numPr>
+          <w:ilvl w:val="0"/>
+          <w:numId w:val="17"/>
+        </w:numPr>
+        <w:rPr>
+          <w:sz w:val="24"/>
+          <w:szCs w:val="22"/>
+          <w:lang w:val="en-US"/>
+        </w:rPr>
+      </w:pPr>
+      <w:r>
+        <w:rPr>
+          <w:sz w:val="24"/>
+          <w:szCs w:val="22"/>
+          <w:lang w:val="en-US"/>
+        </w:rPr>
+        <w:t>Every control (like text box, radio button, checkbox, command button, drop down list, list box, link, options from drop down list) is treated as WebElement in Selenium WebDriver.</w:t>
+      </w:r>
+    </w:p>
+    <w:p>
+      <w:pPr>
+        <w:pStyle w:val="ListParagraph"/>
+        <w:numPr>
+          <w:ilvl w:val="0"/>
+          <w:numId w:val="17"/>
+        </w:numPr>
+        <w:rPr>
+          <w:sz w:val="24"/>
+          <w:szCs w:val="22"/>
+          <w:lang w:val="en-US"/>
+        </w:rPr>
+      </w:pPr>
+      <w:r>
+        <w:rPr>
+          <w:sz w:val="24"/>
+          <w:szCs w:val="22"/>
+          <w:lang w:val="en-US"/>
+        </w:rPr>
+        <w:t>WebElement is an interface.</w:t>
+      </w:r>
+    </w:p>
+    <w:p>
+      <w:pPr>
+        <w:pStyle w:val="ListParagraph"/>
+        <w:numPr>
+          <w:ilvl w:val="0"/>
+          <w:numId w:val="17"/>
+        </w:numPr>
+        <w:rPr>
+          <w:sz w:val="24"/>
+          <w:szCs w:val="22"/>
+          <w:lang w:val="en-US"/>
+        </w:rPr>
+      </w:pPr>
+      <w:r>
+        <w:rPr>
+          <w:sz w:val="24"/>
+          <w:szCs w:val="22"/>
+          <w:lang w:val="en-US"/>
+        </w:rPr>
+        <w:t>To store any control on the page you need to create object on WebElement.</w:t>
+      </w:r>
+    </w:p>
+    <w:p>
+      <w:pPr>
+        <w:pStyle w:val="ListParagraph"/>
+        <w:numPr>
+          <w:ilvl w:val="0"/>
+          <w:numId w:val="17"/>
+        </w:numPr>
+        <w:rPr>
+          <w:sz w:val="24"/>
+          <w:szCs w:val="22"/>
+          <w:lang w:val="en-US"/>
+        </w:rPr>
+      </w:pPr>
+      <w:r>
+        <w:rPr>
+          <w:sz w:val="24"/>
+          <w:szCs w:val="22"/>
+          <w:lang w:val="en-US"/>
+        </w:rPr>
+        <w:t>Methods</w:t>
+      </w:r>
+    </w:p>
+    <w:p>
+      <w:pPr>
+        <w:pStyle w:val="ListParagraph"/>
+        <w:numPr>
+          <w:ilvl w:val="1"/>
+          <w:numId w:val="17"/>
+        </w:numPr>
+        <w:rPr>
+          <w:sz w:val="24"/>
+          <w:szCs w:val="22"/>
+          <w:lang w:val="en-US"/>
+        </w:rPr>
+      </w:pPr>
+      <w:r>
+        <w:rPr>
+          <w:sz w:val="24"/>
+          <w:szCs w:val="22"/>
+          <w:lang w:val="en-US"/>
+        </w:rPr>
+        <w:t xml:space="preserve">sendKeys() </w:t>
+      </w:r>
+      <w:r>
+        <w:rPr>
+          <w:sz w:val="24"/>
+          <w:szCs w:val="22"/>
+          <w:lang w:val="en-US"/>
+        </w:rPr>
+        <w:sym w:font="Wingdings" w:char="F0E0"/>
+      </w:r>
+      <w:r>
+        <w:rPr>
+          <w:sz w:val="24"/>
+          <w:szCs w:val="22"/>
+          <w:lang w:val="en-US"/>
+        </w:rPr>
+        <w:t xml:space="preserve"> Used to enter some text in the text box.</w:t>
+      </w:r>
+      <w:r>
+        <w:rPr>
+          <w:sz w:val="24"/>
+          <w:szCs w:val="22"/>
+          <w:lang w:val="en-US"/>
+        </w:rPr>
+        <w:t xml:space="preserve"> Will append the text if there is some text already present in the text box.</w:t>
+      </w:r>
+    </w:p>
+    <w:p>
+      <w:pPr>
+        <w:pStyle w:val="ListParagraph"/>
+        <w:numPr>
+          <w:ilvl w:val="1"/>
+          <w:numId w:val="17"/>
+        </w:numPr>
+        <w:rPr>
+          <w:sz w:val="24"/>
+          <w:szCs w:val="22"/>
+          <w:lang w:val="en-US"/>
+        </w:rPr>
+      </w:pPr>
+      <w:r>
+        <w:rPr>
+          <w:sz w:val="24"/>
+          <w:szCs w:val="22"/>
+          <w:lang w:val="en-US"/>
+        </w:rPr>
+        <w:t xml:space="preserve">click() </w:t>
+      </w:r>
+      <w:r>
+        <w:rPr>
+          <w:sz w:val="24"/>
+          <w:szCs w:val="22"/>
+          <w:lang w:val="en-US"/>
+        </w:rPr>
+        <w:sym w:font="Wingdings" w:char="F0E0"/>
+      </w:r>
+      <w:r>
+        <w:rPr>
+          <w:sz w:val="24"/>
+          <w:szCs w:val="22"/>
+          <w:lang w:val="en-US"/>
+        </w:rPr>
+        <w:t xml:space="preserve"> Will click on any control.</w:t>
+      </w:r>
+    </w:p>
+    <w:p>
+      <w:pPr>
+        <w:rPr>
+          <w:sz w:val="24"/>
+          <w:szCs w:val="22"/>
+          <w:lang w:val="en-US"/>
+        </w:rPr>
+      </w:pPr>
+    </w:p>
+    <w:p>
+      <w:pPr>
+        <w:rPr>
+          <w:sz w:val="24"/>
+          <w:szCs w:val="22"/>
+          <w:lang w:val="en-US"/>
+        </w:rPr>
+      </w:pPr>
+      <w:r>
+        <w:rPr>
+          <w:noProof/>
+          <w:lang w:eastAsia="en-IN"/>
+        </w:rPr>
+        <w:drawing>
+          <wp:inline distT="0" distB="0" distL="0" distR="0" wp14:anchorId="490E1568" wp14:editId="033F5FCC">
+            <wp:extent cx="3186718" cy="1837426"/>
+            <wp:effectExtent l="0" t="0" r="0" b="0"/>
+            <wp:docPr id="2" name="Picture 2"/>
+            <wp:cNvGraphicFramePr>
+              <a:graphicFrameLocks xmlns:a="http://schemas.openxmlformats.org/drawingml/2006/main" noChangeAspect="1"/>
+            </wp:cNvGraphicFramePr>
+            <a:graphic xmlns:a="http://schemas.openxmlformats.org/drawingml/2006/main">
+              <a:graphicData uri="http://schemas.openxmlformats.org/drawingml/2006/picture">
+                <pic:pic xmlns:pic="http://schemas.openxmlformats.org/drawingml/2006/picture">
+                  <pic:nvPicPr>
+                    <pic:cNvPr id="1" name=""/>
+                    <pic:cNvPicPr/>
+                  </pic:nvPicPr>
+                  <pic:blipFill rotWithShape="1">
+                    <a:blip r:embed="rId12"/>
+                    <a:srcRect l="22727" t="17935" r="21673" b="25048"/>
+                    <a:stretch/>
+                  </pic:blipFill>
+                  <pic:spPr bwMode="auto">
+                    <a:xfrm>
+                      <a:off x="0" y="0"/>
+                      <a:ext cx="3186718" cy="1837426"/>
+                    </a:xfrm>
+                    <a:prstGeom prst="rect">
+                      <a:avLst/>
+                    </a:prstGeom>
+                    <a:ln>
+                      <a:noFill/>
+                    </a:ln>
+                    <a:extLst>
+                      <a:ext uri="{53640926-AAD7-44D8-BBD7-CCE9431645EC}">
+                        <a14:shadowObscured xmlns:a14="http://schemas.microsoft.com/office/drawing/2010/main"/>
+                      </a:ext>
+                    </a:extLst>
+                  </pic:spPr>
+                </pic:pic>
+              </a:graphicData>
+            </a:graphic>
+          </wp:inline>
+        </w:drawing>
+      </w:r>
+    </w:p>
+    <w:p>
+      <w:pPr>
+        <w:rPr>
+          <w:sz w:val="24"/>
+          <w:szCs w:val="22"/>
+          <w:lang w:val="en-US"/>
+        </w:rPr>
+      </w:pPr>
+    </w:p>
+    <w:p>
+      <w:pPr>
+        <w:rPr>
+          <w:b/>
+          <w:bCs/>
+          <w:sz w:val="24"/>
+          <w:szCs w:val="22"/>
+          <w:lang w:val="en-US"/>
+        </w:rPr>
+      </w:pPr>
+      <w:r>
+        <w:rPr>
+          <w:b/>
+          <w:bCs/>
+          <w:sz w:val="24"/>
+          <w:szCs w:val="22"/>
+          <w:lang w:val="en-US"/>
+        </w:rPr>
+        <w:t>Locators</w:t>
+      </w:r>
+    </w:p>
+    <w:p>
+      <w:pPr>
+        <w:pStyle w:val="ListParagraph"/>
+        <w:numPr>
+          <w:ilvl w:val="0"/>
+          <w:numId w:val="18"/>
+        </w:numPr>
+        <w:rPr>
+          <w:sz w:val="24"/>
+          <w:szCs w:val="22"/>
+          <w:lang w:val="en-US"/>
+        </w:rPr>
+      </w:pPr>
+      <w:r>
+        <w:rPr>
+          <w:sz w:val="24"/>
+          <w:szCs w:val="22"/>
+          <w:lang w:val="en-US"/>
+        </w:rPr>
+        <w:t>Locators are the way to identify / locate any control on the web page</w:t>
+      </w:r>
+    </w:p>
+    <w:p>
+      <w:pPr>
+        <w:pStyle w:val="ListParagraph"/>
+        <w:numPr>
+          <w:ilvl w:val="0"/>
+          <w:numId w:val="18"/>
+        </w:numPr>
+        <w:rPr>
+          <w:sz w:val="24"/>
+          <w:szCs w:val="22"/>
+          <w:lang w:val="en-US"/>
+        </w:rPr>
+      </w:pPr>
+      <w:r>
+        <w:rPr>
+          <w:sz w:val="24"/>
+          <w:szCs w:val="22"/>
+          <w:lang w:val="en-US"/>
+        </w:rPr>
+        <w:t>Locators are the strategies to identify controls on the page.</w:t>
+      </w:r>
+    </w:p>
+    <w:p>
+      <w:pPr>
+        <w:pStyle w:val="ListParagraph"/>
+        <w:rPr>
+          <w:sz w:val="24"/>
+          <w:szCs w:val="22"/>
+          <w:lang w:val="en-US"/>
+        </w:rPr>
+      </w:pPr>
+    </w:p>
+    <w:p>
+      <w:pPr>
+        <w:pStyle w:val="ListParagraph"/>
+        <w:numPr>
+          <w:ilvl w:val="0"/>
+          <w:numId w:val="19"/>
+        </w:numPr>
+        <w:rPr>
+          <w:sz w:val="24"/>
+          <w:szCs w:val="22"/>
+          <w:lang w:val="en-US"/>
+        </w:rPr>
+      </w:pPr>
+      <w:r>
+        <w:rPr>
+          <w:sz w:val="24"/>
+          <w:szCs w:val="22"/>
+          <w:lang w:val="en-US"/>
+        </w:rPr>
+        <w:lastRenderedPageBreak/>
+        <w:t>Name</w:t>
+      </w:r>
+    </w:p>
+    <w:p>
+      <w:pPr>
+        <w:pStyle w:val="ListParagraph"/>
+        <w:numPr>
+          <w:ilvl w:val="0"/>
+          <w:numId w:val="19"/>
+        </w:numPr>
+        <w:rPr>
+          <w:sz w:val="24"/>
+          <w:szCs w:val="22"/>
+          <w:lang w:val="en-US"/>
+        </w:rPr>
+      </w:pPr>
+      <w:r>
+        <w:rPr>
+          <w:sz w:val="24"/>
+          <w:szCs w:val="22"/>
+          <w:lang w:val="en-US"/>
+        </w:rPr>
+        <w:t>Id</w:t>
+      </w:r>
+    </w:p>
+    <w:p>
+      <w:pPr>
+        <w:pStyle w:val="ListParagraph"/>
+        <w:numPr>
+          <w:ilvl w:val="0"/>
+          <w:numId w:val="19"/>
+        </w:numPr>
+        <w:rPr>
+          <w:sz w:val="24"/>
+          <w:szCs w:val="22"/>
+          <w:lang w:val="en-US"/>
+        </w:rPr>
+      </w:pPr>
+      <w:r>
+        <w:rPr>
+          <w:sz w:val="24"/>
+          <w:szCs w:val="22"/>
+          <w:lang w:val="en-US"/>
+        </w:rPr>
+        <w:t>ClassName</w:t>
+      </w:r>
+    </w:p>
+    <w:p>
+      <w:pPr>
+        <w:pStyle w:val="ListParagraph"/>
+        <w:numPr>
+          <w:ilvl w:val="0"/>
+          <w:numId w:val="19"/>
+        </w:numPr>
+        <w:rPr>
+          <w:sz w:val="24"/>
+          <w:szCs w:val="22"/>
+          <w:lang w:val="en-US"/>
+        </w:rPr>
+      </w:pPr>
+      <w:r>
+        <w:rPr>
+          <w:sz w:val="24"/>
+          <w:szCs w:val="22"/>
+          <w:lang w:val="en-US"/>
+        </w:rPr>
+        <w:t>CssSelector</w:t>
+      </w:r>
+    </w:p>
+    <w:p>
+      <w:pPr>
+        <w:pStyle w:val="ListParagraph"/>
+        <w:numPr>
+          <w:ilvl w:val="0"/>
+          <w:numId w:val="19"/>
+        </w:numPr>
+        <w:rPr>
+          <w:sz w:val="24"/>
+          <w:szCs w:val="22"/>
+          <w:lang w:val="en-US"/>
+        </w:rPr>
+      </w:pPr>
+      <w:r>
+        <w:rPr>
+          <w:sz w:val="24"/>
+          <w:szCs w:val="22"/>
+          <w:lang w:val="en-US"/>
+        </w:rPr>
+        <w:t>XPath</w:t>
+      </w:r>
+    </w:p>
+    <w:p>
+      <w:pPr>
+        <w:pStyle w:val="ListParagraph"/>
+        <w:numPr>
+          <w:ilvl w:val="0"/>
+          <w:numId w:val="19"/>
+        </w:numPr>
+        <w:rPr>
+          <w:sz w:val="24"/>
+          <w:szCs w:val="22"/>
+          <w:lang w:val="en-US"/>
+        </w:rPr>
+      </w:pPr>
+      <w:r>
+        <w:rPr>
+          <w:sz w:val="24"/>
+          <w:szCs w:val="22"/>
+          <w:lang w:val="en-US"/>
+        </w:rPr>
+        <w:t>LinkText</w:t>
+      </w:r>
+    </w:p>
+    <w:p>
+      <w:pPr>
+        <w:pStyle w:val="ListParagraph"/>
+        <w:numPr>
+          <w:ilvl w:val="0"/>
+          <w:numId w:val="19"/>
+        </w:numPr>
+        <w:rPr>
+          <w:sz w:val="24"/>
+          <w:szCs w:val="22"/>
+          <w:lang w:val="en-US"/>
+        </w:rPr>
+      </w:pPr>
+      <w:r>
+        <w:rPr>
+          <w:sz w:val="24"/>
+          <w:szCs w:val="22"/>
+          <w:lang w:val="en-US"/>
+        </w:rPr>
+        <w:t>PartialLinkText</w:t>
+      </w:r>
+    </w:p>
+    <w:p>
+      <w:pPr>
+        <w:pStyle w:val="ListParagraph"/>
+        <w:numPr>
+          <w:ilvl w:val="0"/>
+          <w:numId w:val="19"/>
+        </w:numPr>
+        <w:rPr>
+          <w:sz w:val="24"/>
+          <w:szCs w:val="22"/>
+          <w:lang w:val="en-US"/>
+        </w:rPr>
+      </w:pPr>
+      <w:r>
+        <w:rPr>
+          <w:sz w:val="24"/>
+          <w:szCs w:val="22"/>
+          <w:lang w:val="en-US"/>
+        </w:rPr>
+        <w:t>TagName</w:t>
+      </w:r>
+    </w:p>
+    <w:p>
+      <w:pPr>
+        <w:rPr>
+          <w:sz w:val="24"/>
+          <w:szCs w:val="22"/>
+          <w:lang w:val="en-US"/>
+        </w:rPr>
+      </w:pPr>
+    </w:p>
+    <w:p>
+      <w:pPr>
+        <w:rPr>
+          <w:b/>
+          <w:bCs/>
+          <w:sz w:val="24"/>
+          <w:szCs w:val="22"/>
+          <w:lang w:val="en-US"/>
+        </w:rPr>
+      </w:pPr>
+      <w:r>
+        <w:rPr>
+          <w:b/>
+          <w:bCs/>
+          <w:sz w:val="24"/>
+          <w:szCs w:val="22"/>
+          <w:lang w:val="en-US"/>
+        </w:rPr>
+        <w:t>Locator className</w:t>
+      </w:r>
+    </w:p>
+    <w:p>
+      <w:pPr>
+        <w:pStyle w:val="ListParagraph"/>
+        <w:numPr>
+          <w:ilvl w:val="0"/>
+          <w:numId w:val="20"/>
+        </w:numPr>
+        <w:rPr>
+          <w:sz w:val="24"/>
+          <w:szCs w:val="22"/>
+          <w:lang w:val="en-US"/>
+        </w:rPr>
+      </w:pPr>
+      <w:r>
+        <w:rPr>
+          <w:sz w:val="24"/>
+          <w:szCs w:val="22"/>
+          <w:lang w:val="en-US"/>
+        </w:rPr>
+        <w:t xml:space="preserve">To locate any control by using the value of attribute </w:t>
+      </w:r>
+      <w:r>
+        <w:rPr>
+          <w:b/>
+          <w:bCs/>
+          <w:sz w:val="24"/>
+          <w:szCs w:val="22"/>
+          <w:lang w:val="en-US"/>
+        </w:rPr>
+        <w:t>class</w:t>
+      </w:r>
+    </w:p>
+    <w:p>
+      <w:pPr>
+        <w:rPr>
+          <w:sz w:val="24"/>
+          <w:szCs w:val="22"/>
+          <w:lang w:val="en-US"/>
+        </w:rPr>
+      </w:pPr>
+    </w:p>
+    <w:p>
+      <w:pPr>
+        <w:rPr>
+          <w:b/>
+          <w:bCs/>
+          <w:sz w:val="24"/>
+          <w:szCs w:val="22"/>
+          <w:lang w:val="en-US"/>
+        </w:rPr>
+      </w:pPr>
+      <w:r>
+        <w:rPr>
+          <w:b/>
+          <w:bCs/>
+          <w:sz w:val="24"/>
+          <w:szCs w:val="22"/>
+          <w:lang w:val="en-US"/>
+        </w:rPr>
+        <w:t>Locator cssSelector:</w:t>
+      </w:r>
+    </w:p>
+    <w:p>
+      <w:pPr>
+        <w:pStyle w:val="ListParagraph"/>
+        <w:numPr>
+          <w:ilvl w:val="0"/>
+          <w:numId w:val="20"/>
+        </w:numPr>
+        <w:rPr>
+          <w:sz w:val="24"/>
+          <w:szCs w:val="22"/>
+          <w:lang w:val="en-US"/>
+        </w:rPr>
+      </w:pPr>
+      <w:r>
+        <w:rPr>
+          <w:sz w:val="24"/>
+          <w:szCs w:val="22"/>
+          <w:lang w:val="en-US"/>
+        </w:rPr>
+        <w:t>This is the technique / locator via which you can locate any control by using any one or multiple attributes of the control.</w:t>
+      </w:r>
+    </w:p>
+    <w:p>
+      <w:pPr>
+        <w:pStyle w:val="ListParagraph"/>
+        <w:numPr>
+          <w:ilvl w:val="0"/>
+          <w:numId w:val="20"/>
+        </w:numPr>
+        <w:rPr>
+          <w:sz w:val="24"/>
+          <w:szCs w:val="22"/>
+          <w:lang w:val="en-US"/>
+        </w:rPr>
+      </w:pPr>
+      <w:r>
+        <w:rPr>
+          <w:sz w:val="24"/>
+          <w:szCs w:val="22"/>
+          <w:lang w:val="en-US"/>
+        </w:rPr>
+        <w:t>Types</w:t>
+      </w:r>
+    </w:p>
+    <w:p>
+      <w:pPr>
+        <w:pStyle w:val="ListParagraph"/>
+        <w:numPr>
+          <w:ilvl w:val="1"/>
+          <w:numId w:val="20"/>
+        </w:numPr>
+        <w:rPr>
+          <w:sz w:val="24"/>
+          <w:szCs w:val="22"/>
+          <w:lang w:val="en-US"/>
+        </w:rPr>
+      </w:pPr>
+      <w:r>
+        <w:rPr>
+          <w:sz w:val="24"/>
+          <w:szCs w:val="22"/>
+          <w:lang w:val="en-US"/>
+        </w:rPr>
+        <w:t>Using Single Attribute</w:t>
+      </w:r>
+    </w:p>
+    <w:p>
+      <w:pPr>
+        <w:pStyle w:val="ListParagraph"/>
+        <w:numPr>
+          <w:ilvl w:val="1"/>
+          <w:numId w:val="20"/>
+        </w:numPr>
+        <w:rPr>
+          <w:sz w:val="24"/>
+          <w:szCs w:val="22"/>
+          <w:lang w:val="en-US"/>
+        </w:rPr>
+      </w:pPr>
+      <w:r>
+        <w:rPr>
+          <w:sz w:val="24"/>
+          <w:szCs w:val="22"/>
+          <w:lang w:val="en-US"/>
+        </w:rPr>
+        <w:t>Using Multiple Attributes</w:t>
+      </w:r>
+    </w:p>
+    <w:p>
+      <w:pPr>
+        <w:pStyle w:val="ListParagraph"/>
+        <w:numPr>
+          <w:ilvl w:val="1"/>
+          <w:numId w:val="20"/>
+        </w:numPr>
+        <w:rPr>
+          <w:sz w:val="24"/>
+          <w:szCs w:val="22"/>
+          <w:lang w:val="en-US"/>
+        </w:rPr>
+      </w:pPr>
+      <w:r>
+        <w:rPr>
+          <w:sz w:val="24"/>
+          <w:szCs w:val="22"/>
+          <w:lang w:val="en-US"/>
+        </w:rPr>
+        <w:t>Using Special Characters</w:t>
+      </w:r>
       <w:bookmarkStart w:id="0" w:name="_GoBack"/>
       <w:bookmarkEnd w:id="0"/>
-    </w:p>
-    <w:p>
-      <w:pPr>
-        <w:rPr>
-          <w:sz w:val="24"/>
-          <w:szCs w:val="22"/>
-          <w:lang w:val="en-US"/>
-        </w:rPr>
-      </w:pPr>
-    </w:p>
-    <w:p>
-      <w:pPr>
-        <w:rPr>
-          <w:b/>
-          <w:bCs/>
-          <w:sz w:val="24"/>
-          <w:szCs w:val="22"/>
-          <w:lang w:val="en-US"/>
-        </w:rPr>
-      </w:pPr>
-      <w:r>
-        <w:rPr>
-          <w:b/>
-          <w:bCs/>
-          <w:sz w:val="24"/>
-          <w:szCs w:val="22"/>
-          <w:lang w:val="en-US"/>
-        </w:rPr>
-        <w:t>Common Exceptions in WebDriver</w:t>
-      </w:r>
-    </w:p>
-    <w:p>
-      <w:pPr>
-        <w:pStyle w:val="ListParagraph"/>
-        <w:numPr>
-          <w:ilvl w:val="0"/>
-          <w:numId w:val="16"/>
-        </w:numPr>
-        <w:rPr>
-          <w:sz w:val="24"/>
-          <w:szCs w:val="22"/>
-          <w:lang w:val="en-US"/>
-        </w:rPr>
-      </w:pPr>
-      <w:r>
-        <w:rPr>
-          <w:sz w:val="24"/>
-          <w:szCs w:val="22"/>
-          <w:lang w:val="en-US"/>
-        </w:rPr>
-        <w:t xml:space="preserve">InvalidArgumentException </w:t>
-      </w:r>
-      <w:r>
-        <w:rPr>
-          <w:sz w:val="24"/>
-          <w:szCs w:val="22"/>
-          <w:lang w:val="en-US"/>
-        </w:rPr>
-        <w:sym w:font="Wingdings" w:char="F0E0"/>
-      </w:r>
-      <w:r>
-        <w:rPr>
-          <w:sz w:val="24"/>
-          <w:szCs w:val="22"/>
-          <w:lang w:val="en-US"/>
-        </w:rPr>
-        <w:t xml:space="preserve"> You have given wrong URL. URL is not in the correct format. URL should be absolute. Absolute URL starts with http / https</w:t>
-      </w:r>
     </w:p>
     <w:sectPr>
       <w:pgSz w:w="11906" w:h="16838"/>
@@ -7004,6 +7906,119 @@
     </w:lvl>
   </w:abstractNum>
   <w:abstractNum w:abstractNumId="3">
+    <w:nsid w:val="1ACF1D3C"/>
+    <w:multiLevelType w:val="hybridMultilevel"/>
+    <w:tmpl w:val="8BC0B462"/>
+    <w:lvl w:ilvl="0" w:tplc="40090001">
+      <w:start w:val="1"/>
+      <w:numFmt w:val="bullet"/>
+      <w:lvlText w:val=""/>
+      <w:lvlJc w:val="left"/>
+      <w:pPr>
+        <w:ind w:left="720" w:hanging="360"/>
+      </w:pPr>
+      <w:rPr>
+        <w:rFonts w:ascii="Symbol" w:hAnsi="Symbol" w:hint="default"/>
+      </w:rPr>
+    </w:lvl>
+    <w:lvl w:ilvl="1" w:tplc="40090003">
+      <w:start w:val="1"/>
+      <w:numFmt w:val="bullet"/>
+      <w:lvlText w:val="o"/>
+      <w:lvlJc w:val="left"/>
+      <w:pPr>
+        <w:ind w:left="1440" w:hanging="360"/>
+      </w:pPr>
+      <w:rPr>
+        <w:rFonts w:ascii="Courier New" w:hAnsi="Courier New" w:cs="Courier New" w:hint="default"/>
+      </w:rPr>
+    </w:lvl>
+    <w:lvl w:ilvl="2" w:tplc="40090005" w:tentative="1">
+      <w:start w:val="1"/>
+      <w:numFmt w:val="bullet"/>
+      <w:lvlText w:val=""/>
+      <w:lvlJc w:val="left"/>
+      <w:pPr>
+        <w:ind w:left="2160" w:hanging="360"/>
+      </w:pPr>
+      <w:rPr>
+        <w:rFonts w:ascii="Wingdings" w:hAnsi="Wingdings" w:hint="default"/>
+      </w:rPr>
+    </w:lvl>
+    <w:lvl w:ilvl="3" w:tplc="40090001" w:tentative="1">
+      <w:start w:val="1"/>
+      <w:numFmt w:val="bullet"/>
+      <w:lvlText w:val=""/>
+      <w:lvlJc w:val="left"/>
+      <w:pPr>
+        <w:ind w:left="2880" w:hanging="360"/>
+      </w:pPr>
+      <w:rPr>
+        <w:rFonts w:ascii="Symbol" w:hAnsi="Symbol" w:hint="default"/>
+      </w:rPr>
+    </w:lvl>
+    <w:lvl w:ilvl="4" w:tplc="40090003" w:tentative="1">
+      <w:start w:val="1"/>
+      <w:numFmt w:val="bullet"/>
+      <w:lvlText w:val="o"/>
+      <w:lvlJc w:val="left"/>
+      <w:pPr>
+        <w:ind w:left="3600" w:hanging="360"/>
+      </w:pPr>
+      <w:rPr>
+        <w:rFonts w:ascii="Courier New" w:hAnsi="Courier New" w:cs="Courier New" w:hint="default"/>
+      </w:rPr>
+    </w:lvl>
+    <w:lvl w:ilvl="5" w:tplc="40090005" w:tentative="1">
+      <w:start w:val="1"/>
+      <w:numFmt w:val="bullet"/>
+      <w:lvlText w:val=""/>
+      <w:lvlJc w:val="left"/>
+      <w:pPr>
+        <w:ind w:left="4320" w:hanging="360"/>
+      </w:pPr>
+      <w:rPr>
+        <w:rFonts w:ascii="Wingdings" w:hAnsi="Wingdings" w:hint="default"/>
+      </w:rPr>
+    </w:lvl>
+    <w:lvl w:ilvl="6" w:tplc="40090001" w:tentative="1">
+      <w:start w:val="1"/>
+      <w:numFmt w:val="bullet"/>
+      <w:lvlText w:val=""/>
+      <w:lvlJc w:val="left"/>
+      <w:pPr>
+        <w:ind w:left="5040" w:hanging="360"/>
+      </w:pPr>
+      <w:rPr>
+        <w:rFonts w:ascii="Symbol" w:hAnsi="Symbol" w:hint="default"/>
+      </w:rPr>
+    </w:lvl>
+    <w:lvl w:ilvl="7" w:tplc="40090003" w:tentative="1">
+      <w:start w:val="1"/>
+      <w:numFmt w:val="bullet"/>
+      <w:lvlText w:val="o"/>
+      <w:lvlJc w:val="left"/>
+      <w:pPr>
+        <w:ind w:left="5760" w:hanging="360"/>
+      </w:pPr>
+      <w:rPr>
+        <w:rFonts w:ascii="Courier New" w:hAnsi="Courier New" w:cs="Courier New" w:hint="default"/>
+      </w:rPr>
+    </w:lvl>
+    <w:lvl w:ilvl="8" w:tplc="40090005" w:tentative="1">
+      <w:start w:val="1"/>
+      <w:numFmt w:val="bullet"/>
+      <w:lvlText w:val=""/>
+      <w:lvlJc w:val="left"/>
+      <w:pPr>
+        <w:ind w:left="6480" w:hanging="360"/>
+      </w:pPr>
+      <w:rPr>
+        <w:rFonts w:ascii="Wingdings" w:hAnsi="Wingdings" w:hint="default"/>
+      </w:rPr>
+    </w:lvl>
+  </w:abstractNum>
+  <w:abstractNum w:abstractNumId="4">
     <w:nsid w:val="1D0166BD"/>
     <w:multiLevelType w:val="hybridMultilevel"/>
     <w:tmpl w:val="73A888F8"/>
@@ -7092,7 +8107,7 @@
       </w:pPr>
     </w:lvl>
   </w:abstractNum>
-  <w:abstractNum w:abstractNumId="4">
+  <w:abstractNum w:abstractNumId="5">
     <w:nsid w:val="24AD48A7"/>
     <w:multiLevelType w:val="hybridMultilevel"/>
     <w:tmpl w:val="C53ACF94"/>
@@ -7205,7 +8220,7 @@
       </w:rPr>
     </w:lvl>
   </w:abstractNum>
-  <w:abstractNum w:abstractNumId="5">
+  <w:abstractNum w:abstractNumId="6">
     <w:nsid w:val="44443626"/>
     <w:multiLevelType w:val="hybridMultilevel"/>
     <w:tmpl w:val="3A38E55E"/>
@@ -7318,7 +8333,7 @@
       </w:rPr>
     </w:lvl>
   </w:abstractNum>
-  <w:abstractNum w:abstractNumId="6">
+  <w:abstractNum w:abstractNumId="7">
     <w:nsid w:val="4BCF165C"/>
     <w:multiLevelType w:val="hybridMultilevel"/>
     <w:tmpl w:val="E7067116"/>
@@ -7404,10 +8419,10 @@
       </w:pPr>
     </w:lvl>
   </w:abstractNum>
-  <w:abstractNum w:abstractNumId="7">
+  <w:abstractNum w:abstractNumId="8">
     <w:nsid w:val="4D934839"/>
     <w:multiLevelType w:val="hybridMultilevel"/>
-    <w:tmpl w:val="4464362A"/>
+    <w:tmpl w:val="66E021E4"/>
     <w:lvl w:ilvl="0" w:tplc="4009000F">
       <w:start w:val="1"/>
       <w:numFmt w:val="decimal"/>
@@ -7420,7 +8435,7 @@
         <w:rFonts w:hint="default"/>
       </w:rPr>
     </w:lvl>
-    <w:lvl w:ilvl="1" w:tplc="40090019" w:tentative="1">
+    <w:lvl w:ilvl="1" w:tplc="40090019">
       <w:start w:val="1"/>
       <w:numFmt w:val="lowerLetter"/>
       <w:lvlText w:val="%2."/>
@@ -7493,7 +8508,7 @@
       </w:pPr>
     </w:lvl>
   </w:abstractNum>
-  <w:abstractNum w:abstractNumId="8">
+  <w:abstractNum w:abstractNumId="9">
     <w:nsid w:val="520668FC"/>
     <w:multiLevelType w:val="hybridMultilevel"/>
     <w:tmpl w:val="A4F835F0"/>
@@ -7606,7 +8621,7 @@
       </w:rPr>
     </w:lvl>
   </w:abstractNum>
-  <w:abstractNum w:abstractNumId="9">
+  <w:abstractNum w:abstractNumId="10">
     <w:nsid w:val="571D3B3E"/>
     <w:multiLevelType w:val="hybridMultilevel"/>
     <w:tmpl w:val="CF98A6CE"/>
@@ -7719,7 +8734,7 @@
       </w:rPr>
     </w:lvl>
   </w:abstractNum>
-  <w:abstractNum w:abstractNumId="10">
+  <w:abstractNum w:abstractNumId="11">
     <w:nsid w:val="5F4B1933"/>
     <w:multiLevelType w:val="hybridMultilevel"/>
     <w:tmpl w:val="B9F8D93A"/>
@@ -7832,7 +8847,96 @@
       </w:rPr>
     </w:lvl>
   </w:abstractNum>
-  <w:abstractNum w:abstractNumId="11">
+  <w:abstractNum w:abstractNumId="12">
+    <w:nsid w:val="61ED0FA8"/>
+    <w:multiLevelType w:val="hybridMultilevel"/>
+    <w:tmpl w:val="70CCDFC4"/>
+    <w:lvl w:ilvl="0" w:tplc="4009000F">
+      <w:start w:val="1"/>
+      <w:numFmt w:val="decimal"/>
+      <w:lvlText w:val="%1."/>
+      <w:lvlJc w:val="left"/>
+      <w:pPr>
+        <w:ind w:left="720" w:hanging="360"/>
+      </w:pPr>
+      <w:rPr>
+        <w:rFonts w:hint="default"/>
+      </w:rPr>
+    </w:lvl>
+    <w:lvl w:ilvl="1" w:tplc="40090019" w:tentative="1">
+      <w:start w:val="1"/>
+      <w:numFmt w:val="lowerLetter"/>
+      <w:lvlText w:val="%2."/>
+      <w:lvlJc w:val="left"/>
+      <w:pPr>
+        <w:ind w:left="1440" w:hanging="360"/>
+      </w:pPr>
+    </w:lvl>
+    <w:lvl w:ilvl="2" w:tplc="4009001B" w:tentative="1">
+      <w:start w:val="1"/>
+      <w:numFmt w:val="lowerRoman"/>
+      <w:lvlText w:val="%3."/>
+      <w:lvlJc w:val="right"/>
+      <w:pPr>
+        <w:ind w:left="2160" w:hanging="180"/>
+      </w:pPr>
+    </w:lvl>
+    <w:lvl w:ilvl="3" w:tplc="4009000F" w:tentative="1">
+      <w:start w:val="1"/>
+      <w:numFmt w:val="decimal"/>
+      <w:lvlText w:val="%4."/>
+      <w:lvlJc w:val="left"/>
+      <w:pPr>
+        <w:ind w:left="2880" w:hanging="360"/>
+      </w:pPr>
+    </w:lvl>
+    <w:lvl w:ilvl="4" w:tplc="40090019" w:tentative="1">
+      <w:start w:val="1"/>
+      <w:numFmt w:val="lowerLetter"/>
+      <w:lvlText w:val="%5."/>
+      <w:lvlJc w:val="left"/>
+      <w:pPr>
+        <w:ind w:left="3600" w:hanging="360"/>
+      </w:pPr>
+    </w:lvl>
+    <w:lvl w:ilvl="5" w:tplc="4009001B" w:tentative="1">
+      <w:start w:val="1"/>
+      <w:numFmt w:val="lowerRoman"/>
+      <w:lvlText w:val="%6."/>
+      <w:lvlJc w:val="right"/>
+      <w:pPr>
+        <w:ind w:left="4320" w:hanging="180"/>
+      </w:pPr>
+    </w:lvl>
+    <w:lvl w:ilvl="6" w:tplc="4009000F" w:tentative="1">
+      <w:start w:val="1"/>
+      <w:numFmt w:val="decimal"/>
+      <w:lvlText w:val="%7."/>
+      <w:lvlJc w:val="left"/>
+      <w:pPr>
+        <w:ind w:left="5040" w:hanging="360"/>
+      </w:pPr>
+    </w:lvl>
+    <w:lvl w:ilvl="7" w:tplc="40090019" w:tentative="1">
+      <w:start w:val="1"/>
+      <w:numFmt w:val="lowerLetter"/>
+      <w:lvlText w:val="%8."/>
+      <w:lvlJc w:val="left"/>
+      <w:pPr>
+        <w:ind w:left="5760" w:hanging="360"/>
+      </w:pPr>
+    </w:lvl>
+    <w:lvl w:ilvl="8" w:tplc="4009001B" w:tentative="1">
+      <w:start w:val="1"/>
+      <w:numFmt w:val="lowerRoman"/>
+      <w:lvlText w:val="%9."/>
+      <w:lvlJc w:val="right"/>
+      <w:pPr>
+        <w:ind w:left="6480" w:hanging="180"/>
+      </w:pPr>
+    </w:lvl>
+  </w:abstractNum>
+  <w:abstractNum w:abstractNumId="13">
     <w:nsid w:val="64CF3846"/>
     <w:multiLevelType w:val="hybridMultilevel"/>
     <w:tmpl w:val="13ACF5F6"/>
@@ -7945,7 +9049,120 @@
       </w:rPr>
     </w:lvl>
   </w:abstractNum>
-  <w:abstractNum w:abstractNumId="12">
+  <w:abstractNum w:abstractNumId="14">
+    <w:nsid w:val="679919C6"/>
+    <w:multiLevelType w:val="hybridMultilevel"/>
+    <w:tmpl w:val="D8C8FD88"/>
+    <w:lvl w:ilvl="0" w:tplc="40090001">
+      <w:start w:val="1"/>
+      <w:numFmt w:val="bullet"/>
+      <w:lvlText w:val=""/>
+      <w:lvlJc w:val="left"/>
+      <w:pPr>
+        <w:ind w:left="720" w:hanging="360"/>
+      </w:pPr>
+      <w:rPr>
+        <w:rFonts w:ascii="Symbol" w:hAnsi="Symbol" w:hint="default"/>
+      </w:rPr>
+    </w:lvl>
+    <w:lvl w:ilvl="1" w:tplc="40090003" w:tentative="1">
+      <w:start w:val="1"/>
+      <w:numFmt w:val="bullet"/>
+      <w:lvlText w:val="o"/>
+      <w:lvlJc w:val="left"/>
+      <w:pPr>
+        <w:ind w:left="1440" w:hanging="360"/>
+      </w:pPr>
+      <w:rPr>
+        <w:rFonts w:ascii="Courier New" w:hAnsi="Courier New" w:cs="Courier New" w:hint="default"/>
+      </w:rPr>
+    </w:lvl>
+    <w:lvl w:ilvl="2" w:tplc="40090005" w:tentative="1">
+      <w:start w:val="1"/>
+      <w:numFmt w:val="bullet"/>
+      <w:lvlText w:val=""/>
+      <w:lvlJc w:val="left"/>
+      <w:pPr>
+        <w:ind w:left="2160" w:hanging="360"/>
+      </w:pPr>
+      <w:rPr>
+        <w:rFonts w:ascii="Wingdings" w:hAnsi="Wingdings" w:hint="default"/>
+      </w:rPr>
+    </w:lvl>
+    <w:lvl w:ilvl="3" w:tplc="40090001" w:tentative="1">
+      <w:start w:val="1"/>
+      <w:numFmt w:val="bullet"/>
+      <w:lvlText w:val=""/>
+      <w:lvlJc w:val="left"/>
+      <w:pPr>
+        <w:ind w:left="2880" w:hanging="360"/>
+      </w:pPr>
+      <w:rPr>
+        <w:rFonts w:ascii="Symbol" w:hAnsi="Symbol" w:hint="default"/>
+      </w:rPr>
+    </w:lvl>
+    <w:lvl w:ilvl="4" w:tplc="40090003" w:tentative="1">
+      <w:start w:val="1"/>
+      <w:numFmt w:val="bullet"/>
+      <w:lvlText w:val="o"/>
+      <w:lvlJc w:val="left"/>
+      <w:pPr>
+        <w:ind w:left="3600" w:hanging="360"/>
+      </w:pPr>
+      <w:rPr>
+        <w:rFonts w:ascii="Courier New" w:hAnsi="Courier New" w:cs="Courier New" w:hint="default"/>
+      </w:rPr>
+    </w:lvl>
+    <w:lvl w:ilvl="5" w:tplc="40090005" w:tentative="1">
+      <w:start w:val="1"/>
+      <w:numFmt w:val="bullet"/>
+      <w:lvlText w:val=""/>
+      <w:lvlJc w:val="left"/>
+      <w:pPr>
+        <w:ind w:left="4320" w:hanging="360"/>
+      </w:pPr>
+      <w:rPr>
+        <w:rFonts w:ascii="Wingdings" w:hAnsi="Wingdings" w:hint="default"/>
+      </w:rPr>
+    </w:lvl>
+    <w:lvl w:ilvl="6" w:tplc="40090001" w:tentative="1">
+      <w:start w:val="1"/>
+      <w:numFmt w:val="bullet"/>
+      <w:lvlText w:val=""/>
+      <w:lvlJc w:val="left"/>
+      <w:pPr>
+        <w:ind w:left="5040" w:hanging="360"/>
+      </w:pPr>
+      <w:rPr>
+        <w:rFonts w:ascii="Symbol" w:hAnsi="Symbol" w:hint="default"/>
+      </w:rPr>
+    </w:lvl>
+    <w:lvl w:ilvl="7" w:tplc="40090003" w:tentative="1">
+      <w:start w:val="1"/>
+      <w:numFmt w:val="bullet"/>
+      <w:lvlText w:val="o"/>
+      <w:lvlJc w:val="left"/>
+      <w:pPr>
+        <w:ind w:left="5760" w:hanging="360"/>
+      </w:pPr>
+      <w:rPr>
+        <w:rFonts w:ascii="Courier New" w:hAnsi="Courier New" w:cs="Courier New" w:hint="default"/>
+      </w:rPr>
+    </w:lvl>
+    <w:lvl w:ilvl="8" w:tplc="40090005" w:tentative="1">
+      <w:start w:val="1"/>
+      <w:numFmt w:val="bullet"/>
+      <w:lvlText w:val=""/>
+      <w:lvlJc w:val="left"/>
+      <w:pPr>
+        <w:ind w:left="6480" w:hanging="360"/>
+      </w:pPr>
+      <w:rPr>
+        <w:rFonts w:ascii="Wingdings" w:hAnsi="Wingdings" w:hint="default"/>
+      </w:rPr>
+    </w:lvl>
+  </w:abstractNum>
+  <w:abstractNum w:abstractNumId="15">
     <w:nsid w:val="6E087545"/>
     <w:multiLevelType w:val="hybridMultilevel"/>
     <w:tmpl w:val="68B8BE2E"/>
@@ -8034,7 +9251,7 @@
       </w:pPr>
     </w:lvl>
   </w:abstractNum>
-  <w:abstractNum w:abstractNumId="13">
+  <w:abstractNum w:abstractNumId="16">
     <w:nsid w:val="712436B2"/>
     <w:multiLevelType w:val="hybridMultilevel"/>
     <w:tmpl w:val="7DB88F34"/>
@@ -8147,7 +9364,7 @@
       </w:rPr>
     </w:lvl>
   </w:abstractNum>
-  <w:abstractNum w:abstractNumId="14">
+  <w:abstractNum w:abstractNumId="17">
     <w:nsid w:val="73BF2B49"/>
     <w:multiLevelType w:val="hybridMultilevel"/>
     <w:tmpl w:val="8E56E800"/>
@@ -8260,7 +9477,120 @@
       </w:rPr>
     </w:lvl>
   </w:abstractNum>
-  <w:abstractNum w:abstractNumId="15">
+  <w:abstractNum w:abstractNumId="18">
+    <w:nsid w:val="7A65502B"/>
+    <w:multiLevelType w:val="hybridMultilevel"/>
+    <w:tmpl w:val="763EAD76"/>
+    <w:lvl w:ilvl="0" w:tplc="40090001">
+      <w:start w:val="1"/>
+      <w:numFmt w:val="bullet"/>
+      <w:lvlText w:val=""/>
+      <w:lvlJc w:val="left"/>
+      <w:pPr>
+        <w:ind w:left="720" w:hanging="360"/>
+      </w:pPr>
+      <w:rPr>
+        <w:rFonts w:ascii="Symbol" w:hAnsi="Symbol" w:hint="default"/>
+      </w:rPr>
+    </w:lvl>
+    <w:lvl w:ilvl="1" w:tplc="40090003">
+      <w:start w:val="1"/>
+      <w:numFmt w:val="bullet"/>
+      <w:lvlText w:val="o"/>
+      <w:lvlJc w:val="left"/>
+      <w:pPr>
+        <w:ind w:left="1440" w:hanging="360"/>
+      </w:pPr>
+      <w:rPr>
+        <w:rFonts w:ascii="Courier New" w:hAnsi="Courier New" w:cs="Courier New" w:hint="default"/>
+      </w:rPr>
+    </w:lvl>
+    <w:lvl w:ilvl="2" w:tplc="40090005" w:tentative="1">
+      <w:start w:val="1"/>
+      <w:numFmt w:val="bullet"/>
+      <w:lvlText w:val=""/>
+      <w:lvlJc w:val="left"/>
+      <w:pPr>
+        <w:ind w:left="2160" w:hanging="360"/>
+      </w:pPr>
+      <w:rPr>
+        <w:rFonts w:ascii="Wingdings" w:hAnsi="Wingdings" w:hint="default"/>
+      </w:rPr>
+    </w:lvl>
+    <w:lvl w:ilvl="3" w:tplc="40090001" w:tentative="1">
+      <w:start w:val="1"/>
+      <w:numFmt w:val="bullet"/>
+      <w:lvlText w:val=""/>
+      <w:lvlJc w:val="left"/>
+      <w:pPr>
+        <w:ind w:left="2880" w:hanging="360"/>
+      </w:pPr>
+      <w:rPr>
+        <w:rFonts w:ascii="Symbol" w:hAnsi="Symbol" w:hint="default"/>
+      </w:rPr>
+    </w:lvl>
+    <w:lvl w:ilvl="4" w:tplc="40090003" w:tentative="1">
+      <w:start w:val="1"/>
+      <w:numFmt w:val="bullet"/>
+      <w:lvlText w:val="o"/>
+      <w:lvlJc w:val="left"/>
+      <w:pPr>
+        <w:ind w:left="3600" w:hanging="360"/>
+      </w:pPr>
+      <w:rPr>
+        <w:rFonts w:ascii="Courier New" w:hAnsi="Courier New" w:cs="Courier New" w:hint="default"/>
+      </w:rPr>
+    </w:lvl>
+    <w:lvl w:ilvl="5" w:tplc="40090005" w:tentative="1">
+      <w:start w:val="1"/>
+      <w:numFmt w:val="bullet"/>
+      <w:lvlText w:val=""/>
+      <w:lvlJc w:val="left"/>
+      <w:pPr>
+        <w:ind w:left="4320" w:hanging="360"/>
+      </w:pPr>
+      <w:rPr>
+        <w:rFonts w:ascii="Wingdings" w:hAnsi="Wingdings" w:hint="default"/>
+      </w:rPr>
+    </w:lvl>
+    <w:lvl w:ilvl="6" w:tplc="40090001" w:tentative="1">
+      <w:start w:val="1"/>
+      <w:numFmt w:val="bullet"/>
+      <w:lvlText w:val=""/>
+      <w:lvlJc w:val="left"/>
+      <w:pPr>
+        <w:ind w:left="5040" w:hanging="360"/>
+      </w:pPr>
+      <w:rPr>
+        <w:rFonts w:ascii="Symbol" w:hAnsi="Symbol" w:hint="default"/>
+      </w:rPr>
+    </w:lvl>
+    <w:lvl w:ilvl="7" w:tplc="40090003" w:tentative="1">
+      <w:start w:val="1"/>
+      <w:numFmt w:val="bullet"/>
+      <w:lvlText w:val="o"/>
+      <w:lvlJc w:val="left"/>
+      <w:pPr>
+        <w:ind w:left="5760" w:hanging="360"/>
+      </w:pPr>
+      <w:rPr>
+        <w:rFonts w:ascii="Courier New" w:hAnsi="Courier New" w:cs="Courier New" w:hint="default"/>
+      </w:rPr>
+    </w:lvl>
+    <w:lvl w:ilvl="8" w:tplc="40090005" w:tentative="1">
+      <w:start w:val="1"/>
+      <w:numFmt w:val="bullet"/>
+      <w:lvlText w:val=""/>
+      <w:lvlJc w:val="left"/>
+      <w:pPr>
+        <w:ind w:left="6480" w:hanging="360"/>
+      </w:pPr>
+      <w:rPr>
+        <w:rFonts w:ascii="Wingdings" w:hAnsi="Wingdings" w:hint="default"/>
+      </w:rPr>
+    </w:lvl>
+  </w:abstractNum>
+  <w:abstractNum w:abstractNumId="19">
     <w:nsid w:val="7FF367B4"/>
     <w:multiLevelType w:val="hybridMultilevel"/>
     <w:tmpl w:val="3DDC9BF0"/>
@@ -8377,49 +9707,61 @@
     <w:abstractNumId w:val="0"/>
   </w:num>
   <w:num w:numId="2">
-    <w:abstractNumId w:val="9"/>
+    <w:abstractNumId w:val="10"/>
   </w:num>
   <w:num w:numId="3">
+    <w:abstractNumId w:val="13"/>
+  </w:num>
+  <w:num w:numId="4">
+    <w:abstractNumId w:val="17"/>
+  </w:num>
+  <w:num w:numId="5">
+    <w:abstractNumId w:val="5"/>
+  </w:num>
+  <w:num w:numId="6">
+    <w:abstractNumId w:val="16"/>
+  </w:num>
+  <w:num w:numId="7">
+    <w:abstractNumId w:val="19"/>
+  </w:num>
+  <w:num w:numId="8">
+    <w:abstractNumId w:val="6"/>
+  </w:num>
+  <w:num w:numId="9">
     <w:abstractNumId w:val="11"/>
   </w:num>
-  <w:num w:numId="4">
-    <w:abstractNumId w:val="14"/>
-  </w:num>
-  <w:num w:numId="5">
+  <w:num w:numId="10">
     <w:abstractNumId w:val="4"/>
   </w:num>
-  <w:num w:numId="6">
-    <w:abstractNumId w:val="13"/>
-  </w:num>
-  <w:num w:numId="7">
-    <w:abstractNumId w:val="15"/>
-  </w:num>
-  <w:num w:numId="8">
-    <w:abstractNumId w:val="5"/>
-  </w:num>
-  <w:num w:numId="9">
-    <w:abstractNumId w:val="10"/>
-  </w:num>
-  <w:num w:numId="10">
-    <w:abstractNumId w:val="3"/>
-  </w:num>
   <w:num w:numId="11">
-    <w:abstractNumId w:val="8"/>
+    <w:abstractNumId w:val="9"/>
   </w:num>
   <w:num w:numId="12">
     <w:abstractNumId w:val="2"/>
   </w:num>
   <w:num w:numId="13">
-    <w:abstractNumId w:val="6"/>
+    <w:abstractNumId w:val="7"/>
   </w:num>
   <w:num w:numId="14">
-    <w:abstractNumId w:val="12"/>
+    <w:abstractNumId w:val="15"/>
   </w:num>
   <w:num w:numId="15">
     <w:abstractNumId w:val="1"/>
   </w:num>
   <w:num w:numId="16">
-    <w:abstractNumId w:val="7"/>
+    <w:abstractNumId w:val="8"/>
+  </w:num>
+  <w:num w:numId="17">
+    <w:abstractNumId w:val="18"/>
+  </w:num>
+  <w:num w:numId="18">
+    <w:abstractNumId w:val="14"/>
+  </w:num>
+  <w:num w:numId="19">
+    <w:abstractNumId w:val="12"/>
+  </w:num>
+  <w:num w:numId="20">
+    <w:abstractNumId w:val="3"/>
   </w:num>
 </w:numbering>
 </file>
@@ -8823,7 +10165,6 @@
   <w:style w:type="character" w:default="1" w:styleId="DefaultParagraphFont">
     <w:name w:val="Default Paragraph Font"/>
     <w:uiPriority w:val="1"/>
-    <w:semiHidden/>
     <w:unhideWhenUsed/>
   </w:style>
   <w:style w:type="table" w:default="1" w:styleId="TableNormal">
@@ -8862,7 +10203,6 @@
     <w:name w:val="Hyperlink"/>
     <w:basedOn w:val="DefaultParagraphFont"/>
     <w:uiPriority w:val="99"/>
-    <w:semiHidden/>
     <w:unhideWhenUsed/>
     <w:rsid w:val="0016129B"/>
     <w:rPr>
@@ -9833,10 +11173,24 @@
     <dgm:pt modelId="{374ED80F-5E6F-4A85-B95B-4BA99538042E}" type="pres">
       <dgm:prSet presAssocID="{9C4D6193-4800-45DB-9EB9-DA2277B5D91B}" presName="sibTrans" presStyleLbl="sibTrans2D1" presStyleIdx="0" presStyleCnt="3"/>
       <dgm:spPr/>
+      <dgm:t>
+        <a:bodyPr/>
+        <a:lstStyle/>
+        <a:p>
+          <a:endParaRPr lang="en-IN"/>
+        </a:p>
+      </dgm:t>
     </dgm:pt>
     <dgm:pt modelId="{B8DA0D4A-E19E-4233-86B3-A96400569C53}" type="pres">
       <dgm:prSet presAssocID="{9C4D6193-4800-45DB-9EB9-DA2277B5D91B}" presName="connectorText" presStyleLbl="sibTrans2D1" presStyleIdx="0" presStyleCnt="3"/>
       <dgm:spPr/>
+      <dgm:t>
+        <a:bodyPr/>
+        <a:lstStyle/>
+        <a:p>
+          <a:endParaRPr lang="en-IN"/>
+        </a:p>
+      </dgm:t>
     </dgm:pt>
     <dgm:pt modelId="{485EB252-98AF-4CC0-A401-D9A154AAFC53}" type="pres">
       <dgm:prSet presAssocID="{BF4790F6-D1AA-430E-85BA-C07F91D009F2}" presName="node" presStyleLbl="node1" presStyleIdx="1" presStyleCnt="4">
@@ -9845,14 +11199,35 @@
         </dgm:presLayoutVars>
       </dgm:prSet>
       <dgm:spPr/>
+      <dgm:t>
+        <a:bodyPr/>
+        <a:lstStyle/>
+        <a:p>
+          <a:endParaRPr lang="en-IN"/>
+        </a:p>
+      </dgm:t>
     </dgm:pt>
     <dgm:pt modelId="{C789FCC9-4717-4FFC-BA71-F98E7B1B3115}" type="pres">
       <dgm:prSet presAssocID="{214208B8-431D-481C-9A4C-228B7308ADA8}" presName="sibTrans" presStyleLbl="sibTrans2D1" presStyleIdx="1" presStyleCnt="3"/>
       <dgm:spPr/>
+      <dgm:t>
+        <a:bodyPr/>
+        <a:lstStyle/>
+        <a:p>
+          <a:endParaRPr lang="en-IN"/>
+        </a:p>
+      </dgm:t>
     </dgm:pt>
     <dgm:pt modelId="{5D4876CA-733D-4DFD-8E79-4A3DBC7C7C6B}" type="pres">
       <dgm:prSet presAssocID="{214208B8-431D-481C-9A4C-228B7308ADA8}" presName="connectorText" presStyleLbl="sibTrans2D1" presStyleIdx="1" presStyleCnt="3"/>
       <dgm:spPr/>
+      <dgm:t>
+        <a:bodyPr/>
+        <a:lstStyle/>
+        <a:p>
+          <a:endParaRPr lang="en-IN"/>
+        </a:p>
+      </dgm:t>
     </dgm:pt>
     <dgm:pt modelId="{DEB61738-BCA0-4546-95CF-970A62665FC2}" type="pres">
       <dgm:prSet presAssocID="{EF5675B6-38BA-4455-BA87-E62399D49989}" presName="node" presStyleLbl="node1" presStyleIdx="2" presStyleCnt="4">
@@ -9861,14 +11236,35 @@
         </dgm:presLayoutVars>
       </dgm:prSet>
       <dgm:spPr/>
+      <dgm:t>
+        <a:bodyPr/>
+        <a:lstStyle/>
+        <a:p>
+          <a:endParaRPr lang="en-IN"/>
+        </a:p>
+      </dgm:t>
     </dgm:pt>
     <dgm:pt modelId="{05A02C9E-6432-4B6A-91B3-E0BA65A6B1AE}" type="pres">
       <dgm:prSet presAssocID="{7201A391-9828-4B1D-A3C1-894234D041DB}" presName="sibTrans" presStyleLbl="sibTrans2D1" presStyleIdx="2" presStyleCnt="3"/>
       <dgm:spPr/>
+      <dgm:t>
+        <a:bodyPr/>
+        <a:lstStyle/>
+        <a:p>
+          <a:endParaRPr lang="en-IN"/>
+        </a:p>
+      </dgm:t>
     </dgm:pt>
     <dgm:pt modelId="{FDD593C1-9D9B-40ED-8C6D-5142CB0F0E3E}" type="pres">
       <dgm:prSet presAssocID="{7201A391-9828-4B1D-A3C1-894234D041DB}" presName="connectorText" presStyleLbl="sibTrans2D1" presStyleIdx="2" presStyleCnt="3"/>
       <dgm:spPr/>
+      <dgm:t>
+        <a:bodyPr/>
+        <a:lstStyle/>
+        <a:p>
+          <a:endParaRPr lang="en-IN"/>
+        </a:p>
+      </dgm:t>
     </dgm:pt>
     <dgm:pt modelId="{D0DFB2B8-5022-4762-AA62-9B0CF1B32B60}" type="pres">
       <dgm:prSet presAssocID="{BF8C77AF-CFF1-4B53-B009-D4E001D240D6}" presName="node" presStyleLbl="node1" presStyleIdx="3" presStyleCnt="4">
@@ -9877,40 +11273,47 @@
         </dgm:presLayoutVars>
       </dgm:prSet>
       <dgm:spPr/>
+      <dgm:t>
+        <a:bodyPr/>
+        <a:lstStyle/>
+        <a:p>
+          <a:endParaRPr lang="en-IN"/>
+        </a:p>
+      </dgm:t>
     </dgm:pt>
   </dgm:ptLst>
   <dgm:cxnLst>
-    <dgm:cxn modelId="{AC1E7DDF-51D0-406A-8210-9E38B1AA6A27}" type="presOf" srcId="{5AAB36AD-884F-4169-9EAA-81A3D87ABCFA}" destId="{AB8F05C3-3669-4AF7-9C79-08939721A716}" srcOrd="0" destOrd="0" presId="urn:microsoft.com/office/officeart/2005/8/layout/process1"/>
-    <dgm:cxn modelId="{686FBA82-DD7D-4963-B544-356B2F8BF04B}" type="presOf" srcId="{BF8C77AF-CFF1-4B53-B009-D4E001D240D6}" destId="{D0DFB2B8-5022-4762-AA62-9B0CF1B32B60}" srcOrd="0" destOrd="0" presId="urn:microsoft.com/office/officeart/2005/8/layout/process1"/>
+    <dgm:cxn modelId="{E585A355-8A84-44EB-9094-118D4AD1E5EF}" type="presOf" srcId="{5AAB36AD-884F-4169-9EAA-81A3D87ABCFA}" destId="{AB8F05C3-3669-4AF7-9C79-08939721A716}" srcOrd="0" destOrd="0" presId="urn:microsoft.com/office/officeart/2005/8/layout/process1"/>
+    <dgm:cxn modelId="{59C88D77-462B-497D-91D2-6323FC040003}" type="presOf" srcId="{7201A391-9828-4B1D-A3C1-894234D041DB}" destId="{FDD593C1-9D9B-40ED-8C6D-5142CB0F0E3E}" srcOrd="1" destOrd="0" presId="urn:microsoft.com/office/officeart/2005/8/layout/process1"/>
+    <dgm:cxn modelId="{A6FD9417-A9D1-4DA4-A5F9-FF99EA2C6552}" type="presOf" srcId="{214208B8-431D-481C-9A4C-228B7308ADA8}" destId="{5D4876CA-733D-4DFD-8E79-4A3DBC7C7C6B}" srcOrd="1" destOrd="0" presId="urn:microsoft.com/office/officeart/2005/8/layout/process1"/>
+    <dgm:cxn modelId="{BA1F60C1-669C-4B31-8E68-DB3408A55F6D}" type="presOf" srcId="{BF8C77AF-CFF1-4B53-B009-D4E001D240D6}" destId="{D0DFB2B8-5022-4762-AA62-9B0CF1B32B60}" srcOrd="0" destOrd="0" presId="urn:microsoft.com/office/officeart/2005/8/layout/process1"/>
+    <dgm:cxn modelId="{80AB986A-FDF3-41B1-9092-584CE3EB969B}" srcId="{9EE1A18E-AD2D-415E-8996-B35207C41ED0}" destId="{BF8C77AF-CFF1-4B53-B009-D4E001D240D6}" srcOrd="3" destOrd="0" parTransId="{FBE35E27-7BCE-41B3-88D2-29BD34AAC180}" sibTransId="{DC8EEA03-196C-4689-B6BD-D5BC213D37CC}"/>
+    <dgm:cxn modelId="{61154B86-CA6F-4263-BDD3-F0AA5EB2B3A3}" type="presOf" srcId="{9C4D6193-4800-45DB-9EB9-DA2277B5D91B}" destId="{B8DA0D4A-E19E-4233-86B3-A96400569C53}" srcOrd="1" destOrd="0" presId="urn:microsoft.com/office/officeart/2005/8/layout/process1"/>
+    <dgm:cxn modelId="{4D181FDC-4453-452E-BC9B-E9D36FFCE933}" type="presOf" srcId="{9C4D6193-4800-45DB-9EB9-DA2277B5D91B}" destId="{374ED80F-5E6F-4A85-B95B-4BA99538042E}" srcOrd="0" destOrd="0" presId="urn:microsoft.com/office/officeart/2005/8/layout/process1"/>
+    <dgm:cxn modelId="{66B92051-47ED-40F8-981C-03703B199AA5}" type="presOf" srcId="{EF5675B6-38BA-4455-BA87-E62399D49989}" destId="{DEB61738-BCA0-4546-95CF-970A62665FC2}" srcOrd="0" destOrd="0" presId="urn:microsoft.com/office/officeart/2005/8/layout/process1"/>
+    <dgm:cxn modelId="{019AFA06-1E00-4761-A1F3-C7E051DF74FD}" type="presOf" srcId="{7201A391-9828-4B1D-A3C1-894234D041DB}" destId="{05A02C9E-6432-4B6A-91B3-E0BA65A6B1AE}" srcOrd="0" destOrd="0" presId="urn:microsoft.com/office/officeart/2005/8/layout/process1"/>
+    <dgm:cxn modelId="{31FDE8B0-EABD-4652-A59B-B2DCA9B8B6B3}" type="presOf" srcId="{9EE1A18E-AD2D-415E-8996-B35207C41ED0}" destId="{B9FC173B-3430-402C-9BFA-D498C62BCC2D}" srcOrd="0" destOrd="0" presId="urn:microsoft.com/office/officeart/2005/8/layout/process1"/>
+    <dgm:cxn modelId="{4D1B4854-AE2E-470B-9115-BD099FD5799A}" srcId="{9EE1A18E-AD2D-415E-8996-B35207C41ED0}" destId="{BF4790F6-D1AA-430E-85BA-C07F91D009F2}" srcOrd="1" destOrd="0" parTransId="{974B1A63-8714-4E97-A93F-006B83F9DBF3}" sibTransId="{214208B8-431D-481C-9A4C-228B7308ADA8}"/>
     <dgm:cxn modelId="{B151CA70-0406-48D6-8013-3F7D288766AD}" srcId="{9EE1A18E-AD2D-415E-8996-B35207C41ED0}" destId="{5AAB36AD-884F-4169-9EAA-81A3D87ABCFA}" srcOrd="0" destOrd="0" parTransId="{4796A0B2-FD04-4D0D-B4E3-6A8EB9A6D74D}" sibTransId="{9C4D6193-4800-45DB-9EB9-DA2277B5D91B}"/>
-    <dgm:cxn modelId="{98573E87-11DF-47E4-BD66-35B54ABAC7D5}" type="presOf" srcId="{9EE1A18E-AD2D-415E-8996-B35207C41ED0}" destId="{B9FC173B-3430-402C-9BFA-D498C62BCC2D}" srcOrd="0" destOrd="0" presId="urn:microsoft.com/office/officeart/2005/8/layout/process1"/>
     <dgm:cxn modelId="{39F27088-F2FF-4B1E-85B8-75E4A5853051}" srcId="{9EE1A18E-AD2D-415E-8996-B35207C41ED0}" destId="{EF5675B6-38BA-4455-BA87-E62399D49989}" srcOrd="2" destOrd="0" parTransId="{B9F702AD-11CA-445A-BE84-AFE50ED28D23}" sibTransId="{7201A391-9828-4B1D-A3C1-894234D041DB}"/>
-    <dgm:cxn modelId="{4D1B4854-AE2E-470B-9115-BD099FD5799A}" srcId="{9EE1A18E-AD2D-415E-8996-B35207C41ED0}" destId="{BF4790F6-D1AA-430E-85BA-C07F91D009F2}" srcOrd="1" destOrd="0" parTransId="{974B1A63-8714-4E97-A93F-006B83F9DBF3}" sibTransId="{214208B8-431D-481C-9A4C-228B7308ADA8}"/>
-    <dgm:cxn modelId="{469FF45F-9B58-4A4C-B0D0-8D2145B5B6BA}" type="presOf" srcId="{214208B8-431D-481C-9A4C-228B7308ADA8}" destId="{C789FCC9-4717-4FFC-BA71-F98E7B1B3115}" srcOrd="0" destOrd="0" presId="urn:microsoft.com/office/officeart/2005/8/layout/process1"/>
-    <dgm:cxn modelId="{2456FFBE-66C8-41BE-B7E0-9E98DF928220}" type="presOf" srcId="{214208B8-431D-481C-9A4C-228B7308ADA8}" destId="{5D4876CA-733D-4DFD-8E79-4A3DBC7C7C6B}" srcOrd="1" destOrd="0" presId="urn:microsoft.com/office/officeart/2005/8/layout/process1"/>
-    <dgm:cxn modelId="{A96360DF-A17F-4D6C-941F-74E17191497B}" type="presOf" srcId="{9C4D6193-4800-45DB-9EB9-DA2277B5D91B}" destId="{374ED80F-5E6F-4A85-B95B-4BA99538042E}" srcOrd="0" destOrd="0" presId="urn:microsoft.com/office/officeart/2005/8/layout/process1"/>
-    <dgm:cxn modelId="{3AAAA133-091D-458C-9D2A-0432DA9F57EC}" type="presOf" srcId="{EF5675B6-38BA-4455-BA87-E62399D49989}" destId="{DEB61738-BCA0-4546-95CF-970A62665FC2}" srcOrd="0" destOrd="0" presId="urn:microsoft.com/office/officeart/2005/8/layout/process1"/>
-    <dgm:cxn modelId="{EDE2BD0D-3871-4235-8ADA-7FD9E5080A90}" type="presOf" srcId="{BF4790F6-D1AA-430E-85BA-C07F91D009F2}" destId="{485EB252-98AF-4CC0-A401-D9A154AAFC53}" srcOrd="0" destOrd="0" presId="urn:microsoft.com/office/officeart/2005/8/layout/process1"/>
-    <dgm:cxn modelId="{8F20A099-0561-4AAA-8C41-141D26A9B8BB}" type="presOf" srcId="{7201A391-9828-4B1D-A3C1-894234D041DB}" destId="{05A02C9E-6432-4B6A-91B3-E0BA65A6B1AE}" srcOrd="0" destOrd="0" presId="urn:microsoft.com/office/officeart/2005/8/layout/process1"/>
-    <dgm:cxn modelId="{AB83CB41-0CCB-44FF-B560-28F5DB69397C}" type="presOf" srcId="{7201A391-9828-4B1D-A3C1-894234D041DB}" destId="{FDD593C1-9D9B-40ED-8C6D-5142CB0F0E3E}" srcOrd="1" destOrd="0" presId="urn:microsoft.com/office/officeart/2005/8/layout/process1"/>
-    <dgm:cxn modelId="{80AB986A-FDF3-41B1-9092-584CE3EB969B}" srcId="{9EE1A18E-AD2D-415E-8996-B35207C41ED0}" destId="{BF8C77AF-CFF1-4B53-B009-D4E001D240D6}" srcOrd="3" destOrd="0" parTransId="{FBE35E27-7BCE-41B3-88D2-29BD34AAC180}" sibTransId="{DC8EEA03-196C-4689-B6BD-D5BC213D37CC}"/>
-    <dgm:cxn modelId="{4806BEE9-49D1-4CDB-B056-28B8E05DAD0E}" type="presOf" srcId="{9C4D6193-4800-45DB-9EB9-DA2277B5D91B}" destId="{B8DA0D4A-E19E-4233-86B3-A96400569C53}" srcOrd="1" destOrd="0" presId="urn:microsoft.com/office/officeart/2005/8/layout/process1"/>
-    <dgm:cxn modelId="{1ED82129-B146-4A7F-B5E0-CB2517F4D2B2}" type="presParOf" srcId="{B9FC173B-3430-402C-9BFA-D498C62BCC2D}" destId="{AB8F05C3-3669-4AF7-9C79-08939721A716}" srcOrd="0" destOrd="0" presId="urn:microsoft.com/office/officeart/2005/8/layout/process1"/>
-    <dgm:cxn modelId="{1BC6F4F3-E370-4A7B-B127-7BD938626608}" type="presParOf" srcId="{B9FC173B-3430-402C-9BFA-D498C62BCC2D}" destId="{374ED80F-5E6F-4A85-B95B-4BA99538042E}" srcOrd="1" destOrd="0" presId="urn:microsoft.com/office/officeart/2005/8/layout/process1"/>
-    <dgm:cxn modelId="{D7517DB7-089B-4622-BF20-1B51389DC0D8}" type="presParOf" srcId="{374ED80F-5E6F-4A85-B95B-4BA99538042E}" destId="{B8DA0D4A-E19E-4233-86B3-A96400569C53}" srcOrd="0" destOrd="0" presId="urn:microsoft.com/office/officeart/2005/8/layout/process1"/>
-    <dgm:cxn modelId="{DCAF5FB3-D08C-40DC-8E40-BCAE3C574998}" type="presParOf" srcId="{B9FC173B-3430-402C-9BFA-D498C62BCC2D}" destId="{485EB252-98AF-4CC0-A401-D9A154AAFC53}" srcOrd="2" destOrd="0" presId="urn:microsoft.com/office/officeart/2005/8/layout/process1"/>
-    <dgm:cxn modelId="{5516B056-5A72-4FFB-A549-EA6D7E8BFE03}" type="presParOf" srcId="{B9FC173B-3430-402C-9BFA-D498C62BCC2D}" destId="{C789FCC9-4717-4FFC-BA71-F98E7B1B3115}" srcOrd="3" destOrd="0" presId="urn:microsoft.com/office/officeart/2005/8/layout/process1"/>
-    <dgm:cxn modelId="{07E36648-30E3-4E50-AE3F-533F38BA8D98}" type="presParOf" srcId="{C789FCC9-4717-4FFC-BA71-F98E7B1B3115}" destId="{5D4876CA-733D-4DFD-8E79-4A3DBC7C7C6B}" srcOrd="0" destOrd="0" presId="urn:microsoft.com/office/officeart/2005/8/layout/process1"/>
-    <dgm:cxn modelId="{FDAD0897-4EA1-4858-9561-84C3A1365B46}" type="presParOf" srcId="{B9FC173B-3430-402C-9BFA-D498C62BCC2D}" destId="{DEB61738-BCA0-4546-95CF-970A62665FC2}" srcOrd="4" destOrd="0" presId="urn:microsoft.com/office/officeart/2005/8/layout/process1"/>
-    <dgm:cxn modelId="{C1553579-9CE0-42DA-A077-6E424824A802}" type="presParOf" srcId="{B9FC173B-3430-402C-9BFA-D498C62BCC2D}" destId="{05A02C9E-6432-4B6A-91B3-E0BA65A6B1AE}" srcOrd="5" destOrd="0" presId="urn:microsoft.com/office/officeart/2005/8/layout/process1"/>
-    <dgm:cxn modelId="{2D51F5A9-A7FE-49A4-AD53-9DB057578CDB}" type="presParOf" srcId="{05A02C9E-6432-4B6A-91B3-E0BA65A6B1AE}" destId="{FDD593C1-9D9B-40ED-8C6D-5142CB0F0E3E}" srcOrd="0" destOrd="0" presId="urn:microsoft.com/office/officeart/2005/8/layout/process1"/>
-    <dgm:cxn modelId="{FFD35C4E-487A-46D7-BF37-C0977F38B1FF}" type="presParOf" srcId="{B9FC173B-3430-402C-9BFA-D498C62BCC2D}" destId="{D0DFB2B8-5022-4762-AA62-9B0CF1B32B60}" srcOrd="6" destOrd="0" presId="urn:microsoft.com/office/officeart/2005/8/layout/process1"/>
+    <dgm:cxn modelId="{6B9FC45D-4F3A-456C-9D8B-FA736ECB8D5C}" type="presOf" srcId="{214208B8-431D-481C-9A4C-228B7308ADA8}" destId="{C789FCC9-4717-4FFC-BA71-F98E7B1B3115}" srcOrd="0" destOrd="0" presId="urn:microsoft.com/office/officeart/2005/8/layout/process1"/>
+    <dgm:cxn modelId="{3D2029B6-13FB-4B58-87F6-AC6BBBE7B022}" type="presOf" srcId="{BF4790F6-D1AA-430E-85BA-C07F91D009F2}" destId="{485EB252-98AF-4CC0-A401-D9A154AAFC53}" srcOrd="0" destOrd="0" presId="urn:microsoft.com/office/officeart/2005/8/layout/process1"/>
+    <dgm:cxn modelId="{9D76AAA6-E63F-434E-97D3-BEFDE427390F}" type="presParOf" srcId="{B9FC173B-3430-402C-9BFA-D498C62BCC2D}" destId="{AB8F05C3-3669-4AF7-9C79-08939721A716}" srcOrd="0" destOrd="0" presId="urn:microsoft.com/office/officeart/2005/8/layout/process1"/>
+    <dgm:cxn modelId="{629B38C9-C36F-4C42-AE13-93FD4308492C}" type="presParOf" srcId="{B9FC173B-3430-402C-9BFA-D498C62BCC2D}" destId="{374ED80F-5E6F-4A85-B95B-4BA99538042E}" srcOrd="1" destOrd="0" presId="urn:microsoft.com/office/officeart/2005/8/layout/process1"/>
+    <dgm:cxn modelId="{4CD0615A-0FFB-4EE1-834D-069C0B2AA7D0}" type="presParOf" srcId="{374ED80F-5E6F-4A85-B95B-4BA99538042E}" destId="{B8DA0D4A-E19E-4233-86B3-A96400569C53}" srcOrd="0" destOrd="0" presId="urn:microsoft.com/office/officeart/2005/8/layout/process1"/>
+    <dgm:cxn modelId="{04A414C1-4CBF-46B6-BADE-9A2443927DC8}" type="presParOf" srcId="{B9FC173B-3430-402C-9BFA-D498C62BCC2D}" destId="{485EB252-98AF-4CC0-A401-D9A154AAFC53}" srcOrd="2" destOrd="0" presId="urn:microsoft.com/office/officeart/2005/8/layout/process1"/>
+    <dgm:cxn modelId="{D65ACF33-6B9E-42C6-AFF0-459F9DCA673E}" type="presParOf" srcId="{B9FC173B-3430-402C-9BFA-D498C62BCC2D}" destId="{C789FCC9-4717-4FFC-BA71-F98E7B1B3115}" srcOrd="3" destOrd="0" presId="urn:microsoft.com/office/officeart/2005/8/layout/process1"/>
+    <dgm:cxn modelId="{C6DA7B57-BD4C-44D1-9300-2122BA1740D1}" type="presParOf" srcId="{C789FCC9-4717-4FFC-BA71-F98E7B1B3115}" destId="{5D4876CA-733D-4DFD-8E79-4A3DBC7C7C6B}" srcOrd="0" destOrd="0" presId="urn:microsoft.com/office/officeart/2005/8/layout/process1"/>
+    <dgm:cxn modelId="{9BCE657E-B9CC-4E4B-BCAF-C6D6304B2CF6}" type="presParOf" srcId="{B9FC173B-3430-402C-9BFA-D498C62BCC2D}" destId="{DEB61738-BCA0-4546-95CF-970A62665FC2}" srcOrd="4" destOrd="0" presId="urn:microsoft.com/office/officeart/2005/8/layout/process1"/>
+    <dgm:cxn modelId="{56C31A07-5AB2-4B6D-A91B-CD22F2A0FB1A}" type="presParOf" srcId="{B9FC173B-3430-402C-9BFA-D498C62BCC2D}" destId="{05A02C9E-6432-4B6A-91B3-E0BA65A6B1AE}" srcOrd="5" destOrd="0" presId="urn:microsoft.com/office/officeart/2005/8/layout/process1"/>
+    <dgm:cxn modelId="{032AAF07-EC95-4125-8CC7-50F8507EF07F}" type="presParOf" srcId="{05A02C9E-6432-4B6A-91B3-E0BA65A6B1AE}" destId="{FDD593C1-9D9B-40ED-8C6D-5142CB0F0E3E}" srcOrd="0" destOrd="0" presId="urn:microsoft.com/office/officeart/2005/8/layout/process1"/>
+    <dgm:cxn modelId="{331B0E58-2F15-493F-8EB9-7806513BA80F}" type="presParOf" srcId="{B9FC173B-3430-402C-9BFA-D498C62BCC2D}" destId="{D0DFB2B8-5022-4762-AA62-9B0CF1B32B60}" srcOrd="6" destOrd="0" presId="urn:microsoft.com/office/officeart/2005/8/layout/process1"/>
   </dgm:cxnLst>
   <dgm:bg/>
   <dgm:whole/>
   <dgm:extLst>
     <a:ext uri="http://schemas.microsoft.com/office/drawing/2008/diagram">
-      <dsp:dataModelExt xmlns:dsp="http://schemas.microsoft.com/office/drawing/2008/diagram" relId="rId10" minVer="http://schemas.openxmlformats.org/drawingml/2006/diagram"/>
+      <dsp:dataModelExt xmlns:dsp="http://schemas.microsoft.com/office/drawing/2008/diagram" relId="rId11" minVer="http://schemas.openxmlformats.org/drawingml/2006/diagram"/>
     </a:ext>
   </dgm:extLst>
 </dgm:dataModel>

</xml_diff>

<commit_message>
Date: 29 Jan 2026
</commit_message>
<xml_diff>
--- a/Notes_SA2510014.docx
+++ b/Notes_SA2510014.docx
@@ -818,13 +818,23 @@
           <w:lang w:val="en-US"/>
         </w:rPr>
       </w:pPr>
-      <w:r>
-        <w:rPr>
-          <w:sz w:val="24"/>
-          <w:szCs w:val="22"/>
-          <w:lang w:val="en-US"/>
-        </w:rPr>
-        <w:t>Thread.sleep()</w:t>
+      <w:proofErr w:type="spellStart"/>
+      <w:r>
+        <w:rPr>
+          <w:sz w:val="24"/>
+          <w:szCs w:val="22"/>
+          <w:lang w:val="en-US"/>
+        </w:rPr>
+        <w:t>Thread.sleep</w:t>
+      </w:r>
+      <w:proofErr w:type="spellEnd"/>
+      <w:r>
+        <w:rPr>
+          <w:sz w:val="24"/>
+          <w:szCs w:val="22"/>
+          <w:lang w:val="en-US"/>
+        </w:rPr>
+        <w:t>()</w:t>
       </w:r>
     </w:p>
     <w:p>
@@ -1155,8 +1165,18 @@
           <w:szCs w:val="22"/>
           <w:lang w:val="en-US"/>
         </w:rPr>
-        <w:t>Handling #shadow-dom</w:t>
-      </w:r>
+        <w:t>Handling #shadow-</w:t>
+      </w:r>
+      <w:proofErr w:type="spellStart"/>
+      <w:r>
+        <w:rPr>
+          <w:sz w:val="24"/>
+          <w:szCs w:val="22"/>
+          <w:lang w:val="en-US"/>
+        </w:rPr>
+        <w:t>dom</w:t>
+      </w:r>
+      <w:proofErr w:type="spellEnd"/>
     </w:p>
     <w:p>
       <w:pPr>
@@ -5601,13 +5621,41 @@
           <w:lang w:val="en-US"/>
         </w:rPr>
       </w:pPr>
-      <w:r>
-        <w:rPr>
-          <w:sz w:val="24"/>
-          <w:szCs w:val="22"/>
-          <w:lang w:val="en-US"/>
-        </w:rPr>
-        <w:t>YourName_SeleniumDemos (Sanjeevani_SeleniumDemos)</w:t>
+      <w:proofErr w:type="spellStart"/>
+      <w:r>
+        <w:rPr>
+          <w:sz w:val="24"/>
+          <w:szCs w:val="22"/>
+          <w:lang w:val="en-US"/>
+        </w:rPr>
+        <w:t>YourName_SeleniumDemos</w:t>
+      </w:r>
+      <w:proofErr w:type="spellEnd"/>
+      <w:r>
+        <w:rPr>
+          <w:sz w:val="24"/>
+          <w:szCs w:val="22"/>
+          <w:lang w:val="en-US"/>
+        </w:rPr>
+        <w:t xml:space="preserve"> (</w:t>
+      </w:r>
+      <w:proofErr w:type="spellStart"/>
+      <w:r>
+        <w:rPr>
+          <w:sz w:val="24"/>
+          <w:szCs w:val="22"/>
+          <w:lang w:val="en-US"/>
+        </w:rPr>
+        <w:t>Sanjeevani_SeleniumDemos</w:t>
+      </w:r>
+      <w:proofErr w:type="spellEnd"/>
+      <w:r>
+        <w:rPr>
+          <w:sz w:val="24"/>
+          <w:szCs w:val="22"/>
+          <w:lang w:val="en-US"/>
+        </w:rPr>
+        <w:t>)</w:t>
       </w:r>
     </w:p>
     <w:p>
@@ -6150,7 +6198,25 @@
           <w:szCs w:val="22"/>
           <w:lang w:val="en-US"/>
         </w:rPr>
-        <w:t>Create a package inside this project (com.WebDriverDemos)</w:t>
+        <w:t>Create a package inside this project (</w:t>
+      </w:r>
+      <w:proofErr w:type="spellStart"/>
+      <w:r>
+        <w:rPr>
+          <w:sz w:val="24"/>
+          <w:szCs w:val="22"/>
+          <w:lang w:val="en-US"/>
+        </w:rPr>
+        <w:t>com.WebDriverDemos</w:t>
+      </w:r>
+      <w:proofErr w:type="spellEnd"/>
+      <w:r>
+        <w:rPr>
+          <w:sz w:val="24"/>
+          <w:szCs w:val="22"/>
+          <w:lang w:val="en-US"/>
+        </w:rPr>
+        <w:t>)</w:t>
       </w:r>
     </w:p>
     <w:p>
@@ -6527,13 +6593,23 @@
           <w:lang w:val="en-US"/>
         </w:rPr>
       </w:pPr>
-      <w:r>
-        <w:rPr>
-          <w:sz w:val="24"/>
-          <w:szCs w:val="22"/>
-          <w:lang w:val="en-US"/>
-        </w:rPr>
-        <w:t xml:space="preserve">get() </w:t>
+      <w:proofErr w:type="gramStart"/>
+      <w:r>
+        <w:rPr>
+          <w:sz w:val="24"/>
+          <w:szCs w:val="22"/>
+          <w:lang w:val="en-US"/>
+        </w:rPr>
+        <w:t>get(</w:t>
+      </w:r>
+      <w:proofErr w:type="gramEnd"/>
+      <w:r>
+        <w:rPr>
+          <w:sz w:val="24"/>
+          <w:szCs w:val="22"/>
+          <w:lang w:val="en-US"/>
+        </w:rPr>
+        <w:t xml:space="preserve">) </w:t>
       </w:r>
       <w:r>
         <w:rPr>
@@ -6565,13 +6641,23 @@
           <w:lang w:val="en-US"/>
         </w:rPr>
       </w:pPr>
-      <w:r>
-        <w:rPr>
-          <w:sz w:val="24"/>
-          <w:szCs w:val="22"/>
-          <w:lang w:val="en-US"/>
-        </w:rPr>
-        <w:t xml:space="preserve">driver.manage().window().maximize() </w:t>
+      <w:proofErr w:type="spellStart"/>
+      <w:r>
+        <w:rPr>
+          <w:sz w:val="24"/>
+          <w:szCs w:val="22"/>
+          <w:lang w:val="en-US"/>
+        </w:rPr>
+        <w:t>driver.manage</w:t>
+      </w:r>
+      <w:proofErr w:type="spellEnd"/>
+      <w:r>
+        <w:rPr>
+          <w:sz w:val="24"/>
+          <w:szCs w:val="22"/>
+          <w:lang w:val="en-US"/>
+        </w:rPr>
+        <w:t xml:space="preserve">().window().maximize() </w:t>
       </w:r>
       <w:r>
         <w:rPr>
@@ -6603,13 +6689,23 @@
           <w:lang w:val="en-US"/>
         </w:rPr>
       </w:pPr>
-      <w:r>
-        <w:rPr>
-          <w:sz w:val="24"/>
-          <w:szCs w:val="22"/>
-          <w:lang w:val="en-US"/>
-        </w:rPr>
-        <w:t xml:space="preserve">close() </w:t>
+      <w:proofErr w:type="gramStart"/>
+      <w:r>
+        <w:rPr>
+          <w:sz w:val="24"/>
+          <w:szCs w:val="22"/>
+          <w:lang w:val="en-US"/>
+        </w:rPr>
+        <w:t>close(</w:t>
+      </w:r>
+      <w:proofErr w:type="gramEnd"/>
+      <w:r>
+        <w:rPr>
+          <w:sz w:val="24"/>
+          <w:szCs w:val="22"/>
+          <w:lang w:val="en-US"/>
+        </w:rPr>
+        <w:t xml:space="preserve">) </w:t>
       </w:r>
       <w:r>
         <w:rPr>
@@ -6659,6 +6755,7 @@
           <w:lang w:val="en-US"/>
         </w:rPr>
       </w:pPr>
+      <w:proofErr w:type="gramStart"/>
       <w:r>
         <w:rPr>
           <w:sz w:val="24"/>
@@ -6666,7 +6763,16 @@
           <w:lang w:val="en-US"/>
         </w:rPr>
         <w:lastRenderedPageBreak/>
-        <w:t xml:space="preserve">quit() </w:t>
+        <w:t>quit(</w:t>
+      </w:r>
+      <w:proofErr w:type="gramEnd"/>
+      <w:r>
+        <w:rPr>
+          <w:sz w:val="24"/>
+          <w:szCs w:val="22"/>
+          <w:lang w:val="en-US"/>
+        </w:rPr>
+        <w:t xml:space="preserve">) </w:t>
       </w:r>
       <w:r>
         <w:rPr>
@@ -6698,13 +6804,23 @@
           <w:lang w:val="en-US"/>
         </w:rPr>
       </w:pPr>
-      <w:r>
-        <w:rPr>
-          <w:sz w:val="24"/>
-          <w:szCs w:val="22"/>
-          <w:lang w:val="en-US"/>
-        </w:rPr>
-        <w:t xml:space="preserve">getTitle() </w:t>
+      <w:proofErr w:type="gramStart"/>
+      <w:r>
+        <w:rPr>
+          <w:sz w:val="24"/>
+          <w:szCs w:val="22"/>
+          <w:lang w:val="en-US"/>
+        </w:rPr>
+        <w:t>getTitle(</w:t>
+      </w:r>
+      <w:proofErr w:type="gramEnd"/>
+      <w:r>
+        <w:rPr>
+          <w:sz w:val="24"/>
+          <w:szCs w:val="22"/>
+          <w:lang w:val="en-US"/>
+        </w:rPr>
+        <w:t xml:space="preserve">) </w:t>
       </w:r>
       <w:r>
         <w:rPr>
@@ -6736,13 +6852,23 @@
           <w:lang w:val="en-US"/>
         </w:rPr>
       </w:pPr>
-      <w:r>
-        <w:rPr>
-          <w:sz w:val="24"/>
-          <w:szCs w:val="22"/>
-          <w:lang w:val="en-US"/>
-        </w:rPr>
-        <w:t xml:space="preserve">getCurrentUrl() </w:t>
+      <w:proofErr w:type="gramStart"/>
+      <w:r>
+        <w:rPr>
+          <w:sz w:val="24"/>
+          <w:szCs w:val="22"/>
+          <w:lang w:val="en-US"/>
+        </w:rPr>
+        <w:t>getCurrentUrl(</w:t>
+      </w:r>
+      <w:proofErr w:type="gramEnd"/>
+      <w:r>
+        <w:rPr>
+          <w:sz w:val="24"/>
+          <w:szCs w:val="22"/>
+          <w:lang w:val="en-US"/>
+        </w:rPr>
+        <w:t xml:space="preserve">) </w:t>
       </w:r>
       <w:r>
         <w:rPr>
@@ -6812,13 +6938,23 @@
           <w:lang w:val="en-US"/>
         </w:rPr>
       </w:pPr>
-      <w:r>
-        <w:rPr>
-          <w:sz w:val="24"/>
-          <w:szCs w:val="22"/>
-          <w:lang w:val="en-US"/>
-        </w:rPr>
-        <w:t xml:space="preserve">findElement() </w:t>
+      <w:proofErr w:type="gramStart"/>
+      <w:r>
+        <w:rPr>
+          <w:sz w:val="24"/>
+          <w:szCs w:val="22"/>
+          <w:lang w:val="en-US"/>
+        </w:rPr>
+        <w:t>findElement(</w:t>
+      </w:r>
+      <w:proofErr w:type="gramEnd"/>
+      <w:r>
+        <w:rPr>
+          <w:sz w:val="24"/>
+          <w:szCs w:val="22"/>
+          <w:lang w:val="en-US"/>
+        </w:rPr>
+        <w:t xml:space="preserve">) </w:t>
       </w:r>
       <w:r>
         <w:rPr>
@@ -6876,13 +7012,23 @@
           <w:lang w:val="en-US"/>
         </w:rPr>
       </w:pPr>
-      <w:r>
-        <w:rPr>
-          <w:sz w:val="24"/>
-          <w:szCs w:val="22"/>
-          <w:lang w:val="en-US"/>
-        </w:rPr>
-        <w:t xml:space="preserve">findElements() </w:t>
+      <w:proofErr w:type="gramStart"/>
+      <w:r>
+        <w:rPr>
+          <w:sz w:val="24"/>
+          <w:szCs w:val="22"/>
+          <w:lang w:val="en-US"/>
+        </w:rPr>
+        <w:t>findElements(</w:t>
+      </w:r>
+      <w:proofErr w:type="gramEnd"/>
+      <w:r>
+        <w:rPr>
+          <w:sz w:val="24"/>
+          <w:szCs w:val="22"/>
+          <w:lang w:val="en-US"/>
+        </w:rPr>
+        <w:t xml:space="preserve">) </w:t>
       </w:r>
       <w:r>
         <w:rPr>
@@ -6914,13 +7060,23 @@
           <w:lang w:val="en-US"/>
         </w:rPr>
       </w:pPr>
-      <w:r>
-        <w:rPr>
-          <w:sz w:val="24"/>
-          <w:szCs w:val="22"/>
-          <w:lang w:val="en-US"/>
-        </w:rPr>
-        <w:t xml:space="preserve">getWindowHandles() </w:t>
+      <w:proofErr w:type="gramStart"/>
+      <w:r>
+        <w:rPr>
+          <w:sz w:val="24"/>
+          <w:szCs w:val="22"/>
+          <w:lang w:val="en-US"/>
+        </w:rPr>
+        <w:t>getWindowHandles(</w:t>
+      </w:r>
+      <w:proofErr w:type="gramEnd"/>
+      <w:r>
+        <w:rPr>
+          <w:sz w:val="24"/>
+          <w:szCs w:val="22"/>
+          <w:lang w:val="en-US"/>
+        </w:rPr>
+        <w:t xml:space="preserve">) </w:t>
       </w:r>
       <w:r>
         <w:rPr>
@@ -7535,13 +7691,23 @@
           <w:lang w:val="en-US"/>
         </w:rPr>
       </w:pPr>
-      <w:r>
-        <w:rPr>
-          <w:sz w:val="24"/>
-          <w:szCs w:val="22"/>
-          <w:lang w:val="en-US"/>
-        </w:rPr>
-        <w:t xml:space="preserve">sendKeys() </w:t>
+      <w:proofErr w:type="gramStart"/>
+      <w:r>
+        <w:rPr>
+          <w:sz w:val="24"/>
+          <w:szCs w:val="22"/>
+          <w:lang w:val="en-US"/>
+        </w:rPr>
+        <w:t>sendKeys(</w:t>
+      </w:r>
+      <w:proofErr w:type="gramEnd"/>
+      <w:r>
+        <w:rPr>
+          <w:sz w:val="24"/>
+          <w:szCs w:val="22"/>
+          <w:lang w:val="en-US"/>
+        </w:rPr>
+        <w:t xml:space="preserve">) </w:t>
       </w:r>
       <w:r>
         <w:rPr>
@@ -7581,13 +7747,23 @@
           <w:lang w:val="en-US"/>
         </w:rPr>
       </w:pPr>
-      <w:r>
-        <w:rPr>
-          <w:sz w:val="24"/>
-          <w:szCs w:val="22"/>
-          <w:lang w:val="en-US"/>
-        </w:rPr>
-        <w:t xml:space="preserve">click() </w:t>
+      <w:proofErr w:type="gramStart"/>
+      <w:r>
+        <w:rPr>
+          <w:sz w:val="24"/>
+          <w:szCs w:val="22"/>
+          <w:lang w:val="en-US"/>
+        </w:rPr>
+        <w:t>click(</w:t>
+      </w:r>
+      <w:proofErr w:type="gramEnd"/>
+      <w:r>
+        <w:rPr>
+          <w:sz w:val="24"/>
+          <w:szCs w:val="22"/>
+          <w:lang w:val="en-US"/>
+        </w:rPr>
+        <w:t xml:space="preserve">) </w:t>
       </w:r>
       <w:r>
         <w:rPr>
@@ -7619,13 +7795,23 @@
           <w:lang w:val="en-US"/>
         </w:rPr>
       </w:pPr>
-      <w:r>
-        <w:rPr>
-          <w:sz w:val="24"/>
-          <w:szCs w:val="22"/>
-          <w:lang w:val="en-US"/>
-        </w:rPr>
-        <w:t xml:space="preserve">getText() </w:t>
+      <w:proofErr w:type="gramStart"/>
+      <w:r>
+        <w:rPr>
+          <w:sz w:val="24"/>
+          <w:szCs w:val="22"/>
+          <w:lang w:val="en-US"/>
+        </w:rPr>
+        <w:t>getText(</w:t>
+      </w:r>
+      <w:proofErr w:type="gramEnd"/>
+      <w:r>
+        <w:rPr>
+          <w:sz w:val="24"/>
+          <w:szCs w:val="22"/>
+          <w:lang w:val="en-US"/>
+        </w:rPr>
+        <w:t xml:space="preserve">) </w:t>
       </w:r>
       <w:r>
         <w:rPr>
@@ -7657,13 +7843,23 @@
           <w:lang w:val="en-US"/>
         </w:rPr>
       </w:pPr>
-      <w:r>
-        <w:rPr>
-          <w:sz w:val="24"/>
-          <w:szCs w:val="22"/>
-          <w:lang w:val="en-US"/>
-        </w:rPr>
-        <w:t xml:space="preserve">getAttribute() / getDomAttribute() </w:t>
+      <w:proofErr w:type="gramStart"/>
+      <w:r>
+        <w:rPr>
+          <w:sz w:val="24"/>
+          <w:szCs w:val="22"/>
+          <w:lang w:val="en-US"/>
+        </w:rPr>
+        <w:t>getAttribute(</w:t>
+      </w:r>
+      <w:proofErr w:type="gramEnd"/>
+      <w:r>
+        <w:rPr>
+          <w:sz w:val="24"/>
+          <w:szCs w:val="22"/>
+          <w:lang w:val="en-US"/>
+        </w:rPr>
+        <w:t xml:space="preserve">) / getDomAttribute() </w:t>
       </w:r>
       <w:r>
         <w:rPr>
@@ -7695,13 +7891,23 @@
           <w:lang w:val="en-US"/>
         </w:rPr>
       </w:pPr>
-      <w:r>
-        <w:rPr>
-          <w:sz w:val="24"/>
-          <w:szCs w:val="22"/>
-          <w:lang w:val="en-US"/>
-        </w:rPr>
-        <w:t xml:space="preserve">submit() </w:t>
+      <w:proofErr w:type="gramStart"/>
+      <w:r>
+        <w:rPr>
+          <w:sz w:val="24"/>
+          <w:szCs w:val="22"/>
+          <w:lang w:val="en-US"/>
+        </w:rPr>
+        <w:t>submit(</w:t>
+      </w:r>
+      <w:proofErr w:type="gramEnd"/>
+      <w:r>
+        <w:rPr>
+          <w:sz w:val="24"/>
+          <w:szCs w:val="22"/>
+          <w:lang w:val="en-US"/>
+        </w:rPr>
+        <w:t xml:space="preserve">) </w:t>
       </w:r>
       <w:r>
         <w:rPr>
@@ -7749,13 +7955,23 @@
           <w:lang w:val="en-US"/>
         </w:rPr>
       </w:pPr>
-      <w:r>
-        <w:rPr>
-          <w:sz w:val="24"/>
-          <w:szCs w:val="22"/>
-          <w:lang w:val="en-US"/>
-        </w:rPr>
-        <w:t xml:space="preserve">isSelected() </w:t>
+      <w:proofErr w:type="gramStart"/>
+      <w:r>
+        <w:rPr>
+          <w:sz w:val="24"/>
+          <w:szCs w:val="22"/>
+          <w:lang w:val="en-US"/>
+        </w:rPr>
+        <w:t>isSelected(</w:t>
+      </w:r>
+      <w:proofErr w:type="gramEnd"/>
+      <w:r>
+        <w:rPr>
+          <w:sz w:val="24"/>
+          <w:szCs w:val="22"/>
+          <w:lang w:val="en-US"/>
+        </w:rPr>
+        <w:t xml:space="preserve">) </w:t>
       </w:r>
       <w:r>
         <w:rPr>
@@ -7833,13 +8049,23 @@
           <w:lang w:val="en-US"/>
         </w:rPr>
       </w:pPr>
-      <w:r>
-        <w:rPr>
-          <w:sz w:val="24"/>
-          <w:szCs w:val="22"/>
-          <w:lang w:val="en-US"/>
-        </w:rPr>
-        <w:t xml:space="preserve">isDisplayed() </w:t>
+      <w:proofErr w:type="gramStart"/>
+      <w:r>
+        <w:rPr>
+          <w:sz w:val="24"/>
+          <w:szCs w:val="22"/>
+          <w:lang w:val="en-US"/>
+        </w:rPr>
+        <w:t>isDisplayed(</w:t>
+      </w:r>
+      <w:proofErr w:type="gramEnd"/>
+      <w:r>
+        <w:rPr>
+          <w:sz w:val="24"/>
+          <w:szCs w:val="22"/>
+          <w:lang w:val="en-US"/>
+        </w:rPr>
+        <w:t xml:space="preserve">) </w:t>
       </w:r>
       <w:r>
         <w:rPr>
@@ -8419,7 +8645,25 @@
           <w:szCs w:val="22"/>
           <w:lang w:val="en-US"/>
         </w:rPr>
-        <w:t>data-testid="royal-email"]</w:t>
+        <w:t>data-</w:t>
+      </w:r>
+      <w:proofErr w:type="spellStart"/>
+      <w:r>
+        <w:rPr>
+          <w:sz w:val="24"/>
+          <w:szCs w:val="22"/>
+          <w:lang w:val="en-US"/>
+        </w:rPr>
+        <w:t>testid</w:t>
+      </w:r>
+      <w:proofErr w:type="spellEnd"/>
+      <w:r>
+        <w:rPr>
+          <w:sz w:val="24"/>
+          <w:szCs w:val="22"/>
+          <w:lang w:val="en-US"/>
+        </w:rPr>
+        <w:t>="royal-email"]</w:t>
       </w:r>
     </w:p>
     <w:p>
@@ -8948,8 +9192,18 @@
           <w:szCs w:val="22"/>
           <w:lang w:val="en-US"/>
         </w:rPr>
-        <w:t>Taking reference of parent tage</w:t>
-      </w:r>
+        <w:t xml:space="preserve">Taking reference of parent </w:t>
+      </w:r>
+      <w:proofErr w:type="spellStart"/>
+      <w:r>
+        <w:rPr>
+          <w:sz w:val="24"/>
+          <w:szCs w:val="22"/>
+          <w:lang w:val="en-US"/>
+        </w:rPr>
+        <w:t>tage</w:t>
+      </w:r>
+      <w:proofErr w:type="spellEnd"/>
     </w:p>
     <w:p>
       <w:pPr>
@@ -9121,13 +9375,23 @@
           <w:lang w:val="en-US"/>
         </w:rPr>
       </w:pPr>
-      <w:r>
-        <w:rPr>
-          <w:sz w:val="24"/>
-          <w:szCs w:val="22"/>
-          <w:lang w:val="en-US"/>
-        </w:rPr>
-        <w:t xml:space="preserve">getFirstSelectedOption() </w:t>
+      <w:proofErr w:type="gramStart"/>
+      <w:r>
+        <w:rPr>
+          <w:sz w:val="24"/>
+          <w:szCs w:val="22"/>
+          <w:lang w:val="en-US"/>
+        </w:rPr>
+        <w:t>getFirstSelectedOption(</w:t>
+      </w:r>
+      <w:proofErr w:type="gramEnd"/>
+      <w:r>
+        <w:rPr>
+          <w:sz w:val="24"/>
+          <w:szCs w:val="22"/>
+          <w:lang w:val="en-US"/>
+        </w:rPr>
+        <w:t xml:space="preserve">) </w:t>
       </w:r>
       <w:r>
         <w:rPr>
@@ -9197,13 +9461,23 @@
           <w:lang w:val="en-US"/>
         </w:rPr>
       </w:pPr>
-      <w:r>
-        <w:rPr>
-          <w:sz w:val="24"/>
-          <w:szCs w:val="22"/>
-          <w:lang w:val="en-US"/>
-        </w:rPr>
-        <w:t xml:space="preserve">selectByVisibleText() </w:t>
+      <w:proofErr w:type="gramStart"/>
+      <w:r>
+        <w:rPr>
+          <w:sz w:val="24"/>
+          <w:szCs w:val="22"/>
+          <w:lang w:val="en-US"/>
+        </w:rPr>
+        <w:t>selectByVisibleText(</w:t>
+      </w:r>
+      <w:proofErr w:type="gramEnd"/>
+      <w:r>
+        <w:rPr>
+          <w:sz w:val="24"/>
+          <w:szCs w:val="22"/>
+          <w:lang w:val="en-US"/>
+        </w:rPr>
+        <w:t xml:space="preserve">) </w:t>
       </w:r>
       <w:r>
         <w:rPr>
@@ -9253,13 +9527,23 @@
           <w:lang w:val="en-US"/>
         </w:rPr>
       </w:pPr>
-      <w:r>
-        <w:rPr>
-          <w:sz w:val="24"/>
-          <w:szCs w:val="22"/>
-          <w:lang w:val="en-US"/>
-        </w:rPr>
-        <w:t xml:space="preserve">selectByContainsVisibleText() </w:t>
+      <w:proofErr w:type="gramStart"/>
+      <w:r>
+        <w:rPr>
+          <w:sz w:val="24"/>
+          <w:szCs w:val="22"/>
+          <w:lang w:val="en-US"/>
+        </w:rPr>
+        <w:t>selectByContainsVisibleText(</w:t>
+      </w:r>
+      <w:proofErr w:type="gramEnd"/>
+      <w:r>
+        <w:rPr>
+          <w:sz w:val="24"/>
+          <w:szCs w:val="22"/>
+          <w:lang w:val="en-US"/>
+        </w:rPr>
+        <w:t xml:space="preserve">) </w:t>
       </w:r>
       <w:r>
         <w:rPr>
@@ -9309,13 +9593,23 @@
           <w:lang w:val="en-US"/>
         </w:rPr>
       </w:pPr>
-      <w:r>
-        <w:rPr>
-          <w:sz w:val="24"/>
-          <w:szCs w:val="22"/>
-          <w:lang w:val="en-US"/>
-        </w:rPr>
-        <w:t xml:space="preserve">selectByValue() </w:t>
+      <w:proofErr w:type="gramStart"/>
+      <w:r>
+        <w:rPr>
+          <w:sz w:val="24"/>
+          <w:szCs w:val="22"/>
+          <w:lang w:val="en-US"/>
+        </w:rPr>
+        <w:t>selectByValue(</w:t>
+      </w:r>
+      <w:proofErr w:type="gramEnd"/>
+      <w:r>
+        <w:rPr>
+          <w:sz w:val="24"/>
+          <w:szCs w:val="22"/>
+          <w:lang w:val="en-US"/>
+        </w:rPr>
+        <w:t xml:space="preserve">) </w:t>
       </w:r>
       <w:r>
         <w:rPr>
@@ -9365,13 +9659,23 @@
           <w:lang w:val="en-US"/>
         </w:rPr>
       </w:pPr>
-      <w:r>
-        <w:rPr>
-          <w:sz w:val="24"/>
-          <w:szCs w:val="22"/>
-          <w:lang w:val="en-US"/>
-        </w:rPr>
-        <w:t xml:space="preserve">selectByIndex() </w:t>
+      <w:proofErr w:type="gramStart"/>
+      <w:r>
+        <w:rPr>
+          <w:sz w:val="24"/>
+          <w:szCs w:val="22"/>
+          <w:lang w:val="en-US"/>
+        </w:rPr>
+        <w:t>selectByIndex(</w:t>
+      </w:r>
+      <w:proofErr w:type="gramEnd"/>
+      <w:r>
+        <w:rPr>
+          <w:sz w:val="24"/>
+          <w:szCs w:val="22"/>
+          <w:lang w:val="en-US"/>
+        </w:rPr>
+        <w:t xml:space="preserve">) </w:t>
       </w:r>
       <w:r>
         <w:rPr>
@@ -9431,13 +9735,23 @@
           <w:lang w:val="en-US"/>
         </w:rPr>
       </w:pPr>
-      <w:r>
-        <w:rPr>
-          <w:sz w:val="24"/>
-          <w:szCs w:val="22"/>
-          <w:lang w:val="en-US"/>
-        </w:rPr>
-        <w:t xml:space="preserve">getAllSelectedOptions() </w:t>
+      <w:proofErr w:type="gramStart"/>
+      <w:r>
+        <w:rPr>
+          <w:sz w:val="24"/>
+          <w:szCs w:val="22"/>
+          <w:lang w:val="en-US"/>
+        </w:rPr>
+        <w:t>getAllSelectedOptions(</w:t>
+      </w:r>
+      <w:proofErr w:type="gramEnd"/>
+      <w:r>
+        <w:rPr>
+          <w:sz w:val="24"/>
+          <w:szCs w:val="22"/>
+          <w:lang w:val="en-US"/>
+        </w:rPr>
+        <w:t xml:space="preserve">) </w:t>
       </w:r>
       <w:r>
         <w:rPr>
@@ -9469,13 +9783,23 @@
           <w:lang w:val="en-US"/>
         </w:rPr>
       </w:pPr>
-      <w:r>
-        <w:rPr>
-          <w:sz w:val="24"/>
-          <w:szCs w:val="22"/>
-          <w:lang w:val="en-US"/>
-        </w:rPr>
-        <w:t xml:space="preserve">isMultiple() </w:t>
+      <w:proofErr w:type="gramStart"/>
+      <w:r>
+        <w:rPr>
+          <w:sz w:val="24"/>
+          <w:szCs w:val="22"/>
+          <w:lang w:val="en-US"/>
+        </w:rPr>
+        <w:t>isMultiple(</w:t>
+      </w:r>
+      <w:proofErr w:type="gramEnd"/>
+      <w:r>
+        <w:rPr>
+          <w:sz w:val="24"/>
+          <w:szCs w:val="22"/>
+          <w:lang w:val="en-US"/>
+        </w:rPr>
+        <w:t xml:space="preserve">) </w:t>
       </w:r>
       <w:r>
         <w:rPr>
@@ -9810,13 +10134,33 @@
           <w:lang w:val="en-US"/>
         </w:rPr>
       </w:pPr>
-      <w:r>
-        <w:rPr>
-          <w:sz w:val="24"/>
-          <w:szCs w:val="22"/>
-          <w:lang w:val="en-US"/>
-        </w:rPr>
-        <w:t>Thread.sleep()</w:t>
+      <w:proofErr w:type="spellStart"/>
+      <w:proofErr w:type="gramStart"/>
+      <w:r>
+        <w:rPr>
+          <w:sz w:val="24"/>
+          <w:szCs w:val="22"/>
+          <w:lang w:val="en-US"/>
+        </w:rPr>
+        <w:t>Thread.sleep</w:t>
+      </w:r>
+      <w:proofErr w:type="spellEnd"/>
+      <w:r>
+        <w:rPr>
+          <w:sz w:val="24"/>
+          <w:szCs w:val="22"/>
+          <w:lang w:val="en-US"/>
+        </w:rPr>
+        <w:t>(</w:t>
+      </w:r>
+      <w:proofErr w:type="gramEnd"/>
+      <w:r>
+        <w:rPr>
+          <w:sz w:val="24"/>
+          <w:szCs w:val="22"/>
+          <w:lang w:val="en-US"/>
+        </w:rPr>
+        <w:t>)</w:t>
       </w:r>
       <w:r>
         <w:rPr>
@@ -10217,7 +10561,24 @@
           <w:lang w:val="en-US"/>
         </w:rPr>
         <w:br/>
-        <w:t xml:space="preserve">i – ignoring </w:t>
+      </w:r>
+      <w:proofErr w:type="spellStart"/>
+      <w:r>
+        <w:rPr>
+          <w:sz w:val="24"/>
+          <w:szCs w:val="22"/>
+          <w:lang w:val="en-US"/>
+        </w:rPr>
+        <w:t>i</w:t>
+      </w:r>
+      <w:proofErr w:type="spellEnd"/>
+      <w:r>
+        <w:rPr>
+          <w:sz w:val="24"/>
+          <w:szCs w:val="22"/>
+          <w:lang w:val="en-US"/>
+        </w:rPr>
+        <w:t xml:space="preserve"> – ignoring </w:t>
       </w:r>
       <w:r>
         <w:rPr>
@@ -10573,13 +10934,23 @@
           <w:lang w:val="en-US"/>
         </w:rPr>
       </w:pPr>
-      <w:r>
-        <w:rPr>
-          <w:sz w:val="24"/>
-          <w:szCs w:val="22"/>
-          <w:lang w:val="en-US"/>
-        </w:rPr>
-        <w:t>Can not inspect</w:t>
+      <w:proofErr w:type="spellStart"/>
+      <w:r>
+        <w:rPr>
+          <w:sz w:val="24"/>
+          <w:szCs w:val="22"/>
+          <w:lang w:val="en-US"/>
+        </w:rPr>
+        <w:t>Can not</w:t>
+      </w:r>
+      <w:proofErr w:type="spellEnd"/>
+      <w:r>
+        <w:rPr>
+          <w:sz w:val="24"/>
+          <w:szCs w:val="22"/>
+          <w:lang w:val="en-US"/>
+        </w:rPr>
+        <w:t xml:space="preserve"> inspect</w:t>
       </w:r>
     </w:p>
     <w:p>
@@ -10673,13 +11044,23 @@
           <w:lang w:val="en-US"/>
         </w:rPr>
       </w:pPr>
-      <w:r>
-        <w:rPr>
-          <w:sz w:val="24"/>
-          <w:szCs w:val="22"/>
-          <w:lang w:val="en-US"/>
-        </w:rPr>
-        <w:t xml:space="preserve">switchTo().alert() </w:t>
+      <w:proofErr w:type="spellStart"/>
+      <w:r>
+        <w:rPr>
+          <w:sz w:val="24"/>
+          <w:szCs w:val="22"/>
+          <w:lang w:val="en-US"/>
+        </w:rPr>
+        <w:t>switchTo</w:t>
+      </w:r>
+      <w:proofErr w:type="spellEnd"/>
+      <w:r>
+        <w:rPr>
+          <w:sz w:val="24"/>
+          <w:szCs w:val="22"/>
+          <w:lang w:val="en-US"/>
+        </w:rPr>
+        <w:t xml:space="preserve">().alert() </w:t>
       </w:r>
       <w:r>
         <w:rPr>
@@ -10711,13 +11092,23 @@
           <w:lang w:val="en-US"/>
         </w:rPr>
       </w:pPr>
-      <w:r>
-        <w:rPr>
-          <w:sz w:val="24"/>
-          <w:szCs w:val="22"/>
-          <w:lang w:val="en-US"/>
-        </w:rPr>
-        <w:t xml:space="preserve">getText() </w:t>
+      <w:proofErr w:type="gramStart"/>
+      <w:r>
+        <w:rPr>
+          <w:sz w:val="24"/>
+          <w:szCs w:val="22"/>
+          <w:lang w:val="en-US"/>
+        </w:rPr>
+        <w:t>getText(</w:t>
+      </w:r>
+      <w:proofErr w:type="gramEnd"/>
+      <w:r>
+        <w:rPr>
+          <w:sz w:val="24"/>
+          <w:szCs w:val="22"/>
+          <w:lang w:val="en-US"/>
+        </w:rPr>
+        <w:t xml:space="preserve">) </w:t>
       </w:r>
       <w:r>
         <w:rPr>
@@ -10749,13 +11140,23 @@
           <w:lang w:val="en-US"/>
         </w:rPr>
       </w:pPr>
-      <w:r>
-        <w:rPr>
-          <w:sz w:val="24"/>
-          <w:szCs w:val="22"/>
-          <w:lang w:val="en-US"/>
-        </w:rPr>
-        <w:t xml:space="preserve">accept() </w:t>
+      <w:proofErr w:type="gramStart"/>
+      <w:r>
+        <w:rPr>
+          <w:sz w:val="24"/>
+          <w:szCs w:val="22"/>
+          <w:lang w:val="en-US"/>
+        </w:rPr>
+        <w:t>accept(</w:t>
+      </w:r>
+      <w:proofErr w:type="gramEnd"/>
+      <w:r>
+        <w:rPr>
+          <w:sz w:val="24"/>
+          <w:szCs w:val="22"/>
+          <w:lang w:val="en-US"/>
+        </w:rPr>
+        <w:t xml:space="preserve">) </w:t>
       </w:r>
       <w:r>
         <w:rPr>
@@ -10787,13 +11188,23 @@
           <w:lang w:val="en-US"/>
         </w:rPr>
       </w:pPr>
-      <w:r>
-        <w:rPr>
-          <w:sz w:val="24"/>
-          <w:szCs w:val="22"/>
-          <w:lang w:val="en-US"/>
-        </w:rPr>
-        <w:t xml:space="preserve">dismiss() </w:t>
+      <w:proofErr w:type="gramStart"/>
+      <w:r>
+        <w:rPr>
+          <w:sz w:val="24"/>
+          <w:szCs w:val="22"/>
+          <w:lang w:val="en-US"/>
+        </w:rPr>
+        <w:t>dismiss(</w:t>
+      </w:r>
+      <w:proofErr w:type="gramEnd"/>
+      <w:r>
+        <w:rPr>
+          <w:sz w:val="24"/>
+          <w:szCs w:val="22"/>
+          <w:lang w:val="en-US"/>
+        </w:rPr>
+        <w:t xml:space="preserve">) </w:t>
       </w:r>
       <w:r>
         <w:rPr>
@@ -10825,6 +11236,7 @@
           <w:lang w:val="en-US"/>
         </w:rPr>
       </w:pPr>
+      <w:proofErr w:type="gramStart"/>
       <w:r>
         <w:rPr>
           <w:sz w:val="24"/>
@@ -10832,7 +11244,16 @@
           <w:lang w:val="en-US"/>
         </w:rPr>
         <w:lastRenderedPageBreak/>
-        <w:t xml:space="preserve">sendKeys() </w:t>
+        <w:t>sendKeys(</w:t>
+      </w:r>
+      <w:proofErr w:type="gramEnd"/>
+      <w:r>
+        <w:rPr>
+          <w:sz w:val="24"/>
+          <w:szCs w:val="22"/>
+          <w:lang w:val="en-US"/>
+        </w:rPr>
+        <w:t xml:space="preserve">) </w:t>
       </w:r>
       <w:r>
         <w:rPr>
@@ -11060,13 +11481,23 @@
           <w:lang w:val="en-US"/>
         </w:rPr>
       </w:pPr>
-      <w:r>
-        <w:rPr>
-          <w:sz w:val="24"/>
-          <w:szCs w:val="22"/>
-          <w:lang w:val="en-US"/>
-        </w:rPr>
-        <w:t xml:space="preserve">moveToElement() </w:t>
+      <w:proofErr w:type="gramStart"/>
+      <w:r>
+        <w:rPr>
+          <w:sz w:val="24"/>
+          <w:szCs w:val="22"/>
+          <w:lang w:val="en-US"/>
+        </w:rPr>
+        <w:t>moveToElement(</w:t>
+      </w:r>
+      <w:proofErr w:type="gramEnd"/>
+      <w:r>
+        <w:rPr>
+          <w:sz w:val="24"/>
+          <w:szCs w:val="22"/>
+          <w:lang w:val="en-US"/>
+        </w:rPr>
+        <w:t xml:space="preserve">) </w:t>
       </w:r>
       <w:r>
         <w:rPr>
@@ -11098,13 +11529,23 @@
           <w:lang w:val="en-US"/>
         </w:rPr>
       </w:pPr>
-      <w:r>
-        <w:rPr>
-          <w:sz w:val="24"/>
-          <w:szCs w:val="22"/>
-          <w:lang w:val="en-US"/>
-        </w:rPr>
-        <w:t xml:space="preserve">perform() </w:t>
+      <w:proofErr w:type="gramStart"/>
+      <w:r>
+        <w:rPr>
+          <w:sz w:val="24"/>
+          <w:szCs w:val="22"/>
+          <w:lang w:val="en-US"/>
+        </w:rPr>
+        <w:t>perform(</w:t>
+      </w:r>
+      <w:proofErr w:type="gramEnd"/>
+      <w:r>
+        <w:rPr>
+          <w:sz w:val="24"/>
+          <w:szCs w:val="22"/>
+          <w:lang w:val="en-US"/>
+        </w:rPr>
+        <w:t xml:space="preserve">) </w:t>
       </w:r>
       <w:r>
         <w:rPr>
@@ -11136,13 +11577,23 @@
           <w:lang w:val="en-US"/>
         </w:rPr>
       </w:pPr>
-      <w:r>
-        <w:rPr>
-          <w:sz w:val="24"/>
-          <w:szCs w:val="22"/>
-          <w:lang w:val="en-US"/>
-        </w:rPr>
-        <w:t xml:space="preserve">contextClick() </w:t>
+      <w:proofErr w:type="gramStart"/>
+      <w:r>
+        <w:rPr>
+          <w:sz w:val="24"/>
+          <w:szCs w:val="22"/>
+          <w:lang w:val="en-US"/>
+        </w:rPr>
+        <w:t>contextClick(</w:t>
+      </w:r>
+      <w:proofErr w:type="gramEnd"/>
+      <w:r>
+        <w:rPr>
+          <w:sz w:val="24"/>
+          <w:szCs w:val="22"/>
+          <w:lang w:val="en-US"/>
+        </w:rPr>
+        <w:t xml:space="preserve">) </w:t>
       </w:r>
       <w:r>
         <w:rPr>
@@ -11182,13 +11633,23 @@
           <w:lang w:val="en-US"/>
         </w:rPr>
       </w:pPr>
-      <w:r>
-        <w:rPr>
-          <w:sz w:val="24"/>
-          <w:szCs w:val="22"/>
-          <w:lang w:val="en-US"/>
-        </w:rPr>
-        <w:t xml:space="preserve">doubleClick() </w:t>
+      <w:proofErr w:type="gramStart"/>
+      <w:r>
+        <w:rPr>
+          <w:sz w:val="24"/>
+          <w:szCs w:val="22"/>
+          <w:lang w:val="en-US"/>
+        </w:rPr>
+        <w:t>doubleClick(</w:t>
+      </w:r>
+      <w:proofErr w:type="gramEnd"/>
+      <w:r>
+        <w:rPr>
+          <w:sz w:val="24"/>
+          <w:szCs w:val="22"/>
+          <w:lang w:val="en-US"/>
+        </w:rPr>
+        <w:t xml:space="preserve">) </w:t>
       </w:r>
       <w:r>
         <w:rPr>
@@ -11260,7 +11721,25 @@
           <w:szCs w:val="22"/>
           <w:lang w:val="en-US"/>
         </w:rPr>
-        <w:t>It is the testing framework that will make your automation testing more easy.</w:t>
+        <w:t xml:space="preserve">It is the testing framework that will make your automation testing more </w:t>
+      </w:r>
+      <w:proofErr w:type="gramStart"/>
+      <w:r>
+        <w:rPr>
+          <w:sz w:val="24"/>
+          <w:szCs w:val="22"/>
+          <w:lang w:val="en-US"/>
+        </w:rPr>
+        <w:t>easy</w:t>
+      </w:r>
+      <w:proofErr w:type="gramEnd"/>
+      <w:r>
+        <w:rPr>
+          <w:sz w:val="24"/>
+          <w:szCs w:val="22"/>
+          <w:lang w:val="en-US"/>
+        </w:rPr>
+        <w:t>.</w:t>
       </w:r>
     </w:p>
     <w:p>
@@ -13165,7 +13644,25 @@
           <w:szCs w:val="22"/>
           <w:lang w:val="en-US"/>
         </w:rPr>
-        <w:t>7 file in ooxml-lib folder</w:t>
+        <w:t xml:space="preserve">7 file in </w:t>
+      </w:r>
+      <w:proofErr w:type="spellStart"/>
+      <w:r>
+        <w:rPr>
+          <w:sz w:val="24"/>
+          <w:szCs w:val="22"/>
+          <w:lang w:val="en-US"/>
+        </w:rPr>
+        <w:t>ooxml</w:t>
+      </w:r>
+      <w:proofErr w:type="spellEnd"/>
+      <w:r>
+        <w:rPr>
+          <w:sz w:val="24"/>
+          <w:szCs w:val="22"/>
+          <w:lang w:val="en-US"/>
+        </w:rPr>
+        <w:t>-lib folder</w:t>
       </w:r>
     </w:p>
     <w:p>
@@ -13192,17 +13689,363 @@
     </w:p>
     <w:p>
       <w:pPr>
+        <w:rPr>
+          <w:sz w:val="24"/>
+          <w:szCs w:val="22"/>
+          <w:lang w:val="en-US"/>
+        </w:rPr>
+      </w:pPr>
+      <w:r>
+        <w:rPr>
+          <w:sz w:val="24"/>
+          <w:szCs w:val="22"/>
+          <w:lang w:val="en-US"/>
+        </w:rPr>
+        <w:br w:type="page"/>
+      </w:r>
+    </w:p>
+    <w:p>
+      <w:pPr>
+        <w:rPr>
+          <w:b/>
+          <w:bCs/>
+          <w:sz w:val="24"/>
+          <w:szCs w:val="22"/>
+          <w:lang w:val="en-US"/>
+        </w:rPr>
+      </w:pPr>
+      <w:r>
+        <w:rPr>
+          <w:b/>
+          <w:bCs/>
+          <w:sz w:val="24"/>
+          <w:szCs w:val="22"/>
+          <w:lang w:val="en-US"/>
+        </w:rPr>
+        <w:lastRenderedPageBreak/>
+        <w:t>Maven</w:t>
+      </w:r>
+    </w:p>
+    <w:p>
+      <w:pPr>
         <w:pStyle w:val="ListParagraph"/>
         <w:numPr>
           <w:ilvl w:val="0"/>
-          <w:numId w:val="35"/>
-        </w:numPr>
-        <w:rPr>
-          <w:sz w:val="24"/>
-          <w:szCs w:val="22"/>
-          <w:lang w:val="en-US"/>
-        </w:rPr>
-      </w:pPr>
+          <w:numId w:val="36"/>
+        </w:numPr>
+        <w:rPr>
+          <w:sz w:val="24"/>
+          <w:szCs w:val="22"/>
+          <w:lang w:val="en-US"/>
+        </w:rPr>
+      </w:pPr>
+      <w:r>
+        <w:rPr>
+          <w:sz w:val="24"/>
+          <w:szCs w:val="22"/>
+          <w:lang w:val="en-US"/>
+        </w:rPr>
+        <w:t>Build management tool</w:t>
+      </w:r>
+    </w:p>
+    <w:p>
+      <w:pPr>
+        <w:pStyle w:val="ListParagraph"/>
+        <w:numPr>
+          <w:ilvl w:val="0"/>
+          <w:numId w:val="36"/>
+        </w:numPr>
+        <w:rPr>
+          <w:sz w:val="24"/>
+          <w:szCs w:val="22"/>
+          <w:lang w:val="en-US"/>
+        </w:rPr>
+      </w:pPr>
+      <w:r>
+        <w:rPr>
+          <w:sz w:val="24"/>
+          <w:szCs w:val="22"/>
+          <w:lang w:val="en-US"/>
+        </w:rPr>
+        <w:t>It is Apache product</w:t>
+      </w:r>
+    </w:p>
+    <w:p>
+      <w:pPr>
+        <w:pStyle w:val="ListParagraph"/>
+        <w:numPr>
+          <w:ilvl w:val="0"/>
+          <w:numId w:val="36"/>
+        </w:numPr>
+        <w:rPr>
+          <w:sz w:val="24"/>
+          <w:szCs w:val="22"/>
+          <w:lang w:val="en-US"/>
+        </w:rPr>
+      </w:pPr>
+      <w:r>
+        <w:rPr>
+          <w:sz w:val="24"/>
+          <w:szCs w:val="22"/>
+          <w:lang w:val="en-US"/>
+        </w:rPr>
+        <w:t>Can be used by both developer and tester</w:t>
+      </w:r>
+    </w:p>
+    <w:p>
+      <w:pPr>
+        <w:pStyle w:val="ListParagraph"/>
+        <w:numPr>
+          <w:ilvl w:val="0"/>
+          <w:numId w:val="36"/>
+        </w:numPr>
+        <w:rPr>
+          <w:sz w:val="24"/>
+          <w:szCs w:val="22"/>
+          <w:lang w:val="en-US"/>
+        </w:rPr>
+      </w:pPr>
+      <w:r>
+        <w:rPr>
+          <w:sz w:val="24"/>
+          <w:szCs w:val="22"/>
+          <w:lang w:val="en-US"/>
+        </w:rPr>
+        <w:t>Single project can be used by both developer and tester</w:t>
+      </w:r>
+    </w:p>
+    <w:p>
+      <w:pPr>
+        <w:pStyle w:val="ListParagraph"/>
+        <w:numPr>
+          <w:ilvl w:val="0"/>
+          <w:numId w:val="36"/>
+        </w:numPr>
+        <w:rPr>
+          <w:sz w:val="24"/>
+          <w:szCs w:val="22"/>
+          <w:lang w:val="en-US"/>
+        </w:rPr>
+      </w:pPr>
+      <w:r>
+        <w:rPr>
+          <w:sz w:val="24"/>
+          <w:szCs w:val="22"/>
+          <w:lang w:val="en-US"/>
+        </w:rPr>
+        <w:t>Configuration is very easy via pom.xml (Project Object Model) file</w:t>
+      </w:r>
+    </w:p>
+    <w:p>
+      <w:pPr>
+        <w:pStyle w:val="ListParagraph"/>
+        <w:numPr>
+          <w:ilvl w:val="0"/>
+          <w:numId w:val="36"/>
+        </w:numPr>
+        <w:rPr>
+          <w:sz w:val="24"/>
+          <w:szCs w:val="22"/>
+          <w:lang w:val="en-US"/>
+        </w:rPr>
+      </w:pPr>
+      <w:r>
+        <w:rPr>
+          <w:sz w:val="24"/>
+          <w:szCs w:val="22"/>
+          <w:lang w:val="en-US"/>
+        </w:rPr>
+        <w:t>Uses dependencies instead of jar files</w:t>
+      </w:r>
+    </w:p>
+    <w:p>
+      <w:pPr>
+        <w:rPr>
+          <w:sz w:val="24"/>
+          <w:szCs w:val="22"/>
+          <w:lang w:val="en-US"/>
+        </w:rPr>
+      </w:pPr>
+    </w:p>
+    <w:p>
+      <w:pPr>
+        <w:rPr>
+          <w:b/>
+          <w:bCs/>
+          <w:sz w:val="24"/>
+          <w:szCs w:val="22"/>
+          <w:lang w:val="en-US"/>
+        </w:rPr>
+      </w:pPr>
+      <w:r>
+        <w:rPr>
+          <w:b/>
+          <w:bCs/>
+          <w:sz w:val="24"/>
+          <w:szCs w:val="22"/>
+          <w:lang w:val="en-US"/>
+        </w:rPr>
+        <w:t>Creating Maven Project</w:t>
+      </w:r>
+    </w:p>
+    <w:p>
+      <w:pPr>
+        <w:pStyle w:val="ListParagraph"/>
+        <w:numPr>
+          <w:ilvl w:val="0"/>
+          <w:numId w:val="37"/>
+        </w:numPr>
+        <w:rPr>
+          <w:sz w:val="24"/>
+          <w:szCs w:val="22"/>
+          <w:lang w:val="en-US"/>
+        </w:rPr>
+      </w:pPr>
+      <w:r>
+        <w:rPr>
+          <w:sz w:val="24"/>
+          <w:szCs w:val="22"/>
+          <w:lang w:val="en-US"/>
+        </w:rPr>
+        <w:t xml:space="preserve">File menu </w:t>
+      </w:r>
+      <w:r>
+        <w:rPr>
+          <w:sz w:val="24"/>
+          <w:szCs w:val="22"/>
+          <w:lang w:val="en-US"/>
+        </w:rPr>
+        <w:sym w:font="Wingdings" w:char="F0E0"/>
+      </w:r>
+      <w:r>
+        <w:rPr>
+          <w:sz w:val="24"/>
+          <w:szCs w:val="22"/>
+          <w:lang w:val="en-US"/>
+        </w:rPr>
+        <w:t xml:space="preserve"> New </w:t>
+      </w:r>
+      <w:r>
+        <w:rPr>
+          <w:sz w:val="24"/>
+          <w:szCs w:val="22"/>
+          <w:lang w:val="en-US"/>
+        </w:rPr>
+        <w:sym w:font="Wingdings" w:char="F0E0"/>
+      </w:r>
+      <w:r>
+        <w:rPr>
+          <w:sz w:val="24"/>
+          <w:szCs w:val="22"/>
+          <w:lang w:val="en-US"/>
+        </w:rPr>
+        <w:t xml:space="preserve"> Maven Project</w:t>
+      </w:r>
+    </w:p>
+    <w:p>
+      <w:pPr>
+        <w:pStyle w:val="ListParagraph"/>
+        <w:numPr>
+          <w:ilvl w:val="0"/>
+          <w:numId w:val="37"/>
+        </w:numPr>
+        <w:rPr>
+          <w:sz w:val="24"/>
+          <w:szCs w:val="22"/>
+          <w:lang w:val="en-US"/>
+        </w:rPr>
+      </w:pPr>
+      <w:r>
+        <w:rPr>
+          <w:sz w:val="24"/>
+          <w:szCs w:val="22"/>
+          <w:lang w:val="en-US"/>
+        </w:rPr>
+        <w:t>Select 1</w:t>
+      </w:r>
+      <w:r>
+        <w:rPr>
+          <w:sz w:val="24"/>
+          <w:szCs w:val="22"/>
+          <w:vertAlign w:val="superscript"/>
+          <w:lang w:val="en-US"/>
+        </w:rPr>
+        <w:t>st</w:t>
+      </w:r>
+      <w:r>
+        <w:rPr>
+          <w:sz w:val="24"/>
+          <w:szCs w:val="22"/>
+          <w:lang w:val="en-US"/>
+        </w:rPr>
+        <w:t xml:space="preserve"> Checkbox (Create a simple project)</w:t>
+      </w:r>
+    </w:p>
+    <w:p>
+      <w:pPr>
+        <w:pStyle w:val="ListParagraph"/>
+        <w:numPr>
+          <w:ilvl w:val="0"/>
+          <w:numId w:val="37"/>
+        </w:numPr>
+        <w:rPr>
+          <w:sz w:val="24"/>
+          <w:szCs w:val="22"/>
+          <w:lang w:val="en-US"/>
+        </w:rPr>
+      </w:pPr>
+      <w:r>
+        <w:rPr>
+          <w:sz w:val="24"/>
+          <w:szCs w:val="22"/>
+          <w:lang w:val="en-US"/>
+        </w:rPr>
+        <w:t>Click on Next button</w:t>
+      </w:r>
+    </w:p>
+    <w:p>
+      <w:pPr>
+        <w:pStyle w:val="ListParagraph"/>
+        <w:numPr>
+          <w:ilvl w:val="0"/>
+          <w:numId w:val="37"/>
+        </w:numPr>
+        <w:rPr>
+          <w:sz w:val="24"/>
+          <w:szCs w:val="22"/>
+          <w:lang w:val="en-US"/>
+        </w:rPr>
+      </w:pPr>
+      <w:r>
+        <w:rPr>
+          <w:sz w:val="24"/>
+          <w:szCs w:val="22"/>
+          <w:lang w:val="en-US"/>
+        </w:rPr>
+        <w:t>Give group id and artifact id (Both should be same)</w:t>
+      </w:r>
+    </w:p>
+    <w:p>
+      <w:pPr>
+        <w:pStyle w:val="ListParagraph"/>
+        <w:numPr>
+          <w:ilvl w:val="0"/>
+          <w:numId w:val="37"/>
+        </w:numPr>
+        <w:rPr>
+          <w:sz w:val="24"/>
+          <w:szCs w:val="22"/>
+          <w:lang w:val="en-US"/>
+        </w:rPr>
+      </w:pPr>
+      <w:r>
+        <w:rPr>
+          <w:sz w:val="24"/>
+          <w:szCs w:val="22"/>
+          <w:lang w:val="en-US"/>
+        </w:rPr>
+        <w:t>Click on Finish</w:t>
+      </w:r>
       <w:bookmarkStart w:id="0" w:name="_GoBack"/>
       <w:bookmarkEnd w:id="0"/>
     </w:p>
@@ -14318,6 +15161,95 @@
     </w:lvl>
   </w:abstractNum>
   <w:abstractNum w:abstractNumId="11">
+    <w:nsid w:val="2CB43F4A"/>
+    <w:multiLevelType w:val="hybridMultilevel"/>
+    <w:tmpl w:val="6C80E6C4"/>
+    <w:lvl w:ilvl="0" w:tplc="4009000F">
+      <w:start w:val="1"/>
+      <w:numFmt w:val="decimal"/>
+      <w:lvlText w:val="%1."/>
+      <w:lvlJc w:val="left"/>
+      <w:pPr>
+        <w:ind w:left="720" w:hanging="360"/>
+      </w:pPr>
+      <w:rPr>
+        <w:rFonts w:hint="default"/>
+      </w:rPr>
+    </w:lvl>
+    <w:lvl w:ilvl="1" w:tplc="40090019" w:tentative="1">
+      <w:start w:val="1"/>
+      <w:numFmt w:val="lowerLetter"/>
+      <w:lvlText w:val="%2."/>
+      <w:lvlJc w:val="left"/>
+      <w:pPr>
+        <w:ind w:left="1440" w:hanging="360"/>
+      </w:pPr>
+    </w:lvl>
+    <w:lvl w:ilvl="2" w:tplc="4009001B" w:tentative="1">
+      <w:start w:val="1"/>
+      <w:numFmt w:val="lowerRoman"/>
+      <w:lvlText w:val="%3."/>
+      <w:lvlJc w:val="right"/>
+      <w:pPr>
+        <w:ind w:left="2160" w:hanging="180"/>
+      </w:pPr>
+    </w:lvl>
+    <w:lvl w:ilvl="3" w:tplc="4009000F" w:tentative="1">
+      <w:start w:val="1"/>
+      <w:numFmt w:val="decimal"/>
+      <w:lvlText w:val="%4."/>
+      <w:lvlJc w:val="left"/>
+      <w:pPr>
+        <w:ind w:left="2880" w:hanging="360"/>
+      </w:pPr>
+    </w:lvl>
+    <w:lvl w:ilvl="4" w:tplc="40090019" w:tentative="1">
+      <w:start w:val="1"/>
+      <w:numFmt w:val="lowerLetter"/>
+      <w:lvlText w:val="%5."/>
+      <w:lvlJc w:val="left"/>
+      <w:pPr>
+        <w:ind w:left="3600" w:hanging="360"/>
+      </w:pPr>
+    </w:lvl>
+    <w:lvl w:ilvl="5" w:tplc="4009001B" w:tentative="1">
+      <w:start w:val="1"/>
+      <w:numFmt w:val="lowerRoman"/>
+      <w:lvlText w:val="%6."/>
+      <w:lvlJc w:val="right"/>
+      <w:pPr>
+        <w:ind w:left="4320" w:hanging="180"/>
+      </w:pPr>
+    </w:lvl>
+    <w:lvl w:ilvl="6" w:tplc="4009000F" w:tentative="1">
+      <w:start w:val="1"/>
+      <w:numFmt w:val="decimal"/>
+      <w:lvlText w:val="%7."/>
+      <w:lvlJc w:val="left"/>
+      <w:pPr>
+        <w:ind w:left="5040" w:hanging="360"/>
+      </w:pPr>
+    </w:lvl>
+    <w:lvl w:ilvl="7" w:tplc="40090019" w:tentative="1">
+      <w:start w:val="1"/>
+      <w:numFmt w:val="lowerLetter"/>
+      <w:lvlText w:val="%8."/>
+      <w:lvlJc w:val="left"/>
+      <w:pPr>
+        <w:ind w:left="5760" w:hanging="360"/>
+      </w:pPr>
+    </w:lvl>
+    <w:lvl w:ilvl="8" w:tplc="4009001B" w:tentative="1">
+      <w:start w:val="1"/>
+      <w:numFmt w:val="lowerRoman"/>
+      <w:lvlText w:val="%9."/>
+      <w:lvlJc w:val="right"/>
+      <w:pPr>
+        <w:ind w:left="6480" w:hanging="180"/>
+      </w:pPr>
+    </w:lvl>
+  </w:abstractNum>
+  <w:abstractNum w:abstractNumId="12">
     <w:nsid w:val="34F71AA3"/>
     <w:multiLevelType w:val="hybridMultilevel"/>
     <w:tmpl w:val="F71EF04C"/>
@@ -14430,7 +15362,7 @@
       </w:rPr>
     </w:lvl>
   </w:abstractNum>
-  <w:abstractNum w:abstractNumId="12">
+  <w:abstractNum w:abstractNumId="13">
     <w:nsid w:val="44443626"/>
     <w:multiLevelType w:val="hybridMultilevel"/>
     <w:tmpl w:val="3A38E55E"/>
@@ -14543,7 +15475,7 @@
       </w:rPr>
     </w:lvl>
   </w:abstractNum>
-  <w:abstractNum w:abstractNumId="13">
+  <w:abstractNum w:abstractNumId="14">
     <w:nsid w:val="4BCF165C"/>
     <w:multiLevelType w:val="hybridMultilevel"/>
     <w:tmpl w:val="E7067116"/>
@@ -14629,7 +15561,7 @@
       </w:pPr>
     </w:lvl>
   </w:abstractNum>
-  <w:abstractNum w:abstractNumId="14">
+  <w:abstractNum w:abstractNumId="15">
     <w:nsid w:val="4D934839"/>
     <w:multiLevelType w:val="hybridMultilevel"/>
     <w:tmpl w:val="66E021E4"/>
@@ -14718,7 +15650,7 @@
       </w:pPr>
     </w:lvl>
   </w:abstractNum>
-  <w:abstractNum w:abstractNumId="15">
+  <w:abstractNum w:abstractNumId="16">
     <w:nsid w:val="520668FC"/>
     <w:multiLevelType w:val="hybridMultilevel"/>
     <w:tmpl w:val="A4F835F0"/>
@@ -14831,7 +15763,7 @@
       </w:rPr>
     </w:lvl>
   </w:abstractNum>
-  <w:abstractNum w:abstractNumId="16">
+  <w:abstractNum w:abstractNumId="17">
     <w:nsid w:val="542B3911"/>
     <w:multiLevelType w:val="hybridMultilevel"/>
     <w:tmpl w:val="FF9249A0"/>
@@ -14944,7 +15876,7 @@
       </w:rPr>
     </w:lvl>
   </w:abstractNum>
-  <w:abstractNum w:abstractNumId="17">
+  <w:abstractNum w:abstractNumId="18">
     <w:nsid w:val="571D3B3E"/>
     <w:multiLevelType w:val="hybridMultilevel"/>
     <w:tmpl w:val="CF98A6CE"/>
@@ -15057,7 +15989,7 @@
       </w:rPr>
     </w:lvl>
   </w:abstractNum>
-  <w:abstractNum w:abstractNumId="18">
+  <w:abstractNum w:abstractNumId="19">
     <w:nsid w:val="5DA53D78"/>
     <w:multiLevelType w:val="hybridMultilevel"/>
     <w:tmpl w:val="25D4A350"/>
@@ -15146,7 +16078,7 @@
       </w:pPr>
     </w:lvl>
   </w:abstractNum>
-  <w:abstractNum w:abstractNumId="19">
+  <w:abstractNum w:abstractNumId="20">
     <w:nsid w:val="5F4B1933"/>
     <w:multiLevelType w:val="hybridMultilevel"/>
     <w:tmpl w:val="B9F8D93A"/>
@@ -15259,7 +16191,7 @@
       </w:rPr>
     </w:lvl>
   </w:abstractNum>
-  <w:abstractNum w:abstractNumId="20">
+  <w:abstractNum w:abstractNumId="21">
     <w:nsid w:val="5F5160CF"/>
     <w:multiLevelType w:val="hybridMultilevel"/>
     <w:tmpl w:val="CFEE6708"/>
@@ -15372,7 +16304,7 @@
       </w:rPr>
     </w:lvl>
   </w:abstractNum>
-  <w:abstractNum w:abstractNumId="21">
+  <w:abstractNum w:abstractNumId="22">
     <w:nsid w:val="611C3CE1"/>
     <w:multiLevelType w:val="hybridMultilevel"/>
     <w:tmpl w:val="861A04FE"/>
@@ -15461,7 +16393,7 @@
       </w:pPr>
     </w:lvl>
   </w:abstractNum>
-  <w:abstractNum w:abstractNumId="22">
+  <w:abstractNum w:abstractNumId="23">
     <w:nsid w:val="61ED0FA8"/>
     <w:multiLevelType w:val="hybridMultilevel"/>
     <w:tmpl w:val="70CCDFC4"/>
@@ -15550,7 +16482,7 @@
       </w:pPr>
     </w:lvl>
   </w:abstractNum>
-  <w:abstractNum w:abstractNumId="23">
+  <w:abstractNum w:abstractNumId="24">
     <w:nsid w:val="64CF3846"/>
     <w:multiLevelType w:val="hybridMultilevel"/>
     <w:tmpl w:val="13ACF5F6"/>
@@ -15663,7 +16595,7 @@
       </w:rPr>
     </w:lvl>
   </w:abstractNum>
-  <w:abstractNum w:abstractNumId="24">
+  <w:abstractNum w:abstractNumId="25">
     <w:nsid w:val="679919C6"/>
     <w:multiLevelType w:val="hybridMultilevel"/>
     <w:tmpl w:val="D8C8FD88"/>
@@ -15776,7 +16708,120 @@
       </w:rPr>
     </w:lvl>
   </w:abstractNum>
-  <w:abstractNum w:abstractNumId="25">
+  <w:abstractNum w:abstractNumId="26">
+    <w:nsid w:val="6AEF2B37"/>
+    <w:multiLevelType w:val="hybridMultilevel"/>
+    <w:tmpl w:val="3D182D9A"/>
+    <w:lvl w:ilvl="0" w:tplc="40090001">
+      <w:start w:val="1"/>
+      <w:numFmt w:val="bullet"/>
+      <w:lvlText w:val=""/>
+      <w:lvlJc w:val="left"/>
+      <w:pPr>
+        <w:ind w:left="720" w:hanging="360"/>
+      </w:pPr>
+      <w:rPr>
+        <w:rFonts w:ascii="Symbol" w:hAnsi="Symbol" w:hint="default"/>
+      </w:rPr>
+    </w:lvl>
+    <w:lvl w:ilvl="1" w:tplc="40090003" w:tentative="1">
+      <w:start w:val="1"/>
+      <w:numFmt w:val="bullet"/>
+      <w:lvlText w:val="o"/>
+      <w:lvlJc w:val="left"/>
+      <w:pPr>
+        <w:ind w:left="1440" w:hanging="360"/>
+      </w:pPr>
+      <w:rPr>
+        <w:rFonts w:ascii="Courier New" w:hAnsi="Courier New" w:cs="Courier New" w:hint="default"/>
+      </w:rPr>
+    </w:lvl>
+    <w:lvl w:ilvl="2" w:tplc="40090005" w:tentative="1">
+      <w:start w:val="1"/>
+      <w:numFmt w:val="bullet"/>
+      <w:lvlText w:val=""/>
+      <w:lvlJc w:val="left"/>
+      <w:pPr>
+        <w:ind w:left="2160" w:hanging="360"/>
+      </w:pPr>
+      <w:rPr>
+        <w:rFonts w:ascii="Wingdings" w:hAnsi="Wingdings" w:hint="default"/>
+      </w:rPr>
+    </w:lvl>
+    <w:lvl w:ilvl="3" w:tplc="40090001" w:tentative="1">
+      <w:start w:val="1"/>
+      <w:numFmt w:val="bullet"/>
+      <w:lvlText w:val=""/>
+      <w:lvlJc w:val="left"/>
+      <w:pPr>
+        <w:ind w:left="2880" w:hanging="360"/>
+      </w:pPr>
+      <w:rPr>
+        <w:rFonts w:ascii="Symbol" w:hAnsi="Symbol" w:hint="default"/>
+      </w:rPr>
+    </w:lvl>
+    <w:lvl w:ilvl="4" w:tplc="40090003" w:tentative="1">
+      <w:start w:val="1"/>
+      <w:numFmt w:val="bullet"/>
+      <w:lvlText w:val="o"/>
+      <w:lvlJc w:val="left"/>
+      <w:pPr>
+        <w:ind w:left="3600" w:hanging="360"/>
+      </w:pPr>
+      <w:rPr>
+        <w:rFonts w:ascii="Courier New" w:hAnsi="Courier New" w:cs="Courier New" w:hint="default"/>
+      </w:rPr>
+    </w:lvl>
+    <w:lvl w:ilvl="5" w:tplc="40090005" w:tentative="1">
+      <w:start w:val="1"/>
+      <w:numFmt w:val="bullet"/>
+      <w:lvlText w:val=""/>
+      <w:lvlJc w:val="left"/>
+      <w:pPr>
+        <w:ind w:left="4320" w:hanging="360"/>
+      </w:pPr>
+      <w:rPr>
+        <w:rFonts w:ascii="Wingdings" w:hAnsi="Wingdings" w:hint="default"/>
+      </w:rPr>
+    </w:lvl>
+    <w:lvl w:ilvl="6" w:tplc="40090001" w:tentative="1">
+      <w:start w:val="1"/>
+      <w:numFmt w:val="bullet"/>
+      <w:lvlText w:val=""/>
+      <w:lvlJc w:val="left"/>
+      <w:pPr>
+        <w:ind w:left="5040" w:hanging="360"/>
+      </w:pPr>
+      <w:rPr>
+        <w:rFonts w:ascii="Symbol" w:hAnsi="Symbol" w:hint="default"/>
+      </w:rPr>
+    </w:lvl>
+    <w:lvl w:ilvl="7" w:tplc="40090003" w:tentative="1">
+      <w:start w:val="1"/>
+      <w:numFmt w:val="bullet"/>
+      <w:lvlText w:val="o"/>
+      <w:lvlJc w:val="left"/>
+      <w:pPr>
+        <w:ind w:left="5760" w:hanging="360"/>
+      </w:pPr>
+      <w:rPr>
+        <w:rFonts w:ascii="Courier New" w:hAnsi="Courier New" w:cs="Courier New" w:hint="default"/>
+      </w:rPr>
+    </w:lvl>
+    <w:lvl w:ilvl="8" w:tplc="40090005" w:tentative="1">
+      <w:start w:val="1"/>
+      <w:numFmt w:val="bullet"/>
+      <w:lvlText w:val=""/>
+      <w:lvlJc w:val="left"/>
+      <w:pPr>
+        <w:ind w:left="6480" w:hanging="360"/>
+      </w:pPr>
+      <w:rPr>
+        <w:rFonts w:ascii="Wingdings" w:hAnsi="Wingdings" w:hint="default"/>
+      </w:rPr>
+    </w:lvl>
+  </w:abstractNum>
+  <w:abstractNum w:abstractNumId="27">
     <w:nsid w:val="6D8557E4"/>
     <w:multiLevelType w:val="hybridMultilevel"/>
     <w:tmpl w:val="0A1AF8D0"/>
@@ -15889,7 +16934,7 @@
       </w:rPr>
     </w:lvl>
   </w:abstractNum>
-  <w:abstractNum w:abstractNumId="26">
+  <w:abstractNum w:abstractNumId="28">
     <w:nsid w:val="6E087545"/>
     <w:multiLevelType w:val="hybridMultilevel"/>
     <w:tmpl w:val="68B8BE2E"/>
@@ -15978,7 +17023,7 @@
       </w:pPr>
     </w:lvl>
   </w:abstractNum>
-  <w:abstractNum w:abstractNumId="27">
+  <w:abstractNum w:abstractNumId="29">
     <w:nsid w:val="712436B2"/>
     <w:multiLevelType w:val="hybridMultilevel"/>
     <w:tmpl w:val="7DB88F34"/>
@@ -16091,7 +17136,7 @@
       </w:rPr>
     </w:lvl>
   </w:abstractNum>
-  <w:abstractNum w:abstractNumId="28">
+  <w:abstractNum w:abstractNumId="30">
     <w:nsid w:val="716327C1"/>
     <w:multiLevelType w:val="hybridMultilevel"/>
     <w:tmpl w:val="BF34ABA8"/>
@@ -16204,7 +17249,7 @@
       </w:rPr>
     </w:lvl>
   </w:abstractNum>
-  <w:abstractNum w:abstractNumId="29">
+  <w:abstractNum w:abstractNumId="31">
     <w:nsid w:val="73BF2B49"/>
     <w:multiLevelType w:val="hybridMultilevel"/>
     <w:tmpl w:val="8E56E800"/>
@@ -16317,7 +17362,7 @@
       </w:rPr>
     </w:lvl>
   </w:abstractNum>
-  <w:abstractNum w:abstractNumId="30">
+  <w:abstractNum w:abstractNumId="32">
     <w:nsid w:val="75371497"/>
     <w:multiLevelType w:val="hybridMultilevel"/>
     <w:tmpl w:val="1D686274"/>
@@ -16430,7 +17475,7 @@
       </w:rPr>
     </w:lvl>
   </w:abstractNum>
-  <w:abstractNum w:abstractNumId="31">
+  <w:abstractNum w:abstractNumId="33">
     <w:nsid w:val="7A65502B"/>
     <w:multiLevelType w:val="hybridMultilevel"/>
     <w:tmpl w:val="763EAD76"/>
@@ -16543,7 +17588,7 @@
       </w:rPr>
     </w:lvl>
   </w:abstractNum>
-  <w:abstractNum w:abstractNumId="32">
+  <w:abstractNum w:abstractNumId="34">
     <w:nsid w:val="7CC327AE"/>
     <w:multiLevelType w:val="hybridMultilevel"/>
     <w:tmpl w:val="FD60D564"/>
@@ -16656,7 +17701,7 @@
       </w:rPr>
     </w:lvl>
   </w:abstractNum>
-  <w:abstractNum w:abstractNumId="33">
+  <w:abstractNum w:abstractNumId="35">
     <w:nsid w:val="7D476BBC"/>
     <w:multiLevelType w:val="hybridMultilevel"/>
     <w:tmpl w:val="B360ED0C"/>
@@ -16769,7 +17814,7 @@
       </w:rPr>
     </w:lvl>
   </w:abstractNum>
-  <w:abstractNum w:abstractNumId="34">
+  <w:abstractNum w:abstractNumId="36">
     <w:nsid w:val="7FF367B4"/>
     <w:multiLevelType w:val="hybridMultilevel"/>
     <w:tmpl w:val="3DDC9BF0"/>
@@ -16886,91 +17931,91 @@
     <w:abstractNumId w:val="1"/>
   </w:num>
   <w:num w:numId="2">
-    <w:abstractNumId w:val="17"/>
+    <w:abstractNumId w:val="18"/>
   </w:num>
   <w:num w:numId="3">
-    <w:abstractNumId w:val="23"/>
+    <w:abstractNumId w:val="24"/>
   </w:num>
   <w:num w:numId="4">
-    <w:abstractNumId w:val="29"/>
+    <w:abstractNumId w:val="31"/>
   </w:num>
   <w:num w:numId="5">
     <w:abstractNumId w:val="10"/>
   </w:num>
   <w:num w:numId="6">
-    <w:abstractNumId w:val="27"/>
+    <w:abstractNumId w:val="29"/>
   </w:num>
   <w:num w:numId="7">
-    <w:abstractNumId w:val="34"/>
+    <w:abstractNumId w:val="36"/>
   </w:num>
   <w:num w:numId="8">
-    <w:abstractNumId w:val="12"/>
+    <w:abstractNumId w:val="13"/>
   </w:num>
   <w:num w:numId="9">
-    <w:abstractNumId w:val="19"/>
+    <w:abstractNumId w:val="20"/>
   </w:num>
   <w:num w:numId="10">
     <w:abstractNumId w:val="8"/>
   </w:num>
   <w:num w:numId="11">
-    <w:abstractNumId w:val="15"/>
+    <w:abstractNumId w:val="16"/>
   </w:num>
   <w:num w:numId="12">
     <w:abstractNumId w:val="5"/>
   </w:num>
   <w:num w:numId="13">
-    <w:abstractNumId w:val="13"/>
+    <w:abstractNumId w:val="14"/>
   </w:num>
   <w:num w:numId="14">
-    <w:abstractNumId w:val="26"/>
+    <w:abstractNumId w:val="28"/>
   </w:num>
   <w:num w:numId="15">
     <w:abstractNumId w:val="2"/>
   </w:num>
   <w:num w:numId="16">
-    <w:abstractNumId w:val="14"/>
+    <w:abstractNumId w:val="15"/>
   </w:num>
   <w:num w:numId="17">
-    <w:abstractNumId w:val="31"/>
+    <w:abstractNumId w:val="33"/>
   </w:num>
   <w:num w:numId="18">
-    <w:abstractNumId w:val="24"/>
+    <w:abstractNumId w:val="25"/>
   </w:num>
   <w:num w:numId="19">
-    <w:abstractNumId w:val="22"/>
+    <w:abstractNumId w:val="23"/>
   </w:num>
   <w:num w:numId="20">
     <w:abstractNumId w:val="7"/>
   </w:num>
   <w:num w:numId="21">
-    <w:abstractNumId w:val="25"/>
+    <w:abstractNumId w:val="27"/>
   </w:num>
   <w:num w:numId="22">
-    <w:abstractNumId w:val="32"/>
+    <w:abstractNumId w:val="34"/>
   </w:num>
   <w:num w:numId="23">
-    <w:abstractNumId w:val="18"/>
+    <w:abstractNumId w:val="19"/>
   </w:num>
   <w:num w:numId="24">
-    <w:abstractNumId w:val="21"/>
+    <w:abstractNumId w:val="22"/>
   </w:num>
   <w:num w:numId="25">
     <w:abstractNumId w:val="6"/>
   </w:num>
   <w:num w:numId="26">
-    <w:abstractNumId w:val="33"/>
+    <w:abstractNumId w:val="35"/>
   </w:num>
   <w:num w:numId="27">
-    <w:abstractNumId w:val="16"/>
+    <w:abstractNumId w:val="17"/>
   </w:num>
   <w:num w:numId="28">
     <w:abstractNumId w:val="4"/>
   </w:num>
   <w:num w:numId="29">
-    <w:abstractNumId w:val="20"/>
+    <w:abstractNumId w:val="21"/>
   </w:num>
   <w:num w:numId="30">
-    <w:abstractNumId w:val="30"/>
+    <w:abstractNumId w:val="32"/>
   </w:num>
   <w:num w:numId="31">
     <w:abstractNumId w:val="3"/>
@@ -16979,12 +18024,18 @@
     <w:abstractNumId w:val="9"/>
   </w:num>
   <w:num w:numId="33">
-    <w:abstractNumId w:val="28"/>
+    <w:abstractNumId w:val="30"/>
   </w:num>
   <w:num w:numId="34">
     <w:abstractNumId w:val="0"/>
   </w:num>
   <w:num w:numId="35">
+    <w:abstractNumId w:val="12"/>
+  </w:num>
+  <w:num w:numId="36">
+    <w:abstractNumId w:val="26"/>
+  </w:num>
+  <w:num w:numId="37">
     <w:abstractNumId w:val="11"/>
   </w:num>
 </w:numbering>
@@ -18566,31 +19617,31 @@
     </dgm:pt>
   </dgm:ptLst>
   <dgm:cxnLst>
-    <dgm:cxn modelId="{389696C3-8CBD-4016-BDE6-25F9772CDFE8}" type="presOf" srcId="{9C4D6193-4800-45DB-9EB9-DA2277B5D91B}" destId="{B8DA0D4A-E19E-4233-86B3-A96400569C53}" srcOrd="1" destOrd="0" presId="urn:microsoft.com/office/officeart/2005/8/layout/process1"/>
-    <dgm:cxn modelId="{9FBBF753-6D0B-4047-BC69-4EFA550D0192}" type="presOf" srcId="{9C4D6193-4800-45DB-9EB9-DA2277B5D91B}" destId="{374ED80F-5E6F-4A85-B95B-4BA99538042E}" srcOrd="0" destOrd="0" presId="urn:microsoft.com/office/officeart/2005/8/layout/process1"/>
-    <dgm:cxn modelId="{75335A9B-CDC5-43C1-A15A-5020030D042B}" type="presOf" srcId="{9EE1A18E-AD2D-415E-8996-B35207C41ED0}" destId="{B9FC173B-3430-402C-9BFA-D498C62BCC2D}" srcOrd="0" destOrd="0" presId="urn:microsoft.com/office/officeart/2005/8/layout/process1"/>
-    <dgm:cxn modelId="{47284EC3-6841-4F75-8C06-5983BF33BC4E}" type="presOf" srcId="{5AAB36AD-884F-4169-9EAA-81A3D87ABCFA}" destId="{AB8F05C3-3669-4AF7-9C79-08939721A716}" srcOrd="0" destOrd="0" presId="urn:microsoft.com/office/officeart/2005/8/layout/process1"/>
-    <dgm:cxn modelId="{DDA0EBF2-2CEA-4B58-B4EC-A52BE1DB3D64}" type="presOf" srcId="{214208B8-431D-481C-9A4C-228B7308ADA8}" destId="{C789FCC9-4717-4FFC-BA71-F98E7B1B3115}" srcOrd="0" destOrd="0" presId="urn:microsoft.com/office/officeart/2005/8/layout/process1"/>
+    <dgm:cxn modelId="{B151CA70-0406-48D6-8013-3F7D288766AD}" srcId="{9EE1A18E-AD2D-415E-8996-B35207C41ED0}" destId="{5AAB36AD-884F-4169-9EAA-81A3D87ABCFA}" srcOrd="0" destOrd="0" parTransId="{4796A0B2-FD04-4D0D-B4E3-6A8EB9A6D74D}" sibTransId="{9C4D6193-4800-45DB-9EB9-DA2277B5D91B}"/>
+    <dgm:cxn modelId="{9942EED7-A780-412A-BC1D-0BFE41F6B6C6}" type="presOf" srcId="{7201A391-9828-4B1D-A3C1-894234D041DB}" destId="{FDD593C1-9D9B-40ED-8C6D-5142CB0F0E3E}" srcOrd="1" destOrd="0" presId="urn:microsoft.com/office/officeart/2005/8/layout/process1"/>
+    <dgm:cxn modelId="{D4D3BF10-F46E-4626-9C79-493D4EC207C4}" type="presOf" srcId="{BF4790F6-D1AA-430E-85BA-C07F91D009F2}" destId="{485EB252-98AF-4CC0-A401-D9A154AAFC53}" srcOrd="0" destOrd="0" presId="urn:microsoft.com/office/officeart/2005/8/layout/process1"/>
+    <dgm:cxn modelId="{739C5785-E52F-47CE-9F40-D6F190D960B1}" type="presOf" srcId="{214208B8-431D-481C-9A4C-228B7308ADA8}" destId="{5D4876CA-733D-4DFD-8E79-4A3DBC7C7C6B}" srcOrd="1" destOrd="0" presId="urn:microsoft.com/office/officeart/2005/8/layout/process1"/>
+    <dgm:cxn modelId="{39F27088-F2FF-4B1E-85B8-75E4A5853051}" srcId="{9EE1A18E-AD2D-415E-8996-B35207C41ED0}" destId="{EF5675B6-38BA-4455-BA87-E62399D49989}" srcOrd="2" destOrd="0" parTransId="{B9F702AD-11CA-445A-BE84-AFE50ED28D23}" sibTransId="{7201A391-9828-4B1D-A3C1-894234D041DB}"/>
+    <dgm:cxn modelId="{6813F01F-BCA6-433A-A5FC-F474C1556494}" type="presOf" srcId="{BF8C77AF-CFF1-4B53-B009-D4E001D240D6}" destId="{D0DFB2B8-5022-4762-AA62-9B0CF1B32B60}" srcOrd="0" destOrd="0" presId="urn:microsoft.com/office/officeart/2005/8/layout/process1"/>
+    <dgm:cxn modelId="{30992B70-82A4-424E-91AF-1147538872AC}" type="presOf" srcId="{EF5675B6-38BA-4455-BA87-E62399D49989}" destId="{DEB61738-BCA0-4546-95CF-970A62665FC2}" srcOrd="0" destOrd="0" presId="urn:microsoft.com/office/officeart/2005/8/layout/process1"/>
+    <dgm:cxn modelId="{37D46F2E-E72F-4F26-92BB-FF51AEA1A68C}" type="presOf" srcId="{5AAB36AD-884F-4169-9EAA-81A3D87ABCFA}" destId="{AB8F05C3-3669-4AF7-9C79-08939721A716}" srcOrd="0" destOrd="0" presId="urn:microsoft.com/office/officeart/2005/8/layout/process1"/>
+    <dgm:cxn modelId="{4D1B4854-AE2E-470B-9115-BD099FD5799A}" srcId="{9EE1A18E-AD2D-415E-8996-B35207C41ED0}" destId="{BF4790F6-D1AA-430E-85BA-C07F91D009F2}" srcOrd="1" destOrd="0" parTransId="{974B1A63-8714-4E97-A93F-006B83F9DBF3}" sibTransId="{214208B8-431D-481C-9A4C-228B7308ADA8}"/>
+    <dgm:cxn modelId="{DF97119E-404F-41A3-A40C-CC27DBCB1F74}" type="presOf" srcId="{7201A391-9828-4B1D-A3C1-894234D041DB}" destId="{05A02C9E-6432-4B6A-91B3-E0BA65A6B1AE}" srcOrd="0" destOrd="0" presId="urn:microsoft.com/office/officeart/2005/8/layout/process1"/>
+    <dgm:cxn modelId="{108A60D7-1348-4687-9E6A-43491383B280}" type="presOf" srcId="{9C4D6193-4800-45DB-9EB9-DA2277B5D91B}" destId="{374ED80F-5E6F-4A85-B95B-4BA99538042E}" srcOrd="0" destOrd="0" presId="urn:microsoft.com/office/officeart/2005/8/layout/process1"/>
+    <dgm:cxn modelId="{FCA0B1E5-3ADD-4A5F-B99C-0457CBEBF3BA}" type="presOf" srcId="{9C4D6193-4800-45DB-9EB9-DA2277B5D91B}" destId="{B8DA0D4A-E19E-4233-86B3-A96400569C53}" srcOrd="1" destOrd="0" presId="urn:microsoft.com/office/officeart/2005/8/layout/process1"/>
+    <dgm:cxn modelId="{499C68D6-0875-44E0-920B-94B4F6F0A39E}" type="presOf" srcId="{214208B8-431D-481C-9A4C-228B7308ADA8}" destId="{C789FCC9-4717-4FFC-BA71-F98E7B1B3115}" srcOrd="0" destOrd="0" presId="urn:microsoft.com/office/officeart/2005/8/layout/process1"/>
+    <dgm:cxn modelId="{6F09B79E-A383-429E-A208-864F88F34AA1}" type="presOf" srcId="{9EE1A18E-AD2D-415E-8996-B35207C41ED0}" destId="{B9FC173B-3430-402C-9BFA-D498C62BCC2D}" srcOrd="0" destOrd="0" presId="urn:microsoft.com/office/officeart/2005/8/layout/process1"/>
     <dgm:cxn modelId="{80AB986A-FDF3-41B1-9092-584CE3EB969B}" srcId="{9EE1A18E-AD2D-415E-8996-B35207C41ED0}" destId="{BF8C77AF-CFF1-4B53-B009-D4E001D240D6}" srcOrd="3" destOrd="0" parTransId="{FBE35E27-7BCE-41B3-88D2-29BD34AAC180}" sibTransId="{DC8EEA03-196C-4689-B6BD-D5BC213D37CC}"/>
-    <dgm:cxn modelId="{DC86EE85-42BA-48A8-892A-36A69BD36106}" type="presOf" srcId="{EF5675B6-38BA-4455-BA87-E62399D49989}" destId="{DEB61738-BCA0-4546-95CF-970A62665FC2}" srcOrd="0" destOrd="0" presId="urn:microsoft.com/office/officeart/2005/8/layout/process1"/>
-    <dgm:cxn modelId="{1E9039E9-A0A2-4B5D-8A19-8AC9E3C6E8D6}" type="presOf" srcId="{BF8C77AF-CFF1-4B53-B009-D4E001D240D6}" destId="{D0DFB2B8-5022-4762-AA62-9B0CF1B32B60}" srcOrd="0" destOrd="0" presId="urn:microsoft.com/office/officeart/2005/8/layout/process1"/>
-    <dgm:cxn modelId="{C65B718C-EBE4-455C-B517-3A6B4986E0E4}" type="presOf" srcId="{BF4790F6-D1AA-430E-85BA-C07F91D009F2}" destId="{485EB252-98AF-4CC0-A401-D9A154AAFC53}" srcOrd="0" destOrd="0" presId="urn:microsoft.com/office/officeart/2005/8/layout/process1"/>
-    <dgm:cxn modelId="{F4480CFD-C18D-4246-84C7-178269A248F3}" type="presOf" srcId="{7201A391-9828-4B1D-A3C1-894234D041DB}" destId="{FDD593C1-9D9B-40ED-8C6D-5142CB0F0E3E}" srcOrd="1" destOrd="0" presId="urn:microsoft.com/office/officeart/2005/8/layout/process1"/>
-    <dgm:cxn modelId="{D375E270-C0CB-4076-B0C1-54E8B8AF0FCB}" type="presOf" srcId="{214208B8-431D-481C-9A4C-228B7308ADA8}" destId="{5D4876CA-733D-4DFD-8E79-4A3DBC7C7C6B}" srcOrd="1" destOrd="0" presId="urn:microsoft.com/office/officeart/2005/8/layout/process1"/>
-    <dgm:cxn modelId="{89F1D040-6760-49D3-85A2-1BAFEDD561D1}" type="presOf" srcId="{7201A391-9828-4B1D-A3C1-894234D041DB}" destId="{05A02C9E-6432-4B6A-91B3-E0BA65A6B1AE}" srcOrd="0" destOrd="0" presId="urn:microsoft.com/office/officeart/2005/8/layout/process1"/>
-    <dgm:cxn modelId="{4D1B4854-AE2E-470B-9115-BD099FD5799A}" srcId="{9EE1A18E-AD2D-415E-8996-B35207C41ED0}" destId="{BF4790F6-D1AA-430E-85BA-C07F91D009F2}" srcOrd="1" destOrd="0" parTransId="{974B1A63-8714-4E97-A93F-006B83F9DBF3}" sibTransId="{214208B8-431D-481C-9A4C-228B7308ADA8}"/>
-    <dgm:cxn modelId="{B151CA70-0406-48D6-8013-3F7D288766AD}" srcId="{9EE1A18E-AD2D-415E-8996-B35207C41ED0}" destId="{5AAB36AD-884F-4169-9EAA-81A3D87ABCFA}" srcOrd="0" destOrd="0" parTransId="{4796A0B2-FD04-4D0D-B4E3-6A8EB9A6D74D}" sibTransId="{9C4D6193-4800-45DB-9EB9-DA2277B5D91B}"/>
-    <dgm:cxn modelId="{39F27088-F2FF-4B1E-85B8-75E4A5853051}" srcId="{9EE1A18E-AD2D-415E-8996-B35207C41ED0}" destId="{EF5675B6-38BA-4455-BA87-E62399D49989}" srcOrd="2" destOrd="0" parTransId="{B9F702AD-11CA-445A-BE84-AFE50ED28D23}" sibTransId="{7201A391-9828-4B1D-A3C1-894234D041DB}"/>
-    <dgm:cxn modelId="{8457EB51-CCD1-46A9-B3E3-A9FF03AEE3EA}" type="presParOf" srcId="{B9FC173B-3430-402C-9BFA-D498C62BCC2D}" destId="{AB8F05C3-3669-4AF7-9C79-08939721A716}" srcOrd="0" destOrd="0" presId="urn:microsoft.com/office/officeart/2005/8/layout/process1"/>
-    <dgm:cxn modelId="{820D5655-84A1-475F-B2CD-A02CDA0F0918}" type="presParOf" srcId="{B9FC173B-3430-402C-9BFA-D498C62BCC2D}" destId="{374ED80F-5E6F-4A85-B95B-4BA99538042E}" srcOrd="1" destOrd="0" presId="urn:microsoft.com/office/officeart/2005/8/layout/process1"/>
-    <dgm:cxn modelId="{14BEEA8A-EB3F-458D-8CCA-980AD0B91FBC}" type="presParOf" srcId="{374ED80F-5E6F-4A85-B95B-4BA99538042E}" destId="{B8DA0D4A-E19E-4233-86B3-A96400569C53}" srcOrd="0" destOrd="0" presId="urn:microsoft.com/office/officeart/2005/8/layout/process1"/>
-    <dgm:cxn modelId="{E6605EF3-2386-4010-9CF7-9A21B5F69305}" type="presParOf" srcId="{B9FC173B-3430-402C-9BFA-D498C62BCC2D}" destId="{485EB252-98AF-4CC0-A401-D9A154AAFC53}" srcOrd="2" destOrd="0" presId="urn:microsoft.com/office/officeart/2005/8/layout/process1"/>
-    <dgm:cxn modelId="{5BDCFE87-1FAA-4779-90D0-F544DF60EFA0}" type="presParOf" srcId="{B9FC173B-3430-402C-9BFA-D498C62BCC2D}" destId="{C789FCC9-4717-4FFC-BA71-F98E7B1B3115}" srcOrd="3" destOrd="0" presId="urn:microsoft.com/office/officeart/2005/8/layout/process1"/>
-    <dgm:cxn modelId="{733F6EF4-90A2-4107-9D79-DEFE8F632E6C}" type="presParOf" srcId="{C789FCC9-4717-4FFC-BA71-F98E7B1B3115}" destId="{5D4876CA-733D-4DFD-8E79-4A3DBC7C7C6B}" srcOrd="0" destOrd="0" presId="urn:microsoft.com/office/officeart/2005/8/layout/process1"/>
-    <dgm:cxn modelId="{6B8F53C5-3CD4-4796-B21F-1953EE697EDD}" type="presParOf" srcId="{B9FC173B-3430-402C-9BFA-D498C62BCC2D}" destId="{DEB61738-BCA0-4546-95CF-970A62665FC2}" srcOrd="4" destOrd="0" presId="urn:microsoft.com/office/officeart/2005/8/layout/process1"/>
-    <dgm:cxn modelId="{E6218BBA-55C2-47EF-B628-6DDF1A03DF51}" type="presParOf" srcId="{B9FC173B-3430-402C-9BFA-D498C62BCC2D}" destId="{05A02C9E-6432-4B6A-91B3-E0BA65A6B1AE}" srcOrd="5" destOrd="0" presId="urn:microsoft.com/office/officeart/2005/8/layout/process1"/>
-    <dgm:cxn modelId="{D606DD92-7184-4B58-95E9-ADCB6B3E89A2}" type="presParOf" srcId="{05A02C9E-6432-4B6A-91B3-E0BA65A6B1AE}" destId="{FDD593C1-9D9B-40ED-8C6D-5142CB0F0E3E}" srcOrd="0" destOrd="0" presId="urn:microsoft.com/office/officeart/2005/8/layout/process1"/>
-    <dgm:cxn modelId="{D9891C74-7D40-483F-92A6-5CF1EBFA4CE7}" type="presParOf" srcId="{B9FC173B-3430-402C-9BFA-D498C62BCC2D}" destId="{D0DFB2B8-5022-4762-AA62-9B0CF1B32B60}" srcOrd="6" destOrd="0" presId="urn:microsoft.com/office/officeart/2005/8/layout/process1"/>
+    <dgm:cxn modelId="{ED04CED6-031A-4F46-AEFC-C0C0B8484D36}" type="presParOf" srcId="{B9FC173B-3430-402C-9BFA-D498C62BCC2D}" destId="{AB8F05C3-3669-4AF7-9C79-08939721A716}" srcOrd="0" destOrd="0" presId="urn:microsoft.com/office/officeart/2005/8/layout/process1"/>
+    <dgm:cxn modelId="{29349D01-217C-4E16-9385-19A7C567B2EB}" type="presParOf" srcId="{B9FC173B-3430-402C-9BFA-D498C62BCC2D}" destId="{374ED80F-5E6F-4A85-B95B-4BA99538042E}" srcOrd="1" destOrd="0" presId="urn:microsoft.com/office/officeart/2005/8/layout/process1"/>
+    <dgm:cxn modelId="{B56128BF-A182-49B3-AE20-AB49FBC4C638}" type="presParOf" srcId="{374ED80F-5E6F-4A85-B95B-4BA99538042E}" destId="{B8DA0D4A-E19E-4233-86B3-A96400569C53}" srcOrd="0" destOrd="0" presId="urn:microsoft.com/office/officeart/2005/8/layout/process1"/>
+    <dgm:cxn modelId="{3B6E8375-ED88-483D-A681-C9BCF81E0C17}" type="presParOf" srcId="{B9FC173B-3430-402C-9BFA-D498C62BCC2D}" destId="{485EB252-98AF-4CC0-A401-D9A154AAFC53}" srcOrd="2" destOrd="0" presId="urn:microsoft.com/office/officeart/2005/8/layout/process1"/>
+    <dgm:cxn modelId="{16EDAAB7-3AF9-4026-8BE6-C8968C7EFFFF}" type="presParOf" srcId="{B9FC173B-3430-402C-9BFA-D498C62BCC2D}" destId="{C789FCC9-4717-4FFC-BA71-F98E7B1B3115}" srcOrd="3" destOrd="0" presId="urn:microsoft.com/office/officeart/2005/8/layout/process1"/>
+    <dgm:cxn modelId="{E618C444-4C2E-4648-9702-524007355544}" type="presParOf" srcId="{C789FCC9-4717-4FFC-BA71-F98E7B1B3115}" destId="{5D4876CA-733D-4DFD-8E79-4A3DBC7C7C6B}" srcOrd="0" destOrd="0" presId="urn:microsoft.com/office/officeart/2005/8/layout/process1"/>
+    <dgm:cxn modelId="{2C090EFA-94C9-436D-BB01-822739C0240A}" type="presParOf" srcId="{B9FC173B-3430-402C-9BFA-D498C62BCC2D}" destId="{DEB61738-BCA0-4546-95CF-970A62665FC2}" srcOrd="4" destOrd="0" presId="urn:microsoft.com/office/officeart/2005/8/layout/process1"/>
+    <dgm:cxn modelId="{16F4F8E9-6495-4A1C-A177-91AAAFF513E1}" type="presParOf" srcId="{B9FC173B-3430-402C-9BFA-D498C62BCC2D}" destId="{05A02C9E-6432-4B6A-91B3-E0BA65A6B1AE}" srcOrd="5" destOrd="0" presId="urn:microsoft.com/office/officeart/2005/8/layout/process1"/>
+    <dgm:cxn modelId="{38178CEF-2261-4900-8EDB-742AE1D6D57F}" type="presParOf" srcId="{05A02C9E-6432-4B6A-91B3-E0BA65A6B1AE}" destId="{FDD593C1-9D9B-40ED-8C6D-5142CB0F0E3E}" srcOrd="0" destOrd="0" presId="urn:microsoft.com/office/officeart/2005/8/layout/process1"/>
+    <dgm:cxn modelId="{7A1EFE48-1D4E-499D-8F7C-82E566029085}" type="presParOf" srcId="{B9FC173B-3430-402C-9BFA-D498C62BCC2D}" destId="{D0DFB2B8-5022-4762-AA62-9B0CF1B32B60}" srcOrd="6" destOrd="0" presId="urn:microsoft.com/office/officeart/2005/8/layout/process1"/>
   </dgm:cxnLst>
   <dgm:bg/>
   <dgm:whole/>

</xml_diff>

<commit_message>
Date: 03 Feb 2026
</commit_message>
<xml_diff>
--- a/Notes_SA2510014.docx
+++ b/Notes_SA2510014.docx
@@ -14997,56 +14997,188 @@
       <w:r>
         <w:t>Save pom.xml file</w:t>
       </w:r>
+    </w:p>
+    <w:p>
+      <w:pPr>
+        <w:pStyle w:val="ListParagraph"/>
+        <w:numPr>
+          <w:ilvl w:val="0"/>
+          <w:numId w:val="42"/>
+        </w:numPr>
+      </w:pPr>
+      <w:r>
+        <w:t xml:space="preserve">Expand </w:t>
+      </w:r>
+      <w:r>
+        <w:t>src/test/java and create 2 packages as follows</w:t>
+      </w:r>
+    </w:p>
+    <w:p>
+      <w:pPr>
+        <w:pStyle w:val="ListParagraph"/>
+        <w:numPr>
+          <w:ilvl w:val="1"/>
+          <w:numId w:val="42"/>
+        </w:numPr>
+      </w:pPr>
+      <w:r>
+        <w:t>com.StepDefinition</w:t>
+      </w:r>
+    </w:p>
+    <w:p>
+      <w:pPr>
+        <w:pStyle w:val="ListParagraph"/>
+        <w:numPr>
+          <w:ilvl w:val="1"/>
+          <w:numId w:val="42"/>
+        </w:numPr>
+      </w:pPr>
+      <w:r>
+        <w:t>com.RunnerClass</w:t>
+      </w:r>
+    </w:p>
+    <w:p/>
+    <w:p>
+      <w:pPr>
+        <w:rPr>
+          <w:b/>
+          <w:bCs/>
+        </w:rPr>
+      </w:pPr>
+      <w:r>
+        <w:rPr>
+          <w:b/>
+          <w:bCs/>
+        </w:rPr>
+        <w:t>Tags in Cucumber</w:t>
+      </w:r>
+    </w:p>
+    <w:p>
+      <w:pPr>
+        <w:pStyle w:val="ListParagraph"/>
+        <w:numPr>
+          <w:ilvl w:val="0"/>
+          <w:numId w:val="44"/>
+        </w:numPr>
+      </w:pPr>
+      <w:r>
+        <w:t>Tags are used to specify the execution criteria of Test Scenarios</w:t>
+      </w:r>
+    </w:p>
+    <w:p>
+      <w:pPr>
+        <w:pStyle w:val="ListParagraph"/>
+        <w:numPr>
+          <w:ilvl w:val="0"/>
+          <w:numId w:val="44"/>
+        </w:numPr>
+      </w:pPr>
+      <w:r>
+        <w:t>Tags are the words in feature file which starts with @</w:t>
+      </w:r>
+    </w:p>
+    <w:p>
+      <w:pPr>
+        <w:pStyle w:val="ListParagraph"/>
+        <w:numPr>
+          <w:ilvl w:val="0"/>
+          <w:numId w:val="44"/>
+        </w:numPr>
+      </w:pPr>
+      <w:r>
+        <w:t>With the help of tags you can execute or skip single / multiple scenarios</w:t>
+      </w:r>
+    </w:p>
+    <w:p>
+      <w:pPr>
+        <w:pStyle w:val="ListParagraph"/>
+        <w:numPr>
+          <w:ilvl w:val="0"/>
+          <w:numId w:val="44"/>
+        </w:numPr>
+      </w:pPr>
+      <w:r>
+        <w:t>Tags are always needs to be specified in the feature file only</w:t>
+      </w:r>
+      <w:r>
+        <w:t xml:space="preserve"> and the execution criteria needs to be specified in Runner class</w:t>
+      </w:r>
+      <w:r>
+        <w:t>.</w:t>
+      </w:r>
+    </w:p>
+    <w:p/>
+    <w:p>
+      <w:pPr>
+        <w:rPr>
+          <w:b/>
+          <w:bCs/>
+        </w:rPr>
+      </w:pPr>
+      <w:r>
+        <w:rPr>
+          <w:b/>
+          <w:bCs/>
+        </w:rPr>
+        <w:t>Hooks in Cucumber</w:t>
+      </w:r>
+    </w:p>
+    <w:p>
+      <w:pPr>
+        <w:pStyle w:val="ListParagraph"/>
+        <w:numPr>
+          <w:ilvl w:val="0"/>
+          <w:numId w:val="45"/>
+        </w:numPr>
+      </w:pPr>
+      <w:r>
+        <w:t xml:space="preserve">These are special methods that will get executed before and after </w:t>
+      </w:r>
+      <w:r>
+        <w:rPr>
+          <w:b/>
+          <w:bCs/>
+        </w:rPr>
+        <w:t>every scenario</w:t>
+      </w:r>
+    </w:p>
+    <w:p>
+      <w:pPr>
+        <w:pStyle w:val="ListParagraph"/>
+        <w:numPr>
+          <w:ilvl w:val="0"/>
+          <w:numId w:val="45"/>
+        </w:numPr>
+      </w:pPr>
+      <w:r>
+        <w:t>There are 2 hooks in Cucumber</w:t>
+      </w:r>
+    </w:p>
+    <w:p>
+      <w:pPr>
+        <w:pStyle w:val="ListParagraph"/>
+        <w:numPr>
+          <w:ilvl w:val="1"/>
+          <w:numId w:val="45"/>
+        </w:numPr>
+      </w:pPr>
+      <w:r>
+        <w:t>@Before</w:t>
+      </w:r>
+    </w:p>
+    <w:p>
+      <w:pPr>
+        <w:pStyle w:val="ListParagraph"/>
+        <w:numPr>
+          <w:ilvl w:val="1"/>
+          <w:numId w:val="45"/>
+        </w:numPr>
+      </w:pPr>
+      <w:r>
+        <w:t>@After</w:t>
+      </w:r>
       <w:bookmarkStart w:id="0" w:name="_GoBack"/>
       <w:bookmarkEnd w:id="0"/>
-    </w:p>
-    <w:p>
-      <w:pPr>
-        <w:pStyle w:val="ListParagraph"/>
-        <w:numPr>
-          <w:ilvl w:val="0"/>
-          <w:numId w:val="42"/>
-        </w:numPr>
-      </w:pPr>
-      <w:r>
-        <w:t xml:space="preserve">Expand </w:t>
-      </w:r>
-      <w:r>
-        <w:t>src/test/java and create 2 packages as follows</w:t>
-      </w:r>
-    </w:p>
-    <w:p>
-      <w:pPr>
-        <w:pStyle w:val="ListParagraph"/>
-        <w:numPr>
-          <w:ilvl w:val="1"/>
-          <w:numId w:val="42"/>
-        </w:numPr>
-      </w:pPr>
-      <w:r>
-        <w:t>com.StepDefinition</w:t>
-      </w:r>
-    </w:p>
-    <w:p>
-      <w:pPr>
-        <w:pStyle w:val="ListParagraph"/>
-        <w:numPr>
-          <w:ilvl w:val="1"/>
-          <w:numId w:val="42"/>
-        </w:numPr>
-      </w:pPr>
-      <w:r>
-        <w:t>com.RunnerClass</w:t>
-      </w:r>
-    </w:p>
-    <w:p>
-      <w:pPr>
-        <w:pStyle w:val="ListParagraph"/>
-        <w:numPr>
-          <w:ilvl w:val="0"/>
-          <w:numId w:val="42"/>
-        </w:numPr>
-      </w:pPr>
     </w:p>
     <w:sectPr>
       <w:pgSz w:w="11906" w:h="16838"/>
@@ -15376,6 +15508,119 @@
     </w:lvl>
   </w:abstractNum>
   <w:abstractNum w:abstractNumId="3">
+    <w:nsid w:val="12207D9A"/>
+    <w:multiLevelType w:val="hybridMultilevel"/>
+    <w:tmpl w:val="80ACE47C"/>
+    <w:lvl w:ilvl="0" w:tplc="40090001">
+      <w:start w:val="1"/>
+      <w:numFmt w:val="bullet"/>
+      <w:lvlText w:val=""/>
+      <w:lvlJc w:val="left"/>
+      <w:pPr>
+        <w:ind w:left="720" w:hanging="360"/>
+      </w:pPr>
+      <w:rPr>
+        <w:rFonts w:ascii="Symbol" w:hAnsi="Symbol" w:hint="default"/>
+      </w:rPr>
+    </w:lvl>
+    <w:lvl w:ilvl="1" w:tplc="40090003">
+      <w:start w:val="1"/>
+      <w:numFmt w:val="bullet"/>
+      <w:lvlText w:val="o"/>
+      <w:lvlJc w:val="left"/>
+      <w:pPr>
+        <w:ind w:left="1440" w:hanging="360"/>
+      </w:pPr>
+      <w:rPr>
+        <w:rFonts w:ascii="Courier New" w:hAnsi="Courier New" w:cs="Courier New" w:hint="default"/>
+      </w:rPr>
+    </w:lvl>
+    <w:lvl w:ilvl="2" w:tplc="40090005" w:tentative="1">
+      <w:start w:val="1"/>
+      <w:numFmt w:val="bullet"/>
+      <w:lvlText w:val=""/>
+      <w:lvlJc w:val="left"/>
+      <w:pPr>
+        <w:ind w:left="2160" w:hanging="360"/>
+      </w:pPr>
+      <w:rPr>
+        <w:rFonts w:ascii="Wingdings" w:hAnsi="Wingdings" w:hint="default"/>
+      </w:rPr>
+    </w:lvl>
+    <w:lvl w:ilvl="3" w:tplc="40090001" w:tentative="1">
+      <w:start w:val="1"/>
+      <w:numFmt w:val="bullet"/>
+      <w:lvlText w:val=""/>
+      <w:lvlJc w:val="left"/>
+      <w:pPr>
+        <w:ind w:left="2880" w:hanging="360"/>
+      </w:pPr>
+      <w:rPr>
+        <w:rFonts w:ascii="Symbol" w:hAnsi="Symbol" w:hint="default"/>
+      </w:rPr>
+    </w:lvl>
+    <w:lvl w:ilvl="4" w:tplc="40090003" w:tentative="1">
+      <w:start w:val="1"/>
+      <w:numFmt w:val="bullet"/>
+      <w:lvlText w:val="o"/>
+      <w:lvlJc w:val="left"/>
+      <w:pPr>
+        <w:ind w:left="3600" w:hanging="360"/>
+      </w:pPr>
+      <w:rPr>
+        <w:rFonts w:ascii="Courier New" w:hAnsi="Courier New" w:cs="Courier New" w:hint="default"/>
+      </w:rPr>
+    </w:lvl>
+    <w:lvl w:ilvl="5" w:tplc="40090005" w:tentative="1">
+      <w:start w:val="1"/>
+      <w:numFmt w:val="bullet"/>
+      <w:lvlText w:val=""/>
+      <w:lvlJc w:val="left"/>
+      <w:pPr>
+        <w:ind w:left="4320" w:hanging="360"/>
+      </w:pPr>
+      <w:rPr>
+        <w:rFonts w:ascii="Wingdings" w:hAnsi="Wingdings" w:hint="default"/>
+      </w:rPr>
+    </w:lvl>
+    <w:lvl w:ilvl="6" w:tplc="40090001" w:tentative="1">
+      <w:start w:val="1"/>
+      <w:numFmt w:val="bullet"/>
+      <w:lvlText w:val=""/>
+      <w:lvlJc w:val="left"/>
+      <w:pPr>
+        <w:ind w:left="5040" w:hanging="360"/>
+      </w:pPr>
+      <w:rPr>
+        <w:rFonts w:ascii="Symbol" w:hAnsi="Symbol" w:hint="default"/>
+      </w:rPr>
+    </w:lvl>
+    <w:lvl w:ilvl="7" w:tplc="40090003" w:tentative="1">
+      <w:start w:val="1"/>
+      <w:numFmt w:val="bullet"/>
+      <w:lvlText w:val="o"/>
+      <w:lvlJc w:val="left"/>
+      <w:pPr>
+        <w:ind w:left="5760" w:hanging="360"/>
+      </w:pPr>
+      <w:rPr>
+        <w:rFonts w:ascii="Courier New" w:hAnsi="Courier New" w:cs="Courier New" w:hint="default"/>
+      </w:rPr>
+    </w:lvl>
+    <w:lvl w:ilvl="8" w:tplc="40090005" w:tentative="1">
+      <w:start w:val="1"/>
+      <w:numFmt w:val="bullet"/>
+      <w:lvlText w:val=""/>
+      <w:lvlJc w:val="left"/>
+      <w:pPr>
+        <w:ind w:left="6480" w:hanging="360"/>
+      </w:pPr>
+      <w:rPr>
+        <w:rFonts w:ascii="Wingdings" w:hAnsi="Wingdings" w:hint="default"/>
+      </w:rPr>
+    </w:lvl>
+  </w:abstractNum>
+  <w:abstractNum w:abstractNumId="4">
     <w:nsid w:val="13611977"/>
     <w:multiLevelType w:val="hybridMultilevel"/>
     <w:tmpl w:val="65D89DDE"/>
@@ -15464,7 +15709,120 @@
       </w:pPr>
     </w:lvl>
   </w:abstractNum>
-  <w:abstractNum w:abstractNumId="4">
+  <w:abstractNum w:abstractNumId="5">
+    <w:nsid w:val="159A68A1"/>
+    <w:multiLevelType w:val="hybridMultilevel"/>
+    <w:tmpl w:val="86A6F3B4"/>
+    <w:lvl w:ilvl="0" w:tplc="40090001">
+      <w:start w:val="1"/>
+      <w:numFmt w:val="bullet"/>
+      <w:lvlText w:val=""/>
+      <w:lvlJc w:val="left"/>
+      <w:pPr>
+        <w:ind w:left="720" w:hanging="360"/>
+      </w:pPr>
+      <w:rPr>
+        <w:rFonts w:ascii="Symbol" w:hAnsi="Symbol" w:hint="default"/>
+      </w:rPr>
+    </w:lvl>
+    <w:lvl w:ilvl="1" w:tplc="40090003" w:tentative="1">
+      <w:start w:val="1"/>
+      <w:numFmt w:val="bullet"/>
+      <w:lvlText w:val="o"/>
+      <w:lvlJc w:val="left"/>
+      <w:pPr>
+        <w:ind w:left="1440" w:hanging="360"/>
+      </w:pPr>
+      <w:rPr>
+        <w:rFonts w:ascii="Courier New" w:hAnsi="Courier New" w:cs="Courier New" w:hint="default"/>
+      </w:rPr>
+    </w:lvl>
+    <w:lvl w:ilvl="2" w:tplc="40090005" w:tentative="1">
+      <w:start w:val="1"/>
+      <w:numFmt w:val="bullet"/>
+      <w:lvlText w:val=""/>
+      <w:lvlJc w:val="left"/>
+      <w:pPr>
+        <w:ind w:left="2160" w:hanging="360"/>
+      </w:pPr>
+      <w:rPr>
+        <w:rFonts w:ascii="Wingdings" w:hAnsi="Wingdings" w:hint="default"/>
+      </w:rPr>
+    </w:lvl>
+    <w:lvl w:ilvl="3" w:tplc="40090001" w:tentative="1">
+      <w:start w:val="1"/>
+      <w:numFmt w:val="bullet"/>
+      <w:lvlText w:val=""/>
+      <w:lvlJc w:val="left"/>
+      <w:pPr>
+        <w:ind w:left="2880" w:hanging="360"/>
+      </w:pPr>
+      <w:rPr>
+        <w:rFonts w:ascii="Symbol" w:hAnsi="Symbol" w:hint="default"/>
+      </w:rPr>
+    </w:lvl>
+    <w:lvl w:ilvl="4" w:tplc="40090003" w:tentative="1">
+      <w:start w:val="1"/>
+      <w:numFmt w:val="bullet"/>
+      <w:lvlText w:val="o"/>
+      <w:lvlJc w:val="left"/>
+      <w:pPr>
+        <w:ind w:left="3600" w:hanging="360"/>
+      </w:pPr>
+      <w:rPr>
+        <w:rFonts w:ascii="Courier New" w:hAnsi="Courier New" w:cs="Courier New" w:hint="default"/>
+      </w:rPr>
+    </w:lvl>
+    <w:lvl w:ilvl="5" w:tplc="40090005" w:tentative="1">
+      <w:start w:val="1"/>
+      <w:numFmt w:val="bullet"/>
+      <w:lvlText w:val=""/>
+      <w:lvlJc w:val="left"/>
+      <w:pPr>
+        <w:ind w:left="4320" w:hanging="360"/>
+      </w:pPr>
+      <w:rPr>
+        <w:rFonts w:ascii="Wingdings" w:hAnsi="Wingdings" w:hint="default"/>
+      </w:rPr>
+    </w:lvl>
+    <w:lvl w:ilvl="6" w:tplc="40090001" w:tentative="1">
+      <w:start w:val="1"/>
+      <w:numFmt w:val="bullet"/>
+      <w:lvlText w:val=""/>
+      <w:lvlJc w:val="left"/>
+      <w:pPr>
+        <w:ind w:left="5040" w:hanging="360"/>
+      </w:pPr>
+      <w:rPr>
+        <w:rFonts w:ascii="Symbol" w:hAnsi="Symbol" w:hint="default"/>
+      </w:rPr>
+    </w:lvl>
+    <w:lvl w:ilvl="7" w:tplc="40090003" w:tentative="1">
+      <w:start w:val="1"/>
+      <w:numFmt w:val="bullet"/>
+      <w:lvlText w:val="o"/>
+      <w:lvlJc w:val="left"/>
+      <w:pPr>
+        <w:ind w:left="5760" w:hanging="360"/>
+      </w:pPr>
+      <w:rPr>
+        <w:rFonts w:ascii="Courier New" w:hAnsi="Courier New" w:cs="Courier New" w:hint="default"/>
+      </w:rPr>
+    </w:lvl>
+    <w:lvl w:ilvl="8" w:tplc="40090005" w:tentative="1">
+      <w:start w:val="1"/>
+      <w:numFmt w:val="bullet"/>
+      <w:lvlText w:val=""/>
+      <w:lvlJc w:val="left"/>
+      <w:pPr>
+        <w:ind w:left="6480" w:hanging="360"/>
+      </w:pPr>
+      <w:rPr>
+        <w:rFonts w:ascii="Wingdings" w:hAnsi="Wingdings" w:hint="default"/>
+      </w:rPr>
+    </w:lvl>
+  </w:abstractNum>
+  <w:abstractNum w:abstractNumId="6">
     <w:nsid w:val="15BA43E3"/>
     <w:multiLevelType w:val="hybridMultilevel"/>
     <w:tmpl w:val="55CCFBDE"/>
@@ -15553,7 +15911,7 @@
       </w:pPr>
     </w:lvl>
   </w:abstractNum>
-  <w:abstractNum w:abstractNumId="5">
+  <w:abstractNum w:abstractNumId="7">
     <w:nsid w:val="17431532"/>
     <w:multiLevelType w:val="hybridMultilevel"/>
     <w:tmpl w:val="3D88D956"/>
@@ -15642,7 +16000,7 @@
       </w:pPr>
     </w:lvl>
   </w:abstractNum>
-  <w:abstractNum w:abstractNumId="6">
+  <w:abstractNum w:abstractNumId="8">
     <w:nsid w:val="1A1B3715"/>
     <w:multiLevelType w:val="hybridMultilevel"/>
     <w:tmpl w:val="B958D526"/>
@@ -15755,7 +16113,7 @@
       </w:rPr>
     </w:lvl>
   </w:abstractNum>
-  <w:abstractNum w:abstractNumId="7">
+  <w:abstractNum w:abstractNumId="9">
     <w:nsid w:val="1ACF1D3C"/>
     <w:multiLevelType w:val="hybridMultilevel"/>
     <w:tmpl w:val="8BC0B462"/>
@@ -15868,7 +16226,7 @@
       </w:rPr>
     </w:lvl>
   </w:abstractNum>
-  <w:abstractNum w:abstractNumId="8">
+  <w:abstractNum w:abstractNumId="10">
     <w:nsid w:val="1D0166BD"/>
     <w:multiLevelType w:val="hybridMultilevel"/>
     <w:tmpl w:val="73A888F8"/>
@@ -15957,7 +16315,7 @@
       </w:pPr>
     </w:lvl>
   </w:abstractNum>
-  <w:abstractNum w:abstractNumId="9">
+  <w:abstractNum w:abstractNumId="11">
     <w:nsid w:val="22E55564"/>
     <w:multiLevelType w:val="hybridMultilevel"/>
     <w:tmpl w:val="B0FAF5DE"/>
@@ -16046,7 +16404,7 @@
       </w:pPr>
     </w:lvl>
   </w:abstractNum>
-  <w:abstractNum w:abstractNumId="10">
+  <w:abstractNum w:abstractNumId="12">
     <w:nsid w:val="24AD48A7"/>
     <w:multiLevelType w:val="hybridMultilevel"/>
     <w:tmpl w:val="C53ACF94"/>
@@ -16159,7 +16517,7 @@
       </w:rPr>
     </w:lvl>
   </w:abstractNum>
-  <w:abstractNum w:abstractNumId="11">
+  <w:abstractNum w:abstractNumId="13">
     <w:nsid w:val="2CB43F4A"/>
     <w:multiLevelType w:val="hybridMultilevel"/>
     <w:tmpl w:val="6C80E6C4"/>
@@ -16248,7 +16606,7 @@
       </w:pPr>
     </w:lvl>
   </w:abstractNum>
-  <w:abstractNum w:abstractNumId="12">
+  <w:abstractNum w:abstractNumId="14">
     <w:nsid w:val="2F5347F7"/>
     <w:multiLevelType w:val="hybridMultilevel"/>
     <w:tmpl w:val="30F0EBD0"/>
@@ -16337,7 +16695,7 @@
       </w:pPr>
     </w:lvl>
   </w:abstractNum>
-  <w:abstractNum w:abstractNumId="13">
+  <w:abstractNum w:abstractNumId="15">
     <w:nsid w:val="34F71AA3"/>
     <w:multiLevelType w:val="hybridMultilevel"/>
     <w:tmpl w:val="F71EF04C"/>
@@ -16450,7 +16808,7 @@
       </w:rPr>
     </w:lvl>
   </w:abstractNum>
-  <w:abstractNum w:abstractNumId="14">
+  <w:abstractNum w:abstractNumId="16">
     <w:nsid w:val="407E5349"/>
     <w:multiLevelType w:val="hybridMultilevel"/>
     <w:tmpl w:val="DF1CCCC6"/>
@@ -16563,7 +16921,7 @@
       </w:rPr>
     </w:lvl>
   </w:abstractNum>
-  <w:abstractNum w:abstractNumId="15">
+  <w:abstractNum w:abstractNumId="17">
     <w:nsid w:val="44443626"/>
     <w:multiLevelType w:val="hybridMultilevel"/>
     <w:tmpl w:val="3A38E55E"/>
@@ -16676,7 +17034,7 @@
       </w:rPr>
     </w:lvl>
   </w:abstractNum>
-  <w:abstractNum w:abstractNumId="16">
+  <w:abstractNum w:abstractNumId="18">
     <w:nsid w:val="47861B1F"/>
     <w:multiLevelType w:val="hybridMultilevel"/>
     <w:tmpl w:val="0A744E5A"/>
@@ -16765,7 +17123,7 @@
       </w:pPr>
     </w:lvl>
   </w:abstractNum>
-  <w:abstractNum w:abstractNumId="17">
+  <w:abstractNum w:abstractNumId="19">
     <w:nsid w:val="47CC2747"/>
     <w:multiLevelType w:val="hybridMultilevel"/>
     <w:tmpl w:val="A8F411E0"/>
@@ -16854,7 +17212,7 @@
       </w:pPr>
     </w:lvl>
   </w:abstractNum>
-  <w:abstractNum w:abstractNumId="18">
+  <w:abstractNum w:abstractNumId="20">
     <w:nsid w:val="4BCF165C"/>
     <w:multiLevelType w:val="hybridMultilevel"/>
     <w:tmpl w:val="E7067116"/>
@@ -16940,7 +17298,7 @@
       </w:pPr>
     </w:lvl>
   </w:abstractNum>
-  <w:abstractNum w:abstractNumId="19">
+  <w:abstractNum w:abstractNumId="21">
     <w:nsid w:val="4D934839"/>
     <w:multiLevelType w:val="hybridMultilevel"/>
     <w:tmpl w:val="66E021E4"/>
@@ -17029,7 +17387,7 @@
       </w:pPr>
     </w:lvl>
   </w:abstractNum>
-  <w:abstractNum w:abstractNumId="20">
+  <w:abstractNum w:abstractNumId="22">
     <w:nsid w:val="520668FC"/>
     <w:multiLevelType w:val="hybridMultilevel"/>
     <w:tmpl w:val="A4F835F0"/>
@@ -17142,7 +17500,7 @@
       </w:rPr>
     </w:lvl>
   </w:abstractNum>
-  <w:abstractNum w:abstractNumId="21">
+  <w:abstractNum w:abstractNumId="23">
     <w:nsid w:val="542B3911"/>
     <w:multiLevelType w:val="hybridMultilevel"/>
     <w:tmpl w:val="FF9249A0"/>
@@ -17255,7 +17613,7 @@
       </w:rPr>
     </w:lvl>
   </w:abstractNum>
-  <w:abstractNum w:abstractNumId="22">
+  <w:abstractNum w:abstractNumId="24">
     <w:nsid w:val="571D3B3E"/>
     <w:multiLevelType w:val="hybridMultilevel"/>
     <w:tmpl w:val="CF98A6CE"/>
@@ -17368,7 +17726,7 @@
       </w:rPr>
     </w:lvl>
   </w:abstractNum>
-  <w:abstractNum w:abstractNumId="23">
+  <w:abstractNum w:abstractNumId="25">
     <w:nsid w:val="5BA75066"/>
     <w:multiLevelType w:val="hybridMultilevel"/>
     <w:tmpl w:val="97D2EB96"/>
@@ -17457,7 +17815,7 @@
       </w:pPr>
     </w:lvl>
   </w:abstractNum>
-  <w:abstractNum w:abstractNumId="24">
+  <w:abstractNum w:abstractNumId="26">
     <w:nsid w:val="5DA53D78"/>
     <w:multiLevelType w:val="hybridMultilevel"/>
     <w:tmpl w:val="25D4A350"/>
@@ -17546,7 +17904,7 @@
       </w:pPr>
     </w:lvl>
   </w:abstractNum>
-  <w:abstractNum w:abstractNumId="25">
+  <w:abstractNum w:abstractNumId="27">
     <w:nsid w:val="5F4B1933"/>
     <w:multiLevelType w:val="hybridMultilevel"/>
     <w:tmpl w:val="B9F8D93A"/>
@@ -17659,7 +18017,7 @@
       </w:rPr>
     </w:lvl>
   </w:abstractNum>
-  <w:abstractNum w:abstractNumId="26">
+  <w:abstractNum w:abstractNumId="28">
     <w:nsid w:val="5F5160CF"/>
     <w:multiLevelType w:val="hybridMultilevel"/>
     <w:tmpl w:val="CFEE6708"/>
@@ -17772,7 +18130,7 @@
       </w:rPr>
     </w:lvl>
   </w:abstractNum>
-  <w:abstractNum w:abstractNumId="27">
+  <w:abstractNum w:abstractNumId="29">
     <w:nsid w:val="611C3CE1"/>
     <w:multiLevelType w:val="hybridMultilevel"/>
     <w:tmpl w:val="861A04FE"/>
@@ -17861,7 +18219,7 @@
       </w:pPr>
     </w:lvl>
   </w:abstractNum>
-  <w:abstractNum w:abstractNumId="28">
+  <w:abstractNum w:abstractNumId="30">
     <w:nsid w:val="61ED0FA8"/>
     <w:multiLevelType w:val="hybridMultilevel"/>
     <w:tmpl w:val="70CCDFC4"/>
@@ -17950,7 +18308,7 @@
       </w:pPr>
     </w:lvl>
   </w:abstractNum>
-  <w:abstractNum w:abstractNumId="29">
+  <w:abstractNum w:abstractNumId="31">
     <w:nsid w:val="64CF3846"/>
     <w:multiLevelType w:val="hybridMultilevel"/>
     <w:tmpl w:val="13ACF5F6"/>
@@ -18063,7 +18421,7 @@
       </w:rPr>
     </w:lvl>
   </w:abstractNum>
-  <w:abstractNum w:abstractNumId="30">
+  <w:abstractNum w:abstractNumId="32">
     <w:nsid w:val="679919C6"/>
     <w:multiLevelType w:val="hybridMultilevel"/>
     <w:tmpl w:val="D8C8FD88"/>
@@ -18176,7 +18534,7 @@
       </w:rPr>
     </w:lvl>
   </w:abstractNum>
-  <w:abstractNum w:abstractNumId="31">
+  <w:abstractNum w:abstractNumId="33">
     <w:nsid w:val="6AEF2B37"/>
     <w:multiLevelType w:val="hybridMultilevel"/>
     <w:tmpl w:val="3D182D9A"/>
@@ -18289,7 +18647,7 @@
       </w:rPr>
     </w:lvl>
   </w:abstractNum>
-  <w:abstractNum w:abstractNumId="32">
+  <w:abstractNum w:abstractNumId="34">
     <w:nsid w:val="6D8557E4"/>
     <w:multiLevelType w:val="hybridMultilevel"/>
     <w:tmpl w:val="0A1AF8D0"/>
@@ -18402,7 +18760,7 @@
       </w:rPr>
     </w:lvl>
   </w:abstractNum>
-  <w:abstractNum w:abstractNumId="33">
+  <w:abstractNum w:abstractNumId="35">
     <w:nsid w:val="6DFD49EC"/>
     <w:multiLevelType w:val="hybridMultilevel"/>
     <w:tmpl w:val="5CDAB2D2"/>
@@ -18515,7 +18873,7 @@
       </w:rPr>
     </w:lvl>
   </w:abstractNum>
-  <w:abstractNum w:abstractNumId="34">
+  <w:abstractNum w:abstractNumId="36">
     <w:nsid w:val="6E087545"/>
     <w:multiLevelType w:val="hybridMultilevel"/>
     <w:tmpl w:val="68B8BE2E"/>
@@ -18604,7 +18962,7 @@
       </w:pPr>
     </w:lvl>
   </w:abstractNum>
-  <w:abstractNum w:abstractNumId="35">
+  <w:abstractNum w:abstractNumId="37">
     <w:nsid w:val="712436B2"/>
     <w:multiLevelType w:val="hybridMultilevel"/>
     <w:tmpl w:val="7DB88F34"/>
@@ -18717,7 +19075,7 @@
       </w:rPr>
     </w:lvl>
   </w:abstractNum>
-  <w:abstractNum w:abstractNumId="36">
+  <w:abstractNum w:abstractNumId="38">
     <w:nsid w:val="716327C1"/>
     <w:multiLevelType w:val="hybridMultilevel"/>
     <w:tmpl w:val="BF34ABA8"/>
@@ -18830,7 +19188,7 @@
       </w:rPr>
     </w:lvl>
   </w:abstractNum>
-  <w:abstractNum w:abstractNumId="37">
+  <w:abstractNum w:abstractNumId="39">
     <w:nsid w:val="73BF2B49"/>
     <w:multiLevelType w:val="hybridMultilevel"/>
     <w:tmpl w:val="8E56E800"/>
@@ -18943,7 +19301,7 @@
       </w:rPr>
     </w:lvl>
   </w:abstractNum>
-  <w:abstractNum w:abstractNumId="38">
+  <w:abstractNum w:abstractNumId="40">
     <w:nsid w:val="75371497"/>
     <w:multiLevelType w:val="hybridMultilevel"/>
     <w:tmpl w:val="1D686274"/>
@@ -19056,7 +19414,7 @@
       </w:rPr>
     </w:lvl>
   </w:abstractNum>
-  <w:abstractNum w:abstractNumId="39">
+  <w:abstractNum w:abstractNumId="41">
     <w:nsid w:val="7A65502B"/>
     <w:multiLevelType w:val="hybridMultilevel"/>
     <w:tmpl w:val="763EAD76"/>
@@ -19169,7 +19527,7 @@
       </w:rPr>
     </w:lvl>
   </w:abstractNum>
-  <w:abstractNum w:abstractNumId="40">
+  <w:abstractNum w:abstractNumId="42">
     <w:nsid w:val="7CC327AE"/>
     <w:multiLevelType w:val="hybridMultilevel"/>
     <w:tmpl w:val="FD60D564"/>
@@ -19282,7 +19640,7 @@
       </w:rPr>
     </w:lvl>
   </w:abstractNum>
-  <w:abstractNum w:abstractNumId="41">
+  <w:abstractNum w:abstractNumId="43">
     <w:nsid w:val="7D476BBC"/>
     <w:multiLevelType w:val="hybridMultilevel"/>
     <w:tmpl w:val="B360ED0C"/>
@@ -19395,7 +19753,7 @@
       </w:rPr>
     </w:lvl>
   </w:abstractNum>
-  <w:abstractNum w:abstractNumId="42">
+  <w:abstractNum w:abstractNumId="44">
     <w:nsid w:val="7FF367B4"/>
     <w:multiLevelType w:val="hybridMultilevel"/>
     <w:tmpl w:val="3DDC9BF0"/>
@@ -19512,130 +19870,136 @@
     <w:abstractNumId w:val="1"/>
   </w:num>
   <w:num w:numId="2">
+    <w:abstractNumId w:val="24"/>
+  </w:num>
+  <w:num w:numId="3">
+    <w:abstractNumId w:val="31"/>
+  </w:num>
+  <w:num w:numId="4">
+    <w:abstractNumId w:val="39"/>
+  </w:num>
+  <w:num w:numId="5">
+    <w:abstractNumId w:val="12"/>
+  </w:num>
+  <w:num w:numId="6">
+    <w:abstractNumId w:val="37"/>
+  </w:num>
+  <w:num w:numId="7">
+    <w:abstractNumId w:val="44"/>
+  </w:num>
+  <w:num w:numId="8">
+    <w:abstractNumId w:val="17"/>
+  </w:num>
+  <w:num w:numId="9">
+    <w:abstractNumId w:val="27"/>
+  </w:num>
+  <w:num w:numId="10">
+    <w:abstractNumId w:val="10"/>
+  </w:num>
+  <w:num w:numId="11">
     <w:abstractNumId w:val="22"/>
   </w:num>
-  <w:num w:numId="3">
-    <w:abstractNumId w:val="29"/>
+  <w:num w:numId="12">
+    <w:abstractNumId w:val="7"/>
   </w:num>
-  <w:num w:numId="4">
-    <w:abstractNumId w:val="37"/>
-  </w:num>
-  <w:num w:numId="5">
-    <w:abstractNumId w:val="10"/>
-  </w:num>
-  <w:num w:numId="6">
-    <w:abstractNumId w:val="35"/>
-  </w:num>
-  <w:num w:numId="7">
-    <w:abstractNumId w:val="42"/>
-  </w:num>
-  <w:num w:numId="8">
-    <w:abstractNumId w:val="15"/>
-  </w:num>
-  <w:num w:numId="9">
-    <w:abstractNumId w:val="25"/>
-  </w:num>
-  <w:num w:numId="10">
-    <w:abstractNumId w:val="8"/>
-  </w:num>
-  <w:num w:numId="11">
+  <w:num w:numId="13">
     <w:abstractNumId w:val="20"/>
   </w:num>
-  <w:num w:numId="12">
-    <w:abstractNumId w:val="5"/>
-  </w:num>
-  <w:num w:numId="13">
-    <w:abstractNumId w:val="18"/>
-  </w:num>
   <w:num w:numId="14">
-    <w:abstractNumId w:val="34"/>
+    <w:abstractNumId w:val="36"/>
   </w:num>
   <w:num w:numId="15">
     <w:abstractNumId w:val="2"/>
   </w:num>
   <w:num w:numId="16">
-    <w:abstractNumId w:val="19"/>
+    <w:abstractNumId w:val="21"/>
   </w:num>
   <w:num w:numId="17">
-    <w:abstractNumId w:val="39"/>
+    <w:abstractNumId w:val="41"/>
   </w:num>
   <w:num w:numId="18">
+    <w:abstractNumId w:val="32"/>
+  </w:num>
+  <w:num w:numId="19">
     <w:abstractNumId w:val="30"/>
   </w:num>
-  <w:num w:numId="19">
+  <w:num w:numId="20">
+    <w:abstractNumId w:val="9"/>
+  </w:num>
+  <w:num w:numId="21">
+    <w:abstractNumId w:val="34"/>
+  </w:num>
+  <w:num w:numId="22">
+    <w:abstractNumId w:val="42"/>
+  </w:num>
+  <w:num w:numId="23">
+    <w:abstractNumId w:val="26"/>
+  </w:num>
+  <w:num w:numId="24">
+    <w:abstractNumId w:val="29"/>
+  </w:num>
+  <w:num w:numId="25">
+    <w:abstractNumId w:val="8"/>
+  </w:num>
+  <w:num w:numId="26">
+    <w:abstractNumId w:val="43"/>
+  </w:num>
+  <w:num w:numId="27">
+    <w:abstractNumId w:val="23"/>
+  </w:num>
+  <w:num w:numId="28">
+    <w:abstractNumId w:val="6"/>
+  </w:num>
+  <w:num w:numId="29">
     <w:abstractNumId w:val="28"/>
   </w:num>
-  <w:num w:numId="20">
-    <w:abstractNumId w:val="7"/>
-  </w:num>
-  <w:num w:numId="21">
-    <w:abstractNumId w:val="32"/>
-  </w:num>
-  <w:num w:numId="22">
+  <w:num w:numId="30">
     <w:abstractNumId w:val="40"/>
   </w:num>
-  <w:num w:numId="23">
-    <w:abstractNumId w:val="24"/>
-  </w:num>
-  <w:num w:numId="24">
-    <w:abstractNumId w:val="27"/>
-  </w:num>
-  <w:num w:numId="25">
-    <w:abstractNumId w:val="6"/>
-  </w:num>
-  <w:num w:numId="26">
-    <w:abstractNumId w:val="41"/>
-  </w:num>
-  <w:num w:numId="27">
-    <w:abstractNumId w:val="21"/>
-  </w:num>
-  <w:num w:numId="28">
+  <w:num w:numId="31">
     <w:abstractNumId w:val="4"/>
   </w:num>
-  <w:num w:numId="29">
-    <w:abstractNumId w:val="26"/>
-  </w:num>
-  <w:num w:numId="30">
-    <w:abstractNumId w:val="38"/>
-  </w:num>
-  <w:num w:numId="31">
-    <w:abstractNumId w:val="3"/>
-  </w:num>
   <w:num w:numId="32">
-    <w:abstractNumId w:val="9"/>
+    <w:abstractNumId w:val="11"/>
   </w:num>
   <w:num w:numId="33">
-    <w:abstractNumId w:val="36"/>
+    <w:abstractNumId w:val="38"/>
   </w:num>
   <w:num w:numId="34">
     <w:abstractNumId w:val="0"/>
   </w:num>
   <w:num w:numId="35">
+    <w:abstractNumId w:val="15"/>
+  </w:num>
+  <w:num w:numId="36">
+    <w:abstractNumId w:val="33"/>
+  </w:num>
+  <w:num w:numId="37">
     <w:abstractNumId w:val="13"/>
   </w:num>
-  <w:num w:numId="36">
-    <w:abstractNumId w:val="31"/>
-  </w:num>
-  <w:num w:numId="37">
-    <w:abstractNumId w:val="11"/>
-  </w:num>
   <w:num w:numId="38">
-    <w:abstractNumId w:val="33"/>
+    <w:abstractNumId w:val="35"/>
   </w:num>
   <w:num w:numId="39">
+    <w:abstractNumId w:val="16"/>
+  </w:num>
+  <w:num w:numId="40">
+    <w:abstractNumId w:val="25"/>
+  </w:num>
+  <w:num w:numId="41">
+    <w:abstractNumId w:val="19"/>
+  </w:num>
+  <w:num w:numId="42">
+    <w:abstractNumId w:val="18"/>
+  </w:num>
+  <w:num w:numId="43">
     <w:abstractNumId w:val="14"/>
   </w:num>
-  <w:num w:numId="40">
-    <w:abstractNumId w:val="23"/>
+  <w:num w:numId="44">
+    <w:abstractNumId w:val="5"/>
   </w:num>
-  <w:num w:numId="41">
-    <w:abstractNumId w:val="17"/>
-  </w:num>
-  <w:num w:numId="42">
-    <w:abstractNumId w:val="16"/>
-  </w:num>
-  <w:num w:numId="43">
-    <w:abstractNumId w:val="12"/>
+  <w:num w:numId="45">
+    <w:abstractNumId w:val="3"/>
   </w:num>
 </w:numbering>
 </file>
@@ -20039,6 +20403,7 @@
   <w:style w:type="character" w:default="1" w:styleId="DefaultParagraphFont">
     <w:name w:val="Default Paragraph Font"/>
     <w:uiPriority w:val="1"/>
+    <w:semiHidden/>
     <w:unhideWhenUsed/>
   </w:style>
   <w:style w:type="table" w:default="1" w:styleId="TableNormal">
@@ -21215,31 +21580,31 @@
     </dgm:pt>
   </dgm:ptLst>
   <dgm:cxnLst>
-    <dgm:cxn modelId="{82EEEAD4-5156-4806-988B-0E55FFAA3CB3}" type="presOf" srcId="{214208B8-431D-481C-9A4C-228B7308ADA8}" destId="{C789FCC9-4717-4FFC-BA71-F98E7B1B3115}" srcOrd="0" destOrd="0" presId="urn:microsoft.com/office/officeart/2005/8/layout/process1"/>
-    <dgm:cxn modelId="{265AB1AA-408F-49B1-A0E2-59410AEB9DD8}" type="presOf" srcId="{5AAB36AD-884F-4169-9EAA-81A3D87ABCFA}" destId="{AB8F05C3-3669-4AF7-9C79-08939721A716}" srcOrd="0" destOrd="0" presId="urn:microsoft.com/office/officeart/2005/8/layout/process1"/>
-    <dgm:cxn modelId="{193AD6E9-5A86-40F5-B275-F008A43ADAA0}" type="presOf" srcId="{BF8C77AF-CFF1-4B53-B009-D4E001D240D6}" destId="{D0DFB2B8-5022-4762-AA62-9B0CF1B32B60}" srcOrd="0" destOrd="0" presId="urn:microsoft.com/office/officeart/2005/8/layout/process1"/>
+    <dgm:cxn modelId="{8724E9CF-C75B-440A-BB7D-D0EE72D250B5}" type="presOf" srcId="{214208B8-431D-481C-9A4C-228B7308ADA8}" destId="{5D4876CA-733D-4DFD-8E79-4A3DBC7C7C6B}" srcOrd="1" destOrd="0" presId="urn:microsoft.com/office/officeart/2005/8/layout/process1"/>
+    <dgm:cxn modelId="{4531DBA1-0CA9-4791-BEBB-1A99021CE942}" type="presOf" srcId="{9C4D6193-4800-45DB-9EB9-DA2277B5D91B}" destId="{374ED80F-5E6F-4A85-B95B-4BA99538042E}" srcOrd="0" destOrd="0" presId="urn:microsoft.com/office/officeart/2005/8/layout/process1"/>
+    <dgm:cxn modelId="{5D298EBD-1D0C-4754-ADB0-411EA8A348D5}" type="presOf" srcId="{BF8C77AF-CFF1-4B53-B009-D4E001D240D6}" destId="{D0DFB2B8-5022-4762-AA62-9B0CF1B32B60}" srcOrd="0" destOrd="0" presId="urn:microsoft.com/office/officeart/2005/8/layout/process1"/>
+    <dgm:cxn modelId="{994DB301-2A0E-4300-98BB-F2D48D48A5E2}" type="presOf" srcId="{214208B8-431D-481C-9A4C-228B7308ADA8}" destId="{C789FCC9-4717-4FFC-BA71-F98E7B1B3115}" srcOrd="0" destOrd="0" presId="urn:microsoft.com/office/officeart/2005/8/layout/process1"/>
+    <dgm:cxn modelId="{67EC4526-8088-4500-A96F-B0DB6D1EC455}" type="presOf" srcId="{9EE1A18E-AD2D-415E-8996-B35207C41ED0}" destId="{B9FC173B-3430-402C-9BFA-D498C62BCC2D}" srcOrd="0" destOrd="0" presId="urn:microsoft.com/office/officeart/2005/8/layout/process1"/>
     <dgm:cxn modelId="{80AB986A-FDF3-41B1-9092-584CE3EB969B}" srcId="{9EE1A18E-AD2D-415E-8996-B35207C41ED0}" destId="{BF8C77AF-CFF1-4B53-B009-D4E001D240D6}" srcOrd="3" destOrd="0" parTransId="{FBE35E27-7BCE-41B3-88D2-29BD34AAC180}" sibTransId="{DC8EEA03-196C-4689-B6BD-D5BC213D37CC}"/>
-    <dgm:cxn modelId="{89CD1A32-2C07-4F56-9A6D-80DB3EA6AB38}" type="presOf" srcId="{7201A391-9828-4B1D-A3C1-894234D041DB}" destId="{05A02C9E-6432-4B6A-91B3-E0BA65A6B1AE}" srcOrd="0" destOrd="0" presId="urn:microsoft.com/office/officeart/2005/8/layout/process1"/>
-    <dgm:cxn modelId="{DF81F8A0-9132-4A5F-8DA0-26B1419D6464}" type="presOf" srcId="{7201A391-9828-4B1D-A3C1-894234D041DB}" destId="{FDD593C1-9D9B-40ED-8C6D-5142CB0F0E3E}" srcOrd="1" destOrd="0" presId="urn:microsoft.com/office/officeart/2005/8/layout/process1"/>
-    <dgm:cxn modelId="{09C107F8-06C5-44D7-8208-88A7932B36B0}" type="presOf" srcId="{EF5675B6-38BA-4455-BA87-E62399D49989}" destId="{DEB61738-BCA0-4546-95CF-970A62665FC2}" srcOrd="0" destOrd="0" presId="urn:microsoft.com/office/officeart/2005/8/layout/process1"/>
+    <dgm:cxn modelId="{2A14E000-4633-4658-B625-1F0BF1AB589C}" type="presOf" srcId="{BF4790F6-D1AA-430E-85BA-C07F91D009F2}" destId="{485EB252-98AF-4CC0-A401-D9A154AAFC53}" srcOrd="0" destOrd="0" presId="urn:microsoft.com/office/officeart/2005/8/layout/process1"/>
+    <dgm:cxn modelId="{23891291-39B6-4209-81CD-B743F823A7AB}" type="presOf" srcId="{7201A391-9828-4B1D-A3C1-894234D041DB}" destId="{FDD593C1-9D9B-40ED-8C6D-5142CB0F0E3E}" srcOrd="1" destOrd="0" presId="urn:microsoft.com/office/officeart/2005/8/layout/process1"/>
     <dgm:cxn modelId="{4D1B4854-AE2E-470B-9115-BD099FD5799A}" srcId="{9EE1A18E-AD2D-415E-8996-B35207C41ED0}" destId="{BF4790F6-D1AA-430E-85BA-C07F91D009F2}" srcOrd="1" destOrd="0" parTransId="{974B1A63-8714-4E97-A93F-006B83F9DBF3}" sibTransId="{214208B8-431D-481C-9A4C-228B7308ADA8}"/>
     <dgm:cxn modelId="{B151CA70-0406-48D6-8013-3F7D288766AD}" srcId="{9EE1A18E-AD2D-415E-8996-B35207C41ED0}" destId="{5AAB36AD-884F-4169-9EAA-81A3D87ABCFA}" srcOrd="0" destOrd="0" parTransId="{4796A0B2-FD04-4D0D-B4E3-6A8EB9A6D74D}" sibTransId="{9C4D6193-4800-45DB-9EB9-DA2277B5D91B}"/>
-    <dgm:cxn modelId="{9378CC15-E49F-4DB8-BF7A-AF7A0AEAE166}" type="presOf" srcId="{214208B8-431D-481C-9A4C-228B7308ADA8}" destId="{5D4876CA-733D-4DFD-8E79-4A3DBC7C7C6B}" srcOrd="1" destOrd="0" presId="urn:microsoft.com/office/officeart/2005/8/layout/process1"/>
     <dgm:cxn modelId="{39F27088-F2FF-4B1E-85B8-75E4A5853051}" srcId="{9EE1A18E-AD2D-415E-8996-B35207C41ED0}" destId="{EF5675B6-38BA-4455-BA87-E62399D49989}" srcOrd="2" destOrd="0" parTransId="{B9F702AD-11CA-445A-BE84-AFE50ED28D23}" sibTransId="{7201A391-9828-4B1D-A3C1-894234D041DB}"/>
-    <dgm:cxn modelId="{81C7E6AF-DEA8-45C9-9B62-5B9BE3A6BAA4}" type="presOf" srcId="{BF4790F6-D1AA-430E-85BA-C07F91D009F2}" destId="{485EB252-98AF-4CC0-A401-D9A154AAFC53}" srcOrd="0" destOrd="0" presId="urn:microsoft.com/office/officeart/2005/8/layout/process1"/>
-    <dgm:cxn modelId="{6BAEC981-B871-4702-924C-BDDD93FE6B60}" type="presOf" srcId="{9C4D6193-4800-45DB-9EB9-DA2277B5D91B}" destId="{374ED80F-5E6F-4A85-B95B-4BA99538042E}" srcOrd="0" destOrd="0" presId="urn:microsoft.com/office/officeart/2005/8/layout/process1"/>
-    <dgm:cxn modelId="{BEF3E612-F6AF-410D-85FB-5B8EAF5C29BD}" type="presOf" srcId="{9C4D6193-4800-45DB-9EB9-DA2277B5D91B}" destId="{B8DA0D4A-E19E-4233-86B3-A96400569C53}" srcOrd="1" destOrd="0" presId="urn:microsoft.com/office/officeart/2005/8/layout/process1"/>
-    <dgm:cxn modelId="{F9AEBFAC-3422-4096-93B3-5A22D0A61084}" type="presOf" srcId="{9EE1A18E-AD2D-415E-8996-B35207C41ED0}" destId="{B9FC173B-3430-402C-9BFA-D498C62BCC2D}" srcOrd="0" destOrd="0" presId="urn:microsoft.com/office/officeart/2005/8/layout/process1"/>
-    <dgm:cxn modelId="{5D1B0ABF-BEF2-4C89-9773-B7DE6E979934}" type="presParOf" srcId="{B9FC173B-3430-402C-9BFA-D498C62BCC2D}" destId="{AB8F05C3-3669-4AF7-9C79-08939721A716}" srcOrd="0" destOrd="0" presId="urn:microsoft.com/office/officeart/2005/8/layout/process1"/>
-    <dgm:cxn modelId="{09080539-8E06-4B1C-B49C-0FF5D7AD1279}" type="presParOf" srcId="{B9FC173B-3430-402C-9BFA-D498C62BCC2D}" destId="{374ED80F-5E6F-4A85-B95B-4BA99538042E}" srcOrd="1" destOrd="0" presId="urn:microsoft.com/office/officeart/2005/8/layout/process1"/>
-    <dgm:cxn modelId="{C56963E4-FAEC-4CA2-BBDC-D1E22EB64944}" type="presParOf" srcId="{374ED80F-5E6F-4A85-B95B-4BA99538042E}" destId="{B8DA0D4A-E19E-4233-86B3-A96400569C53}" srcOrd="0" destOrd="0" presId="urn:microsoft.com/office/officeart/2005/8/layout/process1"/>
-    <dgm:cxn modelId="{97C548C7-DA7A-46FB-A1C4-68BFB0C18E9D}" type="presParOf" srcId="{B9FC173B-3430-402C-9BFA-D498C62BCC2D}" destId="{485EB252-98AF-4CC0-A401-D9A154AAFC53}" srcOrd="2" destOrd="0" presId="urn:microsoft.com/office/officeart/2005/8/layout/process1"/>
-    <dgm:cxn modelId="{4E876046-B001-4CE5-B60D-02307C94439A}" type="presParOf" srcId="{B9FC173B-3430-402C-9BFA-D498C62BCC2D}" destId="{C789FCC9-4717-4FFC-BA71-F98E7B1B3115}" srcOrd="3" destOrd="0" presId="urn:microsoft.com/office/officeart/2005/8/layout/process1"/>
-    <dgm:cxn modelId="{1EBB013D-D73D-4DF7-87BA-173F2011C567}" type="presParOf" srcId="{C789FCC9-4717-4FFC-BA71-F98E7B1B3115}" destId="{5D4876CA-733D-4DFD-8E79-4A3DBC7C7C6B}" srcOrd="0" destOrd="0" presId="urn:microsoft.com/office/officeart/2005/8/layout/process1"/>
-    <dgm:cxn modelId="{DD93EE89-C3B2-4B3E-A26B-8BDE0142F3DB}" type="presParOf" srcId="{B9FC173B-3430-402C-9BFA-D498C62BCC2D}" destId="{DEB61738-BCA0-4546-95CF-970A62665FC2}" srcOrd="4" destOrd="0" presId="urn:microsoft.com/office/officeart/2005/8/layout/process1"/>
-    <dgm:cxn modelId="{E3005F43-28A8-4718-A6C9-F884810E8EA8}" type="presParOf" srcId="{B9FC173B-3430-402C-9BFA-D498C62BCC2D}" destId="{05A02C9E-6432-4B6A-91B3-E0BA65A6B1AE}" srcOrd="5" destOrd="0" presId="urn:microsoft.com/office/officeart/2005/8/layout/process1"/>
-    <dgm:cxn modelId="{39D1EE66-CBBE-4F0A-B4BD-51132B96E2C5}" type="presParOf" srcId="{05A02C9E-6432-4B6A-91B3-E0BA65A6B1AE}" destId="{FDD593C1-9D9B-40ED-8C6D-5142CB0F0E3E}" srcOrd="0" destOrd="0" presId="urn:microsoft.com/office/officeart/2005/8/layout/process1"/>
-    <dgm:cxn modelId="{C9E3B088-FEA3-4E94-9B05-672F0740E764}" type="presParOf" srcId="{B9FC173B-3430-402C-9BFA-D498C62BCC2D}" destId="{D0DFB2B8-5022-4762-AA62-9B0CF1B32B60}" srcOrd="6" destOrd="0" presId="urn:microsoft.com/office/officeart/2005/8/layout/process1"/>
+    <dgm:cxn modelId="{9251EDEE-8670-4042-BC63-A36283383101}" type="presOf" srcId="{EF5675B6-38BA-4455-BA87-E62399D49989}" destId="{DEB61738-BCA0-4546-95CF-970A62665FC2}" srcOrd="0" destOrd="0" presId="urn:microsoft.com/office/officeart/2005/8/layout/process1"/>
+    <dgm:cxn modelId="{C785D4E9-16B4-4CDF-863C-2390C7F5681F}" type="presOf" srcId="{7201A391-9828-4B1D-A3C1-894234D041DB}" destId="{05A02C9E-6432-4B6A-91B3-E0BA65A6B1AE}" srcOrd="0" destOrd="0" presId="urn:microsoft.com/office/officeart/2005/8/layout/process1"/>
+    <dgm:cxn modelId="{3EF9BCAE-D83D-4640-81E4-972E2F03CE89}" type="presOf" srcId="{5AAB36AD-884F-4169-9EAA-81A3D87ABCFA}" destId="{AB8F05C3-3669-4AF7-9C79-08939721A716}" srcOrd="0" destOrd="0" presId="urn:microsoft.com/office/officeart/2005/8/layout/process1"/>
+    <dgm:cxn modelId="{3A9CD507-D232-484A-8D0B-055A516B2069}" type="presOf" srcId="{9C4D6193-4800-45DB-9EB9-DA2277B5D91B}" destId="{B8DA0D4A-E19E-4233-86B3-A96400569C53}" srcOrd="1" destOrd="0" presId="urn:microsoft.com/office/officeart/2005/8/layout/process1"/>
+    <dgm:cxn modelId="{473A781D-DA03-4DDB-8BC2-02922B466958}" type="presParOf" srcId="{B9FC173B-3430-402C-9BFA-D498C62BCC2D}" destId="{AB8F05C3-3669-4AF7-9C79-08939721A716}" srcOrd="0" destOrd="0" presId="urn:microsoft.com/office/officeart/2005/8/layout/process1"/>
+    <dgm:cxn modelId="{1DEE74A7-56EC-4B81-869F-FA13C7B5D58F}" type="presParOf" srcId="{B9FC173B-3430-402C-9BFA-D498C62BCC2D}" destId="{374ED80F-5E6F-4A85-B95B-4BA99538042E}" srcOrd="1" destOrd="0" presId="urn:microsoft.com/office/officeart/2005/8/layout/process1"/>
+    <dgm:cxn modelId="{8C2DAA72-A8F5-44CE-B4B4-75AC5D7FBDD1}" type="presParOf" srcId="{374ED80F-5E6F-4A85-B95B-4BA99538042E}" destId="{B8DA0D4A-E19E-4233-86B3-A96400569C53}" srcOrd="0" destOrd="0" presId="urn:microsoft.com/office/officeart/2005/8/layout/process1"/>
+    <dgm:cxn modelId="{E00774C2-1B62-418B-8251-2DD2E1A99479}" type="presParOf" srcId="{B9FC173B-3430-402C-9BFA-D498C62BCC2D}" destId="{485EB252-98AF-4CC0-A401-D9A154AAFC53}" srcOrd="2" destOrd="0" presId="urn:microsoft.com/office/officeart/2005/8/layout/process1"/>
+    <dgm:cxn modelId="{682E7E25-C799-47F8-960A-5A7BF9EB0CD8}" type="presParOf" srcId="{B9FC173B-3430-402C-9BFA-D498C62BCC2D}" destId="{C789FCC9-4717-4FFC-BA71-F98E7B1B3115}" srcOrd="3" destOrd="0" presId="urn:microsoft.com/office/officeart/2005/8/layout/process1"/>
+    <dgm:cxn modelId="{33F19C7D-877D-4085-9F5C-4277208DAE72}" type="presParOf" srcId="{C789FCC9-4717-4FFC-BA71-F98E7B1B3115}" destId="{5D4876CA-733D-4DFD-8E79-4A3DBC7C7C6B}" srcOrd="0" destOrd="0" presId="urn:microsoft.com/office/officeart/2005/8/layout/process1"/>
+    <dgm:cxn modelId="{FF6A1227-9B66-4A45-81C0-C9EA5E438EF6}" type="presParOf" srcId="{B9FC173B-3430-402C-9BFA-D498C62BCC2D}" destId="{DEB61738-BCA0-4546-95CF-970A62665FC2}" srcOrd="4" destOrd="0" presId="urn:microsoft.com/office/officeart/2005/8/layout/process1"/>
+    <dgm:cxn modelId="{6C9A39CE-8B93-404D-98C1-2A0A7526E071}" type="presParOf" srcId="{B9FC173B-3430-402C-9BFA-D498C62BCC2D}" destId="{05A02C9E-6432-4B6A-91B3-E0BA65A6B1AE}" srcOrd="5" destOrd="0" presId="urn:microsoft.com/office/officeart/2005/8/layout/process1"/>
+    <dgm:cxn modelId="{B992F9E2-1880-4B09-BDE1-E0A3CC40E5F3}" type="presParOf" srcId="{05A02C9E-6432-4B6A-91B3-E0BA65A6B1AE}" destId="{FDD593C1-9D9B-40ED-8C6D-5142CB0F0E3E}" srcOrd="0" destOrd="0" presId="urn:microsoft.com/office/officeart/2005/8/layout/process1"/>
+    <dgm:cxn modelId="{C4841568-851E-447F-9942-1541F67DFE3B}" type="presParOf" srcId="{B9FC173B-3430-402C-9BFA-D498C62BCC2D}" destId="{D0DFB2B8-5022-4762-AA62-9B0CF1B32B60}" srcOrd="6" destOrd="0" presId="urn:microsoft.com/office/officeart/2005/8/layout/process1"/>
   </dgm:cxnLst>
   <dgm:bg/>
   <dgm:whole/>

</xml_diff>